<commit_message>
PRD: sources, RBAC matrix, IPO table, flowchart, metric basis, PP 35/2024
Co-Authored-By: Claude Opus 5.5 <noreply@anthropic.com>
Claude-Session: https://claude.ai/code/session_01MyaJcnNN6cea99ff9yeVti
</commit_message>
<xml_diff>
--- a/prd/EDTS APM 2027 - Nadia Rahma Prasanti - Universitas Indonesia.docx
+++ b/prd/EDTS APM 2027 - Nadia Rahma Prasanti - Universitas Indonesia.docx
@@ -464,6 +464,21 @@
           <w:color w:val="000000"/>
           <w:sz w:val="22"/>
         </w:rPr>
+        <w:t>Why the Gerobak package has no royalty: Gerobak partners are required to buy raw materials (coffee, milk, syrup, cups) from Kopi Koma, so the franchisor earns from the supply margin instead of a percentage of sales. This keeps the entry package simple and affordable for first-time business owners, and avoids the cost of auditing revenue reports from many small carts. The Cafe package has a 5% royalty because its revenue is larger and it uses the brand more intensively (full store, menu, and interior standards).</w:t>
+      </w:r>
+    </w:p>
+    <w:p>
+      <w:pPr>
+        <w:pStyle w:val="ListBullet"/>
+        <w:jc w:val="both"/>
+      </w:pPr>
+      <w:r>
+        <w:rPr>
+          <w:rFonts w:ascii="Arial" w:hAnsi="Arial" w:cs="Arial" w:eastAsia="Arial"/>
+          <w:b w:val="0"/>
+          <w:color w:val="000000"/>
+          <w:sz w:val="22"/>
+        </w:rPr>
         <w:t>The partnership team consists of 1 Manager, 4 Sales (2 senior, 2 junior, each covering a region), and 2 Reviewers who run the eligibility assessment. A Super Admin manages the system.</w:t>
       </w:r>
     </w:p>
@@ -522,7 +537,7 @@
           <w:color w:val="000000"/>
           <w:sz w:val="22"/>
         </w:rPr>
-        <w:t>Franchising is the main expansion channel for Indonesian F&amp;B brands. According to Ministry of Trade data on registered franchisors (STPW) as of February 2025, F&amp;B accounts for 47.77% of registered franchisors (157 domestic and 154 foreign). Chained coffee shops grew from around 1,000 outlets in 2016 to more than 2,950 outlets in August 2019 (TOFFIN and MIX MarComm research, cited by the Ministry of Industry). The argument here is not that the coffee market is booming, but that brands in this category grow mainly by opening outlets through franchise partners. This makes the partnership process a core business process, not an administrative side task.</w:t>
+        <w:t>Franchising is the main expansion channel for Indonesian F&amp;B brands. According to the Ministry of Trade, as of February 2025 there were 311 franchisors with a Franchise Registration Certificate (STPW), 157 domestic and 154 foreign, and the culinary (F&amp;B) sector accounted for 47.77% of them [1][2]. Note that this is a share of registered franchisors, not of outlets or revenue. In the coffee category, research by TOFFIN and MIX MarComm (SWA Media Group) found that chain coffee shops in major Indonesian cities grew from around 1,000 outlets in 2016 to more than 2,950 outlets in August 2019 [3][4]. The argument here is not that the coffee market is booming, but that brands in this category grow mainly by opening outlets through franchise partners. This makes the partnership process a core business process, not an administrative side task.</w:t>
       </w:r>
     </w:p>
     <w:p>
@@ -680,7 +695,7 @@
                 <w:color w:val="000000"/>
                 <w:sz w:val="22"/>
               </w:rPr>
-              <w:t>Leads come from many channels (exhibitions, referrals, Instagram, website, walk-ins) and are tracked in WhatsApp chats and personal spreadsheets.</w:t>
+              <w:t>Leads are scattered and not centralized. They come from many channels (exhibitions, referrals, Instagram, website, walk-ins) and end up in each sales' WhatsApp chats, personal notes, and separate spreadsheets. There is no single list of all candidates, their owner, and their status.</w:t>
             </w:r>
           </w:p>
         </w:tc>
@@ -722,7 +737,7 @@
                 <w:color w:val="000000"/>
                 <w:sz w:val="22"/>
               </w:rPr>
-              <w:t>Leads are followed up late or forgotten. Two sales may contact the same person.</w:t>
+              <w:t>Leads are followed up late or forgotten, two sales may contact the same candidate, and lead data is lost when a sales leaves the company.</w:t>
             </w:r>
           </w:p>
         </w:tc>
@@ -1238,7 +1253,7 @@
                 <w:color w:val="000000"/>
                 <w:sz w:val="22"/>
               </w:rPr>
-              <w:t>Legal risk under the franchise regulation (PP No. 42/2007) and the Personal Data Protection Law (UU PDP No. 27/2022).</w:t>
+              <w:t>Legal risk under the franchise regulation (PP No. 35/2024) [5] and the Personal Data Protection Law (UU PDP No. 27/2022) [6].</w:t>
             </w:r>
           </w:p>
         </w:tc>
@@ -1263,6 +1278,20 @@
         <w:t>3. Goals and Success Metrics</w:t>
       </w:r>
     </w:p>
+    <w:p>
+      <w:pPr>
+        <w:jc w:val="both"/>
+      </w:pPr>
+      <w:r>
+        <w:rPr>
+          <w:rFonts w:ascii="Arial" w:hAnsi="Arial" w:cs="Arial" w:eastAsia="Arial"/>
+          <w:b w:val="0"/>
+          <w:color w:val="000000"/>
+          <w:sz w:val="22"/>
+        </w:rPr>
+        <w:t>The metrics below are proposed targets for the first year. Some are derived from the process design and the business target, and the rest are initial assumptions that should be validated with the client during the pilot and adjusted once real baseline data exists.</w:t>
+      </w:r>
+    </w:p>
     <w:tbl>
       <w:tblPr>
         <w:tblStyle w:val="TableGrid"/>
@@ -1270,14 +1299,15 @@
         <w:tblLook w:firstColumn="1" w:firstRow="1" w:lastColumn="0" w:lastRow="0" w:noHBand="0" w:noVBand="1" w:val="04A0"/>
       </w:tblPr>
       <w:tblGrid>
-        <w:gridCol w:w="3249"/>
-        <w:gridCol w:w="3249"/>
-        <w:gridCol w:w="3249"/>
+        <w:gridCol w:w="2436"/>
+        <w:gridCol w:w="2436"/>
+        <w:gridCol w:w="2436"/>
+        <w:gridCol w:w="2436"/>
       </w:tblGrid>
       <w:tr>
         <w:tc>
           <w:tcPr>
-            <w:tcW w:type="dxa" w:w="3249"/>
+            <w:tcW w:type="dxa" w:w="2436"/>
             <w:shd w:val="clear" w:color="auto" w:fill="E7E2DA"/>
           </w:tcPr>
           <w:p>
@@ -1299,7 +1329,7 @@
         </w:tc>
         <w:tc>
           <w:tcPr>
-            <w:tcW w:type="dxa" w:w="3249"/>
+            <w:tcW w:type="dxa" w:w="2436"/>
             <w:shd w:val="clear" w:color="auto" w:fill="E7E2DA"/>
           </w:tcPr>
           <w:p>
@@ -1321,7 +1351,7 @@
         </w:tc>
         <w:tc>
           <w:tcPr>
-            <w:tcW w:type="dxa" w:w="3249"/>
+            <w:tcW w:type="dxa" w:w="2436"/>
             <w:shd w:val="clear" w:color="auto" w:fill="E7E2DA"/>
           </w:tcPr>
           <w:p>
@@ -1338,6 +1368,28 @@
                 <w:sz w:val="22"/>
               </w:rPr>
               <w:t>Proposed target</w:t>
+            </w:r>
+          </w:p>
+        </w:tc>
+        <w:tc>
+          <w:tcPr>
+            <w:tcW w:type="dxa" w:w="2436"/>
+            <w:shd w:val="clear" w:color="auto" w:fill="E7E2DA"/>
+          </w:tcPr>
+          <w:p>
+            <w:pPr>
+              <w:spacing w:after="0"/>
+              <w:jc w:val="left"/>
+            </w:pPr>
+            <w:r/>
+            <w:r>
+              <w:rPr>
+                <w:rFonts w:ascii="Arial" w:hAnsi="Arial" w:cs="Arial" w:eastAsia="Arial"/>
+                <w:b/>
+                <w:color w:val="000000"/>
+                <w:sz w:val="22"/>
+              </w:rPr>
+              <w:t>Basis</w:t>
             </w:r>
           </w:p>
         </w:tc>
@@ -1345,7 +1397,7 @@
       <w:tr>
         <w:tc>
           <w:tcPr>
-            <w:tcW w:type="dxa" w:w="3249"/>
+            <w:tcW w:type="dxa" w:w="2436"/>
           </w:tcPr>
           <w:p>
             <w:pPr>
@@ -1366,7 +1418,7 @@
         </w:tc>
         <w:tc>
           <w:tcPr>
-            <w:tcW w:type="dxa" w:w="3249"/>
+            <w:tcW w:type="dxa" w:w="2436"/>
           </w:tcPr>
           <w:p>
             <w:pPr>
@@ -1387,7 +1439,7 @@
         </w:tc>
         <w:tc>
           <w:tcPr>
-            <w:tcW w:type="dxa" w:w="3249"/>
+            <w:tcW w:type="dxa" w:w="2436"/>
           </w:tcPr>
           <w:p>
             <w:pPr>
@@ -1403,6 +1455,27 @@
                 <w:sz w:val="22"/>
               </w:rPr>
               <w:t>100%</w:t>
+            </w:r>
+          </w:p>
+        </w:tc>
+        <w:tc>
+          <w:tcPr>
+            <w:tcW w:type="dxa" w:w="2436"/>
+          </w:tcPr>
+          <w:p>
+            <w:pPr>
+              <w:spacing w:after="0"/>
+              <w:jc w:val="left"/>
+            </w:pPr>
+            <w:r/>
+            <w:r>
+              <w:rPr>
+                <w:rFonts w:ascii="Arial" w:hAnsi="Arial" w:cs="Arial" w:eastAsia="Arial"/>
+                <w:b w:val="0"/>
+                <w:color w:val="000000"/>
+                <w:sz w:val="22"/>
+              </w:rPr>
+              <w:t>Derived from the 1-day deadline of the New lead stage</w:t>
             </w:r>
           </w:p>
         </w:tc>
@@ -1410,7 +1483,7 @@
       <w:tr>
         <w:tc>
           <w:tcPr>
-            <w:tcW w:type="dxa" w:w="3249"/>
+            <w:tcW w:type="dxa" w:w="2436"/>
           </w:tcPr>
           <w:p>
             <w:pPr>
@@ -1431,7 +1504,7 @@
         </w:tc>
         <w:tc>
           <w:tcPr>
-            <w:tcW w:type="dxa" w:w="3249"/>
+            <w:tcW w:type="dxa" w:w="2436"/>
           </w:tcPr>
           <w:p>
             <w:pPr>
@@ -1452,7 +1525,7 @@
         </w:tc>
         <w:tc>
           <w:tcPr>
-            <w:tcW w:type="dxa" w:w="3249"/>
+            <w:tcW w:type="dxa" w:w="2436"/>
           </w:tcPr>
           <w:p>
             <w:pPr>
@@ -1467,7 +1540,28 @@
                 <w:color w:val="000000"/>
                 <w:sz w:val="22"/>
               </w:rPr>
-              <w:t>26 days or less (sum of stage deadlines)</w:t>
+              <w:t>26 days or less</w:t>
+            </w:r>
+          </w:p>
+        </w:tc>
+        <w:tc>
+          <w:tcPr>
+            <w:tcW w:type="dxa" w:w="2436"/>
+          </w:tcPr>
+          <w:p>
+            <w:pPr>
+              <w:spacing w:after="0"/>
+              <w:jc w:val="left"/>
+            </w:pPr>
+            <w:r/>
+            <w:r>
+              <w:rPr>
+                <w:rFonts w:ascii="Arial" w:hAnsi="Arial" w:cs="Arial" w:eastAsia="Arial"/>
+                <w:b w:val="0"/>
+                <w:color w:val="000000"/>
+                <w:sz w:val="22"/>
+              </w:rPr>
+              <w:t>Derived: sum of all stage deadlines (1 + 4 + 5 + 4 + 3 + 7 + 2)</w:t>
             </w:r>
           </w:p>
         </w:tc>
@@ -1475,7 +1569,7 @@
       <w:tr>
         <w:tc>
           <w:tcPr>
-            <w:tcW w:type="dxa" w:w="3249"/>
+            <w:tcW w:type="dxa" w:w="2436"/>
           </w:tcPr>
           <w:p>
             <w:pPr>
@@ -1496,7 +1590,7 @@
         </w:tc>
         <w:tc>
           <w:tcPr>
-            <w:tcW w:type="dxa" w:w="3249"/>
+            <w:tcW w:type="dxa" w:w="2436"/>
           </w:tcPr>
           <w:p>
             <w:pPr>
@@ -1517,7 +1611,7 @@
         </w:tc>
         <w:tc>
           <w:tcPr>
-            <w:tcW w:type="dxa" w:w="3249"/>
+            <w:tcW w:type="dxa" w:w="2436"/>
           </w:tcPr>
           <w:p>
             <w:pPr>
@@ -1533,6 +1627,27 @@
                 <w:sz w:val="22"/>
               </w:rPr>
               <w:t>85% or more</w:t>
+            </w:r>
+          </w:p>
+        </w:tc>
+        <w:tc>
+          <w:tcPr>
+            <w:tcW w:type="dxa" w:w="2436"/>
+          </w:tcPr>
+          <w:p>
+            <w:pPr>
+              <w:spacing w:after="0"/>
+              <w:jc w:val="left"/>
+            </w:pPr>
+            <w:r/>
+            <w:r>
+              <w:rPr>
+                <w:rFonts w:ascii="Arial" w:hAnsi="Arial" w:cs="Arial" w:eastAsia="Arial"/>
+                <w:b w:val="0"/>
+                <w:color w:val="000000"/>
+                <w:sz w:val="22"/>
+              </w:rPr>
+              <w:t>Assumption: a starting target that leaves room for exceptions such as candidates who are hard to reach</w:t>
             </w:r>
           </w:p>
         </w:tc>
@@ -1540,7 +1655,7 @@
       <w:tr>
         <w:tc>
           <w:tcPr>
-            <w:tcW w:type="dxa" w:w="3249"/>
+            <w:tcW w:type="dxa" w:w="2436"/>
           </w:tcPr>
           <w:p>
             <w:pPr>
@@ -1561,7 +1676,7 @@
         </w:tc>
         <w:tc>
           <w:tcPr>
-            <w:tcW w:type="dxa" w:w="3249"/>
+            <w:tcW w:type="dxa" w:w="2436"/>
           </w:tcPr>
           <w:p>
             <w:pPr>
@@ -1582,7 +1697,7 @@
         </w:tc>
         <w:tc>
           <w:tcPr>
-            <w:tcW w:type="dxa" w:w="3249"/>
+            <w:tcW w:type="dxa" w:w="2436"/>
           </w:tcPr>
           <w:p>
             <w:pPr>
@@ -1597,7 +1712,28 @@
                 <w:color w:val="000000"/>
                 <w:sz w:val="22"/>
               </w:rPr>
-              <w:t>12% or more (default funnel assumption)</w:t>
+              <w:t>12% or more</w:t>
+            </w:r>
+          </w:p>
+        </w:tc>
+        <w:tc>
+          <w:tcPr>
+            <w:tcW w:type="dxa" w:w="2436"/>
+          </w:tcPr>
+          <w:p>
+            <w:pPr>
+              <w:spacing w:after="0"/>
+              <w:jc w:val="left"/>
+            </w:pPr>
+            <w:r/>
+            <w:r>
+              <w:rPr>
+                <w:rFonts w:ascii="Arial" w:hAnsi="Arial" w:cs="Arial" w:eastAsia="Arial"/>
+                <w:b w:val="0"/>
+                <w:color w:val="000000"/>
+                <w:sz w:val="22"/>
+              </w:rPr>
+              <w:t>Derived from the default funnel conversion rates in Section 6.3</w:t>
             </w:r>
           </w:p>
         </w:tc>
@@ -1605,7 +1741,7 @@
       <w:tr>
         <w:tc>
           <w:tcPr>
-            <w:tcW w:type="dxa" w:w="3249"/>
+            <w:tcW w:type="dxa" w:w="2436"/>
           </w:tcPr>
           <w:p>
             <w:pPr>
@@ -1626,7 +1762,7 @@
         </w:tc>
         <w:tc>
           <w:tcPr>
-            <w:tcW w:type="dxa" w:w="3249"/>
+            <w:tcW w:type="dxa" w:w="2436"/>
           </w:tcPr>
           <w:p>
             <w:pPr>
@@ -1647,7 +1783,7 @@
         </w:tc>
         <w:tc>
           <w:tcPr>
-            <w:tcW w:type="dxa" w:w="3249"/>
+            <w:tcW w:type="dxa" w:w="2436"/>
           </w:tcPr>
           <w:p>
             <w:pPr>
@@ -1663,6 +1799,27 @@
                 <w:sz w:val="22"/>
               </w:rPr>
               <w:t>120 (72 Gerobak, 48 Cafe)</w:t>
+            </w:r>
+          </w:p>
+        </w:tc>
+        <w:tc>
+          <w:tcPr>
+            <w:tcW w:type="dxa" w:w="2436"/>
+          </w:tcPr>
+          <w:p>
+            <w:pPr>
+              <w:spacing w:after="0"/>
+              <w:jc w:val="left"/>
+            </w:pPr>
+            <w:r/>
+            <w:r>
+              <w:rPr>
+                <w:rFonts w:ascii="Arial" w:hAnsi="Arial" w:cs="Arial" w:eastAsia="Arial"/>
+                <w:b w:val="0"/>
+                <w:color w:val="000000"/>
+                <w:sz w:val="22"/>
+              </w:rPr>
+              <w:t>Business target (stretch), from the per-sales targets in Section 6.3</w:t>
             </w:r>
           </w:p>
         </w:tc>
@@ -1670,7 +1827,7 @@
       <w:tr>
         <w:tc>
           <w:tcPr>
-            <w:tcW w:type="dxa" w:w="3249"/>
+            <w:tcW w:type="dxa" w:w="2436"/>
           </w:tcPr>
           <w:p>
             <w:pPr>
@@ -1691,7 +1848,7 @@
         </w:tc>
         <w:tc>
           <w:tcPr>
-            <w:tcW w:type="dxa" w:w="3249"/>
+            <w:tcW w:type="dxa" w:w="2436"/>
           </w:tcPr>
           <w:p>
             <w:pPr>
@@ -1712,7 +1869,7 @@
         </w:tc>
         <w:tc>
           <w:tcPr>
-            <w:tcW w:type="dxa" w:w="3249"/>
+            <w:tcW w:type="dxa" w:w="2436"/>
           </w:tcPr>
           <w:p>
             <w:pPr>
@@ -1727,7 +1884,28 @@
                 <w:color w:val="000000"/>
                 <w:sz w:val="22"/>
               </w:rPr>
-              <w:t>around Rp 24.8 billion (around Rp 2.07 billion per month)</w:t>
+              <w:t>around Rp 24.8 billion</w:t>
+            </w:r>
+          </w:p>
+        </w:tc>
+        <w:tc>
+          <w:tcPr>
+            <w:tcW w:type="dxa" w:w="2436"/>
+          </w:tcPr>
+          <w:p>
+            <w:pPr>
+              <w:spacing w:after="0"/>
+              <w:jc w:val="left"/>
+            </w:pPr>
+            <w:r/>
+            <w:r>
+              <w:rPr>
+                <w:rFonts w:ascii="Arial" w:hAnsi="Arial" w:cs="Arial" w:eastAsia="Arial"/>
+                <w:b w:val="0"/>
+                <w:color w:val="000000"/>
+                <w:sz w:val="22"/>
+              </w:rPr>
+              <w:t>Derived: 6 Gerobak x Rp 45 million + 4 Cafe x Rp 450 million = Rp 2.07 billion per month</w:t>
             </w:r>
           </w:p>
         </w:tc>
@@ -1735,7 +1913,7 @@
       <w:tr>
         <w:tc>
           <w:tcPr>
-            <w:tcW w:type="dxa" w:w="3249"/>
+            <w:tcW w:type="dxa" w:w="2436"/>
           </w:tcPr>
           <w:p>
             <w:pPr>
@@ -1756,7 +1934,7 @@
         </w:tc>
         <w:tc>
           <w:tcPr>
-            <w:tcW w:type="dxa" w:w="3249"/>
+            <w:tcW w:type="dxa" w:w="2436"/>
           </w:tcPr>
           <w:p>
             <w:pPr>
@@ -1777,7 +1955,7 @@
         </w:tc>
         <w:tc>
           <w:tcPr>
-            <w:tcW w:type="dxa" w:w="3249"/>
+            <w:tcW w:type="dxa" w:w="2436"/>
           </w:tcPr>
           <w:p>
             <w:pPr>
@@ -1793,6 +1971,27 @@
                 <w:sz w:val="22"/>
               </w:rPr>
               <w:t>70% or more</w:t>
+            </w:r>
+          </w:p>
+        </w:tc>
+        <w:tc>
+          <w:tcPr>
+            <w:tcW w:type="dxa" w:w="2436"/>
+          </w:tcPr>
+          <w:p>
+            <w:pPr>
+              <w:spacing w:after="0"/>
+              <w:jc w:val="left"/>
+            </w:pPr>
+            <w:r/>
+            <w:r>
+              <w:rPr>
+                <w:rFonts w:ascii="Arial" w:hAnsi="Arial" w:cs="Arial" w:eastAsia="Arial"/>
+                <w:b w:val="0"/>
+                <w:color w:val="000000"/>
+                <w:sz w:val="22"/>
+              </w:rPr>
+              <w:t>Assumption: the target for portal adoption, measured during the pilot</w:t>
             </w:r>
           </w:p>
         </w:tc>
@@ -2354,6 +2553,1624 @@
       <w:pPr>
         <w:spacing w:after="0"/>
       </w:pPr>
+    </w:p>
+    <w:p>
+      <w:pPr>
+        <w:pStyle w:val="Heading2"/>
+      </w:pPr>
+      <w:r>
+        <w:rPr>
+          <w:rFonts w:ascii="Arial" w:hAnsi="Arial" w:cs="Arial" w:eastAsia="Arial"/>
+          <w:b/>
+          <w:color w:val="000000"/>
+          <w:sz w:val="23"/>
+        </w:rPr>
+        <w:t>4.1 Role-Based Access Control (RBAC)</w:t>
+      </w:r>
+    </w:p>
+    <w:p>
+      <w:pPr>
+        <w:jc w:val="both"/>
+      </w:pPr>
+      <w:r>
+        <w:rPr>
+          <w:rFonts w:ascii="Arial" w:hAnsi="Arial" w:cs="Arial" w:eastAsia="Arial"/>
+          <w:b w:val="0"/>
+          <w:color w:val="000000"/>
+          <w:sz w:val="22"/>
+        </w:rPr>
+        <w:t>Access is granted by role, not per person. Each user has exactly one role, and the system checks the role on every action. Data access follows the principle of least privilege: each role only sees and changes what it needs for its job.</w:t>
+      </w:r>
+    </w:p>
+    <w:tbl>
+      <w:tblPr>
+        <w:tblStyle w:val="TableGrid"/>
+        <w:tblW w:type="auto" w:w="0"/>
+        <w:tblLook w:firstColumn="1" w:firstRow="1" w:lastColumn="0" w:lastRow="0" w:noHBand="0" w:noVBand="1" w:val="04A0"/>
+      </w:tblPr>
+      <w:tblGrid>
+        <w:gridCol w:w="1624"/>
+        <w:gridCol w:w="1624"/>
+        <w:gridCol w:w="1624"/>
+        <w:gridCol w:w="1624"/>
+        <w:gridCol w:w="1624"/>
+        <w:gridCol w:w="1624"/>
+      </w:tblGrid>
+      <w:tr>
+        <w:tc>
+          <w:tcPr>
+            <w:tcW w:type="dxa" w:w="1624"/>
+            <w:shd w:val="clear" w:color="auto" w:fill="E7E2DA"/>
+          </w:tcPr>
+          <w:p>
+            <w:pPr>
+              <w:spacing w:after="0"/>
+              <w:jc w:val="left"/>
+            </w:pPr>
+            <w:r/>
+            <w:r>
+              <w:rPr>
+                <w:rFonts w:ascii="Arial" w:hAnsi="Arial" w:cs="Arial" w:eastAsia="Arial"/>
+                <w:b/>
+                <w:color w:val="000000"/>
+                <w:sz w:val="22"/>
+              </w:rPr>
+              <w:t>Permission</w:t>
+            </w:r>
+          </w:p>
+        </w:tc>
+        <w:tc>
+          <w:tcPr>
+            <w:tcW w:type="dxa" w:w="1624"/>
+            <w:shd w:val="clear" w:color="auto" w:fill="E7E2DA"/>
+          </w:tcPr>
+          <w:p>
+            <w:pPr>
+              <w:spacing w:after="0"/>
+              <w:jc w:val="left"/>
+            </w:pPr>
+            <w:r/>
+            <w:r>
+              <w:rPr>
+                <w:rFonts w:ascii="Arial" w:hAnsi="Arial" w:cs="Arial" w:eastAsia="Arial"/>
+                <w:b/>
+                <w:color w:val="000000"/>
+                <w:sz w:val="22"/>
+              </w:rPr>
+              <w:t>Super Admin</w:t>
+            </w:r>
+          </w:p>
+        </w:tc>
+        <w:tc>
+          <w:tcPr>
+            <w:tcW w:type="dxa" w:w="1624"/>
+            <w:shd w:val="clear" w:color="auto" w:fill="E7E2DA"/>
+          </w:tcPr>
+          <w:p>
+            <w:pPr>
+              <w:spacing w:after="0"/>
+              <w:jc w:val="left"/>
+            </w:pPr>
+            <w:r/>
+            <w:r>
+              <w:rPr>
+                <w:rFonts w:ascii="Arial" w:hAnsi="Arial" w:cs="Arial" w:eastAsia="Arial"/>
+                <w:b/>
+                <w:color w:val="000000"/>
+                <w:sz w:val="22"/>
+              </w:rPr>
+              <w:t>Manager</w:t>
+            </w:r>
+          </w:p>
+        </w:tc>
+        <w:tc>
+          <w:tcPr>
+            <w:tcW w:type="dxa" w:w="1624"/>
+            <w:shd w:val="clear" w:color="auto" w:fill="E7E2DA"/>
+          </w:tcPr>
+          <w:p>
+            <w:pPr>
+              <w:spacing w:after="0"/>
+              <w:jc w:val="left"/>
+            </w:pPr>
+            <w:r/>
+            <w:r>
+              <w:rPr>
+                <w:rFonts w:ascii="Arial" w:hAnsi="Arial" w:cs="Arial" w:eastAsia="Arial"/>
+                <w:b/>
+                <w:color w:val="000000"/>
+                <w:sz w:val="22"/>
+              </w:rPr>
+              <w:t>Sales</w:t>
+            </w:r>
+          </w:p>
+        </w:tc>
+        <w:tc>
+          <w:tcPr>
+            <w:tcW w:type="dxa" w:w="1624"/>
+            <w:shd w:val="clear" w:color="auto" w:fill="E7E2DA"/>
+          </w:tcPr>
+          <w:p>
+            <w:pPr>
+              <w:spacing w:after="0"/>
+              <w:jc w:val="left"/>
+            </w:pPr>
+            <w:r/>
+            <w:r>
+              <w:rPr>
+                <w:rFonts w:ascii="Arial" w:hAnsi="Arial" w:cs="Arial" w:eastAsia="Arial"/>
+                <w:b/>
+                <w:color w:val="000000"/>
+                <w:sz w:val="22"/>
+              </w:rPr>
+              <w:t>Reviewer</w:t>
+            </w:r>
+          </w:p>
+        </w:tc>
+        <w:tc>
+          <w:tcPr>
+            <w:tcW w:type="dxa" w:w="1624"/>
+            <w:shd w:val="clear" w:color="auto" w:fill="E7E2DA"/>
+          </w:tcPr>
+          <w:p>
+            <w:pPr>
+              <w:spacing w:after="0"/>
+              <w:jc w:val="left"/>
+            </w:pPr>
+            <w:r/>
+            <w:r>
+              <w:rPr>
+                <w:rFonts w:ascii="Arial" w:hAnsi="Arial" w:cs="Arial" w:eastAsia="Arial"/>
+                <w:b/>
+                <w:color w:val="000000"/>
+                <w:sz w:val="22"/>
+              </w:rPr>
+              <w:t>Candidate</w:t>
+            </w:r>
+          </w:p>
+        </w:tc>
+      </w:tr>
+      <w:tr>
+        <w:tc>
+          <w:tcPr>
+            <w:tcW w:type="dxa" w:w="1624"/>
+          </w:tcPr>
+          <w:p>
+            <w:pPr>
+              <w:spacing w:after="0"/>
+              <w:jc w:val="left"/>
+            </w:pPr>
+            <w:r/>
+            <w:r>
+              <w:rPr>
+                <w:rFonts w:ascii="Arial" w:hAnsi="Arial" w:cs="Arial" w:eastAsia="Arial"/>
+                <w:b w:val="0"/>
+                <w:color w:val="000000"/>
+                <w:sz w:val="22"/>
+              </w:rPr>
+              <w:t>View pipeline</w:t>
+            </w:r>
+          </w:p>
+        </w:tc>
+        <w:tc>
+          <w:tcPr>
+            <w:tcW w:type="dxa" w:w="1624"/>
+          </w:tcPr>
+          <w:p>
+            <w:pPr>
+              <w:spacing w:after="0"/>
+              <w:jc w:val="left"/>
+            </w:pPr>
+            <w:r/>
+            <w:r>
+              <w:rPr>
+                <w:rFonts w:ascii="Arial" w:hAnsi="Arial" w:cs="Arial" w:eastAsia="Arial"/>
+                <w:b w:val="0"/>
+                <w:color w:val="000000"/>
+                <w:sz w:val="22"/>
+              </w:rPr>
+              <w:t>All</w:t>
+            </w:r>
+          </w:p>
+        </w:tc>
+        <w:tc>
+          <w:tcPr>
+            <w:tcW w:type="dxa" w:w="1624"/>
+          </w:tcPr>
+          <w:p>
+            <w:pPr>
+              <w:spacing w:after="0"/>
+              <w:jc w:val="left"/>
+            </w:pPr>
+            <w:r/>
+            <w:r>
+              <w:rPr>
+                <w:rFonts w:ascii="Arial" w:hAnsi="Arial" w:cs="Arial" w:eastAsia="Arial"/>
+                <w:b w:val="0"/>
+                <w:color w:val="000000"/>
+                <w:sz w:val="22"/>
+              </w:rPr>
+              <w:t>All</w:t>
+            </w:r>
+          </w:p>
+        </w:tc>
+        <w:tc>
+          <w:tcPr>
+            <w:tcW w:type="dxa" w:w="1624"/>
+          </w:tcPr>
+          <w:p>
+            <w:pPr>
+              <w:spacing w:after="0"/>
+              <w:jc w:val="left"/>
+            </w:pPr>
+            <w:r/>
+            <w:r>
+              <w:rPr>
+                <w:rFonts w:ascii="Arial" w:hAnsi="Arial" w:cs="Arial" w:eastAsia="Arial"/>
+                <w:b w:val="0"/>
+                <w:color w:val="000000"/>
+                <w:sz w:val="22"/>
+              </w:rPr>
+              <w:t>Own leads only</w:t>
+            </w:r>
+          </w:p>
+        </w:tc>
+        <w:tc>
+          <w:tcPr>
+            <w:tcW w:type="dxa" w:w="1624"/>
+          </w:tcPr>
+          <w:p>
+            <w:pPr>
+              <w:spacing w:after="0"/>
+              <w:jc w:val="left"/>
+            </w:pPr>
+            <w:r/>
+            <w:r>
+              <w:rPr>
+                <w:rFonts w:ascii="Arial" w:hAnsi="Arial" w:cs="Arial" w:eastAsia="Arial"/>
+                <w:b w:val="0"/>
+                <w:color w:val="000000"/>
+                <w:sz w:val="22"/>
+              </w:rPr>
+              <w:t>All</w:t>
+            </w:r>
+          </w:p>
+        </w:tc>
+        <w:tc>
+          <w:tcPr>
+            <w:tcW w:type="dxa" w:w="1624"/>
+          </w:tcPr>
+          <w:p>
+            <w:pPr>
+              <w:spacing w:after="0"/>
+              <w:jc w:val="left"/>
+            </w:pPr>
+            <w:r/>
+            <w:r>
+              <w:rPr>
+                <w:rFonts w:ascii="Arial" w:hAnsi="Arial" w:cs="Arial" w:eastAsia="Arial"/>
+                <w:b w:val="0"/>
+                <w:color w:val="000000"/>
+                <w:sz w:val="22"/>
+              </w:rPr>
+              <w:t>Own application only (application number + email or phone)</w:t>
+            </w:r>
+          </w:p>
+        </w:tc>
+      </w:tr>
+      <w:tr>
+        <w:tc>
+          <w:tcPr>
+            <w:tcW w:type="dxa" w:w="1624"/>
+          </w:tcPr>
+          <w:p>
+            <w:pPr>
+              <w:spacing w:after="0"/>
+              <w:jc w:val="left"/>
+            </w:pPr>
+            <w:r/>
+            <w:r>
+              <w:rPr>
+                <w:rFonts w:ascii="Arial" w:hAnsi="Arial" w:cs="Arial" w:eastAsia="Arial"/>
+                <w:b w:val="0"/>
+                <w:color w:val="000000"/>
+                <w:sz w:val="22"/>
+              </w:rPr>
+              <w:t>Add lead</w:t>
+            </w:r>
+          </w:p>
+        </w:tc>
+        <w:tc>
+          <w:tcPr>
+            <w:tcW w:type="dxa" w:w="1624"/>
+          </w:tcPr>
+          <w:p>
+            <w:pPr>
+              <w:spacing w:after="0"/>
+              <w:jc w:val="left"/>
+            </w:pPr>
+            <w:r/>
+            <w:r>
+              <w:rPr>
+                <w:rFonts w:ascii="Arial" w:hAnsi="Arial" w:cs="Arial" w:eastAsia="Arial"/>
+                <w:b w:val="0"/>
+                <w:color w:val="000000"/>
+                <w:sz w:val="22"/>
+              </w:rPr>
+              <w:t>Yes</w:t>
+            </w:r>
+          </w:p>
+        </w:tc>
+        <w:tc>
+          <w:tcPr>
+            <w:tcW w:type="dxa" w:w="1624"/>
+          </w:tcPr>
+          <w:p>
+            <w:pPr>
+              <w:spacing w:after="0"/>
+              <w:jc w:val="left"/>
+            </w:pPr>
+            <w:r/>
+            <w:r>
+              <w:rPr>
+                <w:rFonts w:ascii="Arial" w:hAnsi="Arial" w:cs="Arial" w:eastAsia="Arial"/>
+                <w:b w:val="0"/>
+                <w:color w:val="000000"/>
+                <w:sz w:val="22"/>
+              </w:rPr>
+              <w:t>No</w:t>
+            </w:r>
+          </w:p>
+        </w:tc>
+        <w:tc>
+          <w:tcPr>
+            <w:tcW w:type="dxa" w:w="1624"/>
+          </w:tcPr>
+          <w:p>
+            <w:pPr>
+              <w:spacing w:after="0"/>
+              <w:jc w:val="left"/>
+            </w:pPr>
+            <w:r/>
+            <w:r>
+              <w:rPr>
+                <w:rFonts w:ascii="Arial" w:hAnsi="Arial" w:cs="Arial" w:eastAsia="Arial"/>
+                <w:b w:val="0"/>
+                <w:color w:val="000000"/>
+                <w:sz w:val="22"/>
+              </w:rPr>
+              <w:t>Yes</w:t>
+            </w:r>
+          </w:p>
+        </w:tc>
+        <w:tc>
+          <w:tcPr>
+            <w:tcW w:type="dxa" w:w="1624"/>
+          </w:tcPr>
+          <w:p>
+            <w:pPr>
+              <w:spacing w:after="0"/>
+              <w:jc w:val="left"/>
+            </w:pPr>
+            <w:r/>
+            <w:r>
+              <w:rPr>
+                <w:rFonts w:ascii="Arial" w:hAnsi="Arial" w:cs="Arial" w:eastAsia="Arial"/>
+                <w:b w:val="0"/>
+                <w:color w:val="000000"/>
+                <w:sz w:val="22"/>
+              </w:rPr>
+              <w:t>No</w:t>
+            </w:r>
+          </w:p>
+        </w:tc>
+        <w:tc>
+          <w:tcPr>
+            <w:tcW w:type="dxa" w:w="1624"/>
+          </w:tcPr>
+          <w:p>
+            <w:pPr>
+              <w:spacing w:after="0"/>
+              <w:jc w:val="left"/>
+            </w:pPr>
+            <w:r/>
+            <w:r>
+              <w:rPr>
+                <w:rFonts w:ascii="Arial" w:hAnsi="Arial" w:cs="Arial" w:eastAsia="Arial"/>
+                <w:b w:val="0"/>
+                <w:color w:val="000000"/>
+                <w:sz w:val="22"/>
+              </w:rPr>
+              <w:t>Self-registration in portal</w:t>
+            </w:r>
+          </w:p>
+        </w:tc>
+      </w:tr>
+      <w:tr>
+        <w:tc>
+          <w:tcPr>
+            <w:tcW w:type="dxa" w:w="1624"/>
+          </w:tcPr>
+          <w:p>
+            <w:pPr>
+              <w:spacing w:after="0"/>
+              <w:jc w:val="left"/>
+            </w:pPr>
+            <w:r/>
+            <w:r>
+              <w:rPr>
+                <w:rFonts w:ascii="Arial" w:hAnsi="Arial" w:cs="Arial" w:eastAsia="Arial"/>
+                <w:b w:val="0"/>
+                <w:color w:val="000000"/>
+                <w:sz w:val="22"/>
+              </w:rPr>
+              <w:t>Assign sales to an unassigned lead</w:t>
+            </w:r>
+          </w:p>
+        </w:tc>
+        <w:tc>
+          <w:tcPr>
+            <w:tcW w:type="dxa" w:w="1624"/>
+          </w:tcPr>
+          <w:p>
+            <w:pPr>
+              <w:spacing w:after="0"/>
+              <w:jc w:val="left"/>
+            </w:pPr>
+            <w:r/>
+            <w:r>
+              <w:rPr>
+                <w:rFonts w:ascii="Arial" w:hAnsi="Arial" w:cs="Arial" w:eastAsia="Arial"/>
+                <w:b w:val="0"/>
+                <w:color w:val="000000"/>
+                <w:sz w:val="22"/>
+              </w:rPr>
+              <w:t>Yes</w:t>
+            </w:r>
+          </w:p>
+        </w:tc>
+        <w:tc>
+          <w:tcPr>
+            <w:tcW w:type="dxa" w:w="1624"/>
+          </w:tcPr>
+          <w:p>
+            <w:pPr>
+              <w:spacing w:after="0"/>
+              <w:jc w:val="left"/>
+            </w:pPr>
+            <w:r/>
+            <w:r>
+              <w:rPr>
+                <w:rFonts w:ascii="Arial" w:hAnsi="Arial" w:cs="Arial" w:eastAsia="Arial"/>
+                <w:b w:val="0"/>
+                <w:color w:val="000000"/>
+                <w:sz w:val="22"/>
+              </w:rPr>
+              <w:t>Yes</w:t>
+            </w:r>
+          </w:p>
+        </w:tc>
+        <w:tc>
+          <w:tcPr>
+            <w:tcW w:type="dxa" w:w="1624"/>
+          </w:tcPr>
+          <w:p>
+            <w:pPr>
+              <w:spacing w:after="0"/>
+              <w:jc w:val="left"/>
+            </w:pPr>
+            <w:r/>
+            <w:r>
+              <w:rPr>
+                <w:rFonts w:ascii="Arial" w:hAnsi="Arial" w:cs="Arial" w:eastAsia="Arial"/>
+                <w:b w:val="0"/>
+                <w:color w:val="000000"/>
+                <w:sz w:val="22"/>
+              </w:rPr>
+              <w:t>No</w:t>
+            </w:r>
+          </w:p>
+        </w:tc>
+        <w:tc>
+          <w:tcPr>
+            <w:tcW w:type="dxa" w:w="1624"/>
+          </w:tcPr>
+          <w:p>
+            <w:pPr>
+              <w:spacing w:after="0"/>
+              <w:jc w:val="left"/>
+            </w:pPr>
+            <w:r/>
+            <w:r>
+              <w:rPr>
+                <w:rFonts w:ascii="Arial" w:hAnsi="Arial" w:cs="Arial" w:eastAsia="Arial"/>
+                <w:b w:val="0"/>
+                <w:color w:val="000000"/>
+                <w:sz w:val="22"/>
+              </w:rPr>
+              <w:t>No</w:t>
+            </w:r>
+          </w:p>
+        </w:tc>
+        <w:tc>
+          <w:tcPr>
+            <w:tcW w:type="dxa" w:w="1624"/>
+          </w:tcPr>
+          <w:p>
+            <w:pPr>
+              <w:spacing w:after="0"/>
+              <w:jc w:val="left"/>
+            </w:pPr>
+            <w:r/>
+            <w:r>
+              <w:rPr>
+                <w:rFonts w:ascii="Arial" w:hAnsi="Arial" w:cs="Arial" w:eastAsia="Arial"/>
+                <w:b w:val="0"/>
+                <w:color w:val="000000"/>
+                <w:sz w:val="22"/>
+              </w:rPr>
+              <w:t>No</w:t>
+            </w:r>
+          </w:p>
+        </w:tc>
+      </w:tr>
+      <w:tr>
+        <w:tc>
+          <w:tcPr>
+            <w:tcW w:type="dxa" w:w="1624"/>
+          </w:tcPr>
+          <w:p>
+            <w:pPr>
+              <w:spacing w:after="0"/>
+              <w:jc w:val="left"/>
+            </w:pPr>
+            <w:r/>
+            <w:r>
+              <w:rPr>
+                <w:rFonts w:ascii="Arial" w:hAnsi="Arial" w:cs="Arial" w:eastAsia="Arial"/>
+                <w:b w:val="0"/>
+                <w:color w:val="000000"/>
+                <w:sz w:val="22"/>
+              </w:rPr>
+              <w:t>Presentation, location survey, quotation, negotiation</w:t>
+            </w:r>
+          </w:p>
+        </w:tc>
+        <w:tc>
+          <w:tcPr>
+            <w:tcW w:type="dxa" w:w="1624"/>
+          </w:tcPr>
+          <w:p>
+            <w:pPr>
+              <w:spacing w:after="0"/>
+              <w:jc w:val="left"/>
+            </w:pPr>
+            <w:r/>
+            <w:r>
+              <w:rPr>
+                <w:rFonts w:ascii="Arial" w:hAnsi="Arial" w:cs="Arial" w:eastAsia="Arial"/>
+                <w:b w:val="0"/>
+                <w:color w:val="000000"/>
+                <w:sz w:val="22"/>
+              </w:rPr>
+              <w:t>Yes</w:t>
+            </w:r>
+          </w:p>
+        </w:tc>
+        <w:tc>
+          <w:tcPr>
+            <w:tcW w:type="dxa" w:w="1624"/>
+          </w:tcPr>
+          <w:p>
+            <w:pPr>
+              <w:spacing w:after="0"/>
+              <w:jc w:val="left"/>
+            </w:pPr>
+            <w:r/>
+            <w:r>
+              <w:rPr>
+                <w:rFonts w:ascii="Arial" w:hAnsi="Arial" w:cs="Arial" w:eastAsia="Arial"/>
+                <w:b w:val="0"/>
+                <w:color w:val="000000"/>
+                <w:sz w:val="22"/>
+              </w:rPr>
+              <w:t>No</w:t>
+            </w:r>
+          </w:p>
+        </w:tc>
+        <w:tc>
+          <w:tcPr>
+            <w:tcW w:type="dxa" w:w="1624"/>
+          </w:tcPr>
+          <w:p>
+            <w:pPr>
+              <w:spacing w:after="0"/>
+              <w:jc w:val="left"/>
+            </w:pPr>
+            <w:r/>
+            <w:r>
+              <w:rPr>
+                <w:rFonts w:ascii="Arial" w:hAnsi="Arial" w:cs="Arial" w:eastAsia="Arial"/>
+                <w:b w:val="0"/>
+                <w:color w:val="000000"/>
+                <w:sz w:val="22"/>
+              </w:rPr>
+              <w:t>Own leads only</w:t>
+            </w:r>
+          </w:p>
+        </w:tc>
+        <w:tc>
+          <w:tcPr>
+            <w:tcW w:type="dxa" w:w="1624"/>
+          </w:tcPr>
+          <w:p>
+            <w:pPr>
+              <w:spacing w:after="0"/>
+              <w:jc w:val="left"/>
+            </w:pPr>
+            <w:r/>
+            <w:r>
+              <w:rPr>
+                <w:rFonts w:ascii="Arial" w:hAnsi="Arial" w:cs="Arial" w:eastAsia="Arial"/>
+                <w:b w:val="0"/>
+                <w:color w:val="000000"/>
+                <w:sz w:val="22"/>
+              </w:rPr>
+              <w:t>No</w:t>
+            </w:r>
+          </w:p>
+        </w:tc>
+        <w:tc>
+          <w:tcPr>
+            <w:tcW w:type="dxa" w:w="1624"/>
+          </w:tcPr>
+          <w:p>
+            <w:pPr>
+              <w:spacing w:after="0"/>
+              <w:jc w:val="left"/>
+            </w:pPr>
+            <w:r/>
+            <w:r>
+              <w:rPr>
+                <w:rFonts w:ascii="Arial" w:hAnsi="Arial" w:cs="Arial" w:eastAsia="Arial"/>
+                <w:b w:val="0"/>
+                <w:color w:val="000000"/>
+                <w:sz w:val="22"/>
+              </w:rPr>
+              <w:t>Respond to quotation</w:t>
+            </w:r>
+          </w:p>
+        </w:tc>
+      </w:tr>
+      <w:tr>
+        <w:tc>
+          <w:tcPr>
+            <w:tcW w:type="dxa" w:w="1624"/>
+          </w:tcPr>
+          <w:p>
+            <w:pPr>
+              <w:spacing w:after="0"/>
+              <w:jc w:val="left"/>
+            </w:pPr>
+            <w:r/>
+            <w:r>
+              <w:rPr>
+                <w:rFonts w:ascii="Arial" w:hAnsi="Arial" w:cs="Arial" w:eastAsia="Arial"/>
+                <w:b w:val="0"/>
+                <w:color w:val="000000"/>
+                <w:sz w:val="22"/>
+              </w:rPr>
+              <w:t>Eligibility assessment</w:t>
+            </w:r>
+          </w:p>
+        </w:tc>
+        <w:tc>
+          <w:tcPr>
+            <w:tcW w:type="dxa" w:w="1624"/>
+          </w:tcPr>
+          <w:p>
+            <w:pPr>
+              <w:spacing w:after="0"/>
+              <w:jc w:val="left"/>
+            </w:pPr>
+            <w:r/>
+            <w:r>
+              <w:rPr>
+                <w:rFonts w:ascii="Arial" w:hAnsi="Arial" w:cs="Arial" w:eastAsia="Arial"/>
+                <w:b w:val="0"/>
+                <w:color w:val="000000"/>
+                <w:sz w:val="22"/>
+              </w:rPr>
+              <w:t>Yes</w:t>
+            </w:r>
+          </w:p>
+        </w:tc>
+        <w:tc>
+          <w:tcPr>
+            <w:tcW w:type="dxa" w:w="1624"/>
+          </w:tcPr>
+          <w:p>
+            <w:pPr>
+              <w:spacing w:after="0"/>
+              <w:jc w:val="left"/>
+            </w:pPr>
+            <w:r/>
+            <w:r>
+              <w:rPr>
+                <w:rFonts w:ascii="Arial" w:hAnsi="Arial" w:cs="Arial" w:eastAsia="Arial"/>
+                <w:b w:val="0"/>
+                <w:color w:val="000000"/>
+                <w:sz w:val="22"/>
+              </w:rPr>
+              <w:t>No</w:t>
+            </w:r>
+          </w:p>
+        </w:tc>
+        <w:tc>
+          <w:tcPr>
+            <w:tcW w:type="dxa" w:w="1624"/>
+          </w:tcPr>
+          <w:p>
+            <w:pPr>
+              <w:spacing w:after="0"/>
+              <w:jc w:val="left"/>
+            </w:pPr>
+            <w:r/>
+            <w:r>
+              <w:rPr>
+                <w:rFonts w:ascii="Arial" w:hAnsi="Arial" w:cs="Arial" w:eastAsia="Arial"/>
+                <w:b w:val="0"/>
+                <w:color w:val="000000"/>
+                <w:sz w:val="22"/>
+              </w:rPr>
+              <w:t>No</w:t>
+            </w:r>
+          </w:p>
+        </w:tc>
+        <w:tc>
+          <w:tcPr>
+            <w:tcW w:type="dxa" w:w="1624"/>
+          </w:tcPr>
+          <w:p>
+            <w:pPr>
+              <w:spacing w:after="0"/>
+              <w:jc w:val="left"/>
+            </w:pPr>
+            <w:r/>
+            <w:r>
+              <w:rPr>
+                <w:rFonts w:ascii="Arial" w:hAnsi="Arial" w:cs="Arial" w:eastAsia="Arial"/>
+                <w:b w:val="0"/>
+                <w:color w:val="000000"/>
+                <w:sz w:val="22"/>
+              </w:rPr>
+              <w:t>Yes</w:t>
+            </w:r>
+          </w:p>
+        </w:tc>
+        <w:tc>
+          <w:tcPr>
+            <w:tcW w:type="dxa" w:w="1624"/>
+          </w:tcPr>
+          <w:p>
+            <w:pPr>
+              <w:spacing w:after="0"/>
+              <w:jc w:val="left"/>
+            </w:pPr>
+            <w:r/>
+            <w:r>
+              <w:rPr>
+                <w:rFonts w:ascii="Arial" w:hAnsi="Arial" w:cs="Arial" w:eastAsia="Arial"/>
+                <w:b w:val="0"/>
+                <w:color w:val="000000"/>
+                <w:sz w:val="22"/>
+              </w:rPr>
+              <w:t>No</w:t>
+            </w:r>
+          </w:p>
+        </w:tc>
+      </w:tr>
+      <w:tr>
+        <w:tc>
+          <w:tcPr>
+            <w:tcW w:type="dxa" w:w="1624"/>
+          </w:tcPr>
+          <w:p>
+            <w:pPr>
+              <w:spacing w:after="0"/>
+              <w:jc w:val="left"/>
+            </w:pPr>
+            <w:r/>
+            <w:r>
+              <w:rPr>
+                <w:rFonts w:ascii="Arial" w:hAnsi="Arial" w:cs="Arial" w:eastAsia="Arial"/>
+                <w:b w:val="0"/>
+                <w:color w:val="000000"/>
+                <w:sz w:val="22"/>
+              </w:rPr>
+              <w:t>Final approval (approve or reject)</w:t>
+            </w:r>
+          </w:p>
+        </w:tc>
+        <w:tc>
+          <w:tcPr>
+            <w:tcW w:type="dxa" w:w="1624"/>
+          </w:tcPr>
+          <w:p>
+            <w:pPr>
+              <w:spacing w:after="0"/>
+              <w:jc w:val="left"/>
+            </w:pPr>
+            <w:r/>
+            <w:r>
+              <w:rPr>
+                <w:rFonts w:ascii="Arial" w:hAnsi="Arial" w:cs="Arial" w:eastAsia="Arial"/>
+                <w:b w:val="0"/>
+                <w:color w:val="000000"/>
+                <w:sz w:val="22"/>
+              </w:rPr>
+              <w:t>Yes</w:t>
+            </w:r>
+          </w:p>
+        </w:tc>
+        <w:tc>
+          <w:tcPr>
+            <w:tcW w:type="dxa" w:w="1624"/>
+          </w:tcPr>
+          <w:p>
+            <w:pPr>
+              <w:spacing w:after="0"/>
+              <w:jc w:val="left"/>
+            </w:pPr>
+            <w:r/>
+            <w:r>
+              <w:rPr>
+                <w:rFonts w:ascii="Arial" w:hAnsi="Arial" w:cs="Arial" w:eastAsia="Arial"/>
+                <w:b w:val="0"/>
+                <w:color w:val="000000"/>
+                <w:sz w:val="22"/>
+              </w:rPr>
+              <w:t>Yes</w:t>
+            </w:r>
+          </w:p>
+        </w:tc>
+        <w:tc>
+          <w:tcPr>
+            <w:tcW w:type="dxa" w:w="1624"/>
+          </w:tcPr>
+          <w:p>
+            <w:pPr>
+              <w:spacing w:after="0"/>
+              <w:jc w:val="left"/>
+            </w:pPr>
+            <w:r/>
+            <w:r>
+              <w:rPr>
+                <w:rFonts w:ascii="Arial" w:hAnsi="Arial" w:cs="Arial" w:eastAsia="Arial"/>
+                <w:b w:val="0"/>
+                <w:color w:val="000000"/>
+                <w:sz w:val="22"/>
+              </w:rPr>
+              <w:t>No</w:t>
+            </w:r>
+          </w:p>
+        </w:tc>
+        <w:tc>
+          <w:tcPr>
+            <w:tcW w:type="dxa" w:w="1624"/>
+          </w:tcPr>
+          <w:p>
+            <w:pPr>
+              <w:spacing w:after="0"/>
+              <w:jc w:val="left"/>
+            </w:pPr>
+            <w:r/>
+            <w:r>
+              <w:rPr>
+                <w:rFonts w:ascii="Arial" w:hAnsi="Arial" w:cs="Arial" w:eastAsia="Arial"/>
+                <w:b w:val="0"/>
+                <w:color w:val="000000"/>
+                <w:sz w:val="22"/>
+              </w:rPr>
+              <w:t>No</w:t>
+            </w:r>
+          </w:p>
+        </w:tc>
+        <w:tc>
+          <w:tcPr>
+            <w:tcW w:type="dxa" w:w="1624"/>
+          </w:tcPr>
+          <w:p>
+            <w:pPr>
+              <w:spacing w:after="0"/>
+              <w:jc w:val="left"/>
+            </w:pPr>
+            <w:r/>
+            <w:r>
+              <w:rPr>
+                <w:rFonts w:ascii="Arial" w:hAnsi="Arial" w:cs="Arial" w:eastAsia="Arial"/>
+                <w:b w:val="0"/>
+                <w:color w:val="000000"/>
+                <w:sz w:val="22"/>
+              </w:rPr>
+              <w:t>No</w:t>
+            </w:r>
+          </w:p>
+        </w:tc>
+      </w:tr>
+      <w:tr>
+        <w:tc>
+          <w:tcPr>
+            <w:tcW w:type="dxa" w:w="1624"/>
+          </w:tcPr>
+          <w:p>
+            <w:pPr>
+              <w:spacing w:after="0"/>
+              <w:jc w:val="left"/>
+            </w:pPr>
+            <w:r/>
+            <w:r>
+              <w:rPr>
+                <w:rFonts w:ascii="Arial" w:hAnsi="Arial" w:cs="Arial" w:eastAsia="Arial"/>
+                <w:b w:val="0"/>
+                <w:color w:val="000000"/>
+                <w:sz w:val="22"/>
+              </w:rPr>
+              <w:t>View candidate documents (ID, tax number, bank statement)</w:t>
+            </w:r>
+          </w:p>
+        </w:tc>
+        <w:tc>
+          <w:tcPr>
+            <w:tcW w:type="dxa" w:w="1624"/>
+          </w:tcPr>
+          <w:p>
+            <w:pPr>
+              <w:spacing w:after="0"/>
+              <w:jc w:val="left"/>
+            </w:pPr>
+            <w:r/>
+            <w:r>
+              <w:rPr>
+                <w:rFonts w:ascii="Arial" w:hAnsi="Arial" w:cs="Arial" w:eastAsia="Arial"/>
+                <w:b w:val="0"/>
+                <w:color w:val="000000"/>
+                <w:sz w:val="22"/>
+              </w:rPr>
+              <w:t>Yes</w:t>
+            </w:r>
+          </w:p>
+        </w:tc>
+        <w:tc>
+          <w:tcPr>
+            <w:tcW w:type="dxa" w:w="1624"/>
+          </w:tcPr>
+          <w:p>
+            <w:pPr>
+              <w:spacing w:after="0"/>
+              <w:jc w:val="left"/>
+            </w:pPr>
+            <w:r/>
+            <w:r>
+              <w:rPr>
+                <w:rFonts w:ascii="Arial" w:hAnsi="Arial" w:cs="Arial" w:eastAsia="Arial"/>
+                <w:b w:val="0"/>
+                <w:color w:val="000000"/>
+                <w:sz w:val="22"/>
+              </w:rPr>
+              <w:t>Yes</w:t>
+            </w:r>
+          </w:p>
+        </w:tc>
+        <w:tc>
+          <w:tcPr>
+            <w:tcW w:type="dxa" w:w="1624"/>
+          </w:tcPr>
+          <w:p>
+            <w:pPr>
+              <w:spacing w:after="0"/>
+              <w:jc w:val="left"/>
+            </w:pPr>
+            <w:r/>
+            <w:r>
+              <w:rPr>
+                <w:rFonts w:ascii="Arial" w:hAnsi="Arial" w:cs="Arial" w:eastAsia="Arial"/>
+                <w:b w:val="0"/>
+                <w:color w:val="000000"/>
+                <w:sz w:val="22"/>
+              </w:rPr>
+              <w:t>Own leads only</w:t>
+            </w:r>
+          </w:p>
+        </w:tc>
+        <w:tc>
+          <w:tcPr>
+            <w:tcW w:type="dxa" w:w="1624"/>
+          </w:tcPr>
+          <w:p>
+            <w:pPr>
+              <w:spacing w:after="0"/>
+              <w:jc w:val="left"/>
+            </w:pPr>
+            <w:r/>
+            <w:r>
+              <w:rPr>
+                <w:rFonts w:ascii="Arial" w:hAnsi="Arial" w:cs="Arial" w:eastAsia="Arial"/>
+                <w:b w:val="0"/>
+                <w:color w:val="000000"/>
+                <w:sz w:val="22"/>
+              </w:rPr>
+              <w:t>Yes</w:t>
+            </w:r>
+          </w:p>
+        </w:tc>
+        <w:tc>
+          <w:tcPr>
+            <w:tcW w:type="dxa" w:w="1624"/>
+          </w:tcPr>
+          <w:p>
+            <w:pPr>
+              <w:spacing w:after="0"/>
+              <w:jc w:val="left"/>
+            </w:pPr>
+            <w:r/>
+            <w:r>
+              <w:rPr>
+                <w:rFonts w:ascii="Arial" w:hAnsi="Arial" w:cs="Arial" w:eastAsia="Arial"/>
+                <w:b w:val="0"/>
+                <w:color w:val="000000"/>
+                <w:sz w:val="22"/>
+              </w:rPr>
+              <w:t>Own documents</w:t>
+            </w:r>
+          </w:p>
+        </w:tc>
+      </w:tr>
+      <w:tr>
+        <w:tc>
+          <w:tcPr>
+            <w:tcW w:type="dxa" w:w="1624"/>
+          </w:tcPr>
+          <w:p>
+            <w:pPr>
+              <w:spacing w:after="0"/>
+              <w:jc w:val="left"/>
+            </w:pPr>
+            <w:r/>
+            <w:r>
+              <w:rPr>
+                <w:rFonts w:ascii="Arial" w:hAnsi="Arial" w:cs="Arial" w:eastAsia="Arial"/>
+                <w:b w:val="0"/>
+                <w:color w:val="000000"/>
+                <w:sz w:val="22"/>
+              </w:rPr>
+              <w:t>View overdue indicators</w:t>
+            </w:r>
+          </w:p>
+        </w:tc>
+        <w:tc>
+          <w:tcPr>
+            <w:tcW w:type="dxa" w:w="1624"/>
+          </w:tcPr>
+          <w:p>
+            <w:pPr>
+              <w:spacing w:after="0"/>
+              <w:jc w:val="left"/>
+            </w:pPr>
+            <w:r/>
+            <w:r>
+              <w:rPr>
+                <w:rFonts w:ascii="Arial" w:hAnsi="Arial" w:cs="Arial" w:eastAsia="Arial"/>
+                <w:b w:val="0"/>
+                <w:color w:val="000000"/>
+                <w:sz w:val="22"/>
+              </w:rPr>
+              <w:t>Yes</w:t>
+            </w:r>
+          </w:p>
+        </w:tc>
+        <w:tc>
+          <w:tcPr>
+            <w:tcW w:type="dxa" w:w="1624"/>
+          </w:tcPr>
+          <w:p>
+            <w:pPr>
+              <w:spacing w:after="0"/>
+              <w:jc w:val="left"/>
+            </w:pPr>
+            <w:r/>
+            <w:r>
+              <w:rPr>
+                <w:rFonts w:ascii="Arial" w:hAnsi="Arial" w:cs="Arial" w:eastAsia="Arial"/>
+                <w:b w:val="0"/>
+                <w:color w:val="000000"/>
+                <w:sz w:val="22"/>
+              </w:rPr>
+              <w:t>Yes</w:t>
+            </w:r>
+          </w:p>
+        </w:tc>
+        <w:tc>
+          <w:tcPr>
+            <w:tcW w:type="dxa" w:w="1624"/>
+          </w:tcPr>
+          <w:p>
+            <w:pPr>
+              <w:spacing w:after="0"/>
+              <w:jc w:val="left"/>
+            </w:pPr>
+            <w:r/>
+            <w:r>
+              <w:rPr>
+                <w:rFonts w:ascii="Arial" w:hAnsi="Arial" w:cs="Arial" w:eastAsia="Arial"/>
+                <w:b w:val="0"/>
+                <w:color w:val="000000"/>
+                <w:sz w:val="22"/>
+              </w:rPr>
+              <w:t>No</w:t>
+            </w:r>
+          </w:p>
+        </w:tc>
+        <w:tc>
+          <w:tcPr>
+            <w:tcW w:type="dxa" w:w="1624"/>
+          </w:tcPr>
+          <w:p>
+            <w:pPr>
+              <w:spacing w:after="0"/>
+              <w:jc w:val="left"/>
+            </w:pPr>
+            <w:r/>
+            <w:r>
+              <w:rPr>
+                <w:rFonts w:ascii="Arial" w:hAnsi="Arial" w:cs="Arial" w:eastAsia="Arial"/>
+                <w:b w:val="0"/>
+                <w:color w:val="000000"/>
+                <w:sz w:val="22"/>
+              </w:rPr>
+              <w:t>No</w:t>
+            </w:r>
+          </w:p>
+        </w:tc>
+        <w:tc>
+          <w:tcPr>
+            <w:tcW w:type="dxa" w:w="1624"/>
+          </w:tcPr>
+          <w:p>
+            <w:pPr>
+              <w:spacing w:after="0"/>
+              <w:jc w:val="left"/>
+            </w:pPr>
+            <w:r/>
+            <w:r>
+              <w:rPr>
+                <w:rFonts w:ascii="Arial" w:hAnsi="Arial" w:cs="Arial" w:eastAsia="Arial"/>
+                <w:b w:val="0"/>
+                <w:color w:val="000000"/>
+                <w:sz w:val="22"/>
+              </w:rPr>
+              <w:t>No</w:t>
+            </w:r>
+          </w:p>
+        </w:tc>
+      </w:tr>
+      <w:tr>
+        <w:tc>
+          <w:tcPr>
+            <w:tcW w:type="dxa" w:w="1624"/>
+          </w:tcPr>
+          <w:p>
+            <w:pPr>
+              <w:spacing w:after="0"/>
+              <w:jc w:val="left"/>
+            </w:pPr>
+            <w:r/>
+            <w:r>
+              <w:rPr>
+                <w:rFonts w:ascii="Arial" w:hAnsi="Arial" w:cs="Arial" w:eastAsia="Arial"/>
+                <w:b w:val="0"/>
+                <w:color w:val="000000"/>
+                <w:sz w:val="22"/>
+              </w:rPr>
+              <w:t>Target vs Achievement</w:t>
+            </w:r>
+          </w:p>
+        </w:tc>
+        <w:tc>
+          <w:tcPr>
+            <w:tcW w:type="dxa" w:w="1624"/>
+          </w:tcPr>
+          <w:p>
+            <w:pPr>
+              <w:spacing w:after="0"/>
+              <w:jc w:val="left"/>
+            </w:pPr>
+            <w:r/>
+            <w:r>
+              <w:rPr>
+                <w:rFonts w:ascii="Arial" w:hAnsi="Arial" w:cs="Arial" w:eastAsia="Arial"/>
+                <w:b w:val="0"/>
+                <w:color w:val="000000"/>
+                <w:sz w:val="22"/>
+              </w:rPr>
+              <w:t>Team</w:t>
+            </w:r>
+          </w:p>
+        </w:tc>
+        <w:tc>
+          <w:tcPr>
+            <w:tcW w:type="dxa" w:w="1624"/>
+          </w:tcPr>
+          <w:p>
+            <w:pPr>
+              <w:spacing w:after="0"/>
+              <w:jc w:val="left"/>
+            </w:pPr>
+            <w:r/>
+            <w:r>
+              <w:rPr>
+                <w:rFonts w:ascii="Arial" w:hAnsi="Arial" w:cs="Arial" w:eastAsia="Arial"/>
+                <w:b w:val="0"/>
+                <w:color w:val="000000"/>
+                <w:sz w:val="22"/>
+              </w:rPr>
+              <w:t>Team</w:t>
+            </w:r>
+          </w:p>
+        </w:tc>
+        <w:tc>
+          <w:tcPr>
+            <w:tcW w:type="dxa" w:w="1624"/>
+          </w:tcPr>
+          <w:p>
+            <w:pPr>
+              <w:spacing w:after="0"/>
+              <w:jc w:val="left"/>
+            </w:pPr>
+            <w:r/>
+            <w:r>
+              <w:rPr>
+                <w:rFonts w:ascii="Arial" w:hAnsi="Arial" w:cs="Arial" w:eastAsia="Arial"/>
+                <w:b w:val="0"/>
+                <w:color w:val="000000"/>
+                <w:sz w:val="22"/>
+              </w:rPr>
+              <w:t>Own</w:t>
+            </w:r>
+          </w:p>
+        </w:tc>
+        <w:tc>
+          <w:tcPr>
+            <w:tcW w:type="dxa" w:w="1624"/>
+          </w:tcPr>
+          <w:p>
+            <w:pPr>
+              <w:spacing w:after="0"/>
+              <w:jc w:val="left"/>
+            </w:pPr>
+            <w:r/>
+            <w:r>
+              <w:rPr>
+                <w:rFonts w:ascii="Arial" w:hAnsi="Arial" w:cs="Arial" w:eastAsia="Arial"/>
+                <w:b w:val="0"/>
+                <w:color w:val="000000"/>
+                <w:sz w:val="22"/>
+              </w:rPr>
+              <w:t>No</w:t>
+            </w:r>
+          </w:p>
+        </w:tc>
+        <w:tc>
+          <w:tcPr>
+            <w:tcW w:type="dxa" w:w="1624"/>
+          </w:tcPr>
+          <w:p>
+            <w:pPr>
+              <w:spacing w:after="0"/>
+              <w:jc w:val="left"/>
+            </w:pPr>
+            <w:r/>
+            <w:r>
+              <w:rPr>
+                <w:rFonts w:ascii="Arial" w:hAnsi="Arial" w:cs="Arial" w:eastAsia="Arial"/>
+                <w:b w:val="0"/>
+                <w:color w:val="000000"/>
+                <w:sz w:val="22"/>
+              </w:rPr>
+              <w:t>No</w:t>
+            </w:r>
+          </w:p>
+        </w:tc>
+      </w:tr>
+      <w:tr>
+        <w:tc>
+          <w:tcPr>
+            <w:tcW w:type="dxa" w:w="1624"/>
+          </w:tcPr>
+          <w:p>
+            <w:pPr>
+              <w:spacing w:after="0"/>
+              <w:jc w:val="left"/>
+            </w:pPr>
+            <w:r/>
+            <w:r>
+              <w:rPr>
+                <w:rFonts w:ascii="Arial" w:hAnsi="Arial" w:cs="Arial" w:eastAsia="Arial"/>
+                <w:b w:val="0"/>
+                <w:color w:val="000000"/>
+                <w:sz w:val="22"/>
+              </w:rPr>
+              <w:t>Sales Performance</w:t>
+            </w:r>
+          </w:p>
+        </w:tc>
+        <w:tc>
+          <w:tcPr>
+            <w:tcW w:type="dxa" w:w="1624"/>
+          </w:tcPr>
+          <w:p>
+            <w:pPr>
+              <w:spacing w:after="0"/>
+              <w:jc w:val="left"/>
+            </w:pPr>
+            <w:r/>
+            <w:r>
+              <w:rPr>
+                <w:rFonts w:ascii="Arial" w:hAnsi="Arial" w:cs="Arial" w:eastAsia="Arial"/>
+                <w:b w:val="0"/>
+                <w:color w:val="000000"/>
+                <w:sz w:val="22"/>
+              </w:rPr>
+              <w:t>Yes</w:t>
+            </w:r>
+          </w:p>
+        </w:tc>
+        <w:tc>
+          <w:tcPr>
+            <w:tcW w:type="dxa" w:w="1624"/>
+          </w:tcPr>
+          <w:p>
+            <w:pPr>
+              <w:spacing w:after="0"/>
+              <w:jc w:val="left"/>
+            </w:pPr>
+            <w:r/>
+            <w:r>
+              <w:rPr>
+                <w:rFonts w:ascii="Arial" w:hAnsi="Arial" w:cs="Arial" w:eastAsia="Arial"/>
+                <w:b w:val="0"/>
+                <w:color w:val="000000"/>
+                <w:sz w:val="22"/>
+              </w:rPr>
+              <w:t>Yes</w:t>
+            </w:r>
+          </w:p>
+        </w:tc>
+        <w:tc>
+          <w:tcPr>
+            <w:tcW w:type="dxa" w:w="1624"/>
+          </w:tcPr>
+          <w:p>
+            <w:pPr>
+              <w:spacing w:after="0"/>
+              <w:jc w:val="left"/>
+            </w:pPr>
+            <w:r/>
+            <w:r>
+              <w:rPr>
+                <w:rFonts w:ascii="Arial" w:hAnsi="Arial" w:cs="Arial" w:eastAsia="Arial"/>
+                <w:b w:val="0"/>
+                <w:color w:val="000000"/>
+                <w:sz w:val="22"/>
+              </w:rPr>
+              <w:t>No</w:t>
+            </w:r>
+          </w:p>
+        </w:tc>
+        <w:tc>
+          <w:tcPr>
+            <w:tcW w:type="dxa" w:w="1624"/>
+          </w:tcPr>
+          <w:p>
+            <w:pPr>
+              <w:spacing w:after="0"/>
+              <w:jc w:val="left"/>
+            </w:pPr>
+            <w:r/>
+            <w:r>
+              <w:rPr>
+                <w:rFonts w:ascii="Arial" w:hAnsi="Arial" w:cs="Arial" w:eastAsia="Arial"/>
+                <w:b w:val="0"/>
+                <w:color w:val="000000"/>
+                <w:sz w:val="22"/>
+              </w:rPr>
+              <w:t>No</w:t>
+            </w:r>
+          </w:p>
+        </w:tc>
+        <w:tc>
+          <w:tcPr>
+            <w:tcW w:type="dxa" w:w="1624"/>
+          </w:tcPr>
+          <w:p>
+            <w:pPr>
+              <w:spacing w:after="0"/>
+              <w:jc w:val="left"/>
+            </w:pPr>
+            <w:r/>
+            <w:r>
+              <w:rPr>
+                <w:rFonts w:ascii="Arial" w:hAnsi="Arial" w:cs="Arial" w:eastAsia="Arial"/>
+                <w:b w:val="0"/>
+                <w:color w:val="000000"/>
+                <w:sz w:val="22"/>
+              </w:rPr>
+              <w:t>No</w:t>
+            </w:r>
+          </w:p>
+        </w:tc>
+      </w:tr>
+      <w:tr>
+        <w:tc>
+          <w:tcPr>
+            <w:tcW w:type="dxa" w:w="1624"/>
+          </w:tcPr>
+          <w:p>
+            <w:pPr>
+              <w:spacing w:after="0"/>
+              <w:jc w:val="left"/>
+            </w:pPr>
+            <w:r/>
+            <w:r>
+              <w:rPr>
+                <w:rFonts w:ascii="Arial" w:hAnsi="Arial" w:cs="Arial" w:eastAsia="Arial"/>
+                <w:b w:val="0"/>
+                <w:color w:val="000000"/>
+                <w:sz w:val="22"/>
+              </w:rPr>
+              <w:t>View audit trail of an application</w:t>
+            </w:r>
+          </w:p>
+        </w:tc>
+        <w:tc>
+          <w:tcPr>
+            <w:tcW w:type="dxa" w:w="1624"/>
+          </w:tcPr>
+          <w:p>
+            <w:pPr>
+              <w:spacing w:after="0"/>
+              <w:jc w:val="left"/>
+            </w:pPr>
+            <w:r/>
+            <w:r>
+              <w:rPr>
+                <w:rFonts w:ascii="Arial" w:hAnsi="Arial" w:cs="Arial" w:eastAsia="Arial"/>
+                <w:b w:val="0"/>
+                <w:color w:val="000000"/>
+                <w:sz w:val="22"/>
+              </w:rPr>
+              <w:t>Yes</w:t>
+            </w:r>
+          </w:p>
+        </w:tc>
+        <w:tc>
+          <w:tcPr>
+            <w:tcW w:type="dxa" w:w="1624"/>
+          </w:tcPr>
+          <w:p>
+            <w:pPr>
+              <w:spacing w:after="0"/>
+              <w:jc w:val="left"/>
+            </w:pPr>
+            <w:r/>
+            <w:r>
+              <w:rPr>
+                <w:rFonts w:ascii="Arial" w:hAnsi="Arial" w:cs="Arial" w:eastAsia="Arial"/>
+                <w:b w:val="0"/>
+                <w:color w:val="000000"/>
+                <w:sz w:val="22"/>
+              </w:rPr>
+              <w:t>Yes</w:t>
+            </w:r>
+          </w:p>
+        </w:tc>
+        <w:tc>
+          <w:tcPr>
+            <w:tcW w:type="dxa" w:w="1624"/>
+          </w:tcPr>
+          <w:p>
+            <w:pPr>
+              <w:spacing w:after="0"/>
+              <w:jc w:val="left"/>
+            </w:pPr>
+            <w:r/>
+            <w:r>
+              <w:rPr>
+                <w:rFonts w:ascii="Arial" w:hAnsi="Arial" w:cs="Arial" w:eastAsia="Arial"/>
+                <w:b w:val="0"/>
+                <w:color w:val="000000"/>
+                <w:sz w:val="22"/>
+              </w:rPr>
+              <w:t>Own leads only</w:t>
+            </w:r>
+          </w:p>
+        </w:tc>
+        <w:tc>
+          <w:tcPr>
+            <w:tcW w:type="dxa" w:w="1624"/>
+          </w:tcPr>
+          <w:p>
+            <w:pPr>
+              <w:spacing w:after="0"/>
+              <w:jc w:val="left"/>
+            </w:pPr>
+            <w:r/>
+            <w:r>
+              <w:rPr>
+                <w:rFonts w:ascii="Arial" w:hAnsi="Arial" w:cs="Arial" w:eastAsia="Arial"/>
+                <w:b w:val="0"/>
+                <w:color w:val="000000"/>
+                <w:sz w:val="22"/>
+              </w:rPr>
+              <w:t>Yes</w:t>
+            </w:r>
+          </w:p>
+        </w:tc>
+        <w:tc>
+          <w:tcPr>
+            <w:tcW w:type="dxa" w:w="1624"/>
+          </w:tcPr>
+          <w:p>
+            <w:pPr>
+              <w:spacing w:after="0"/>
+              <w:jc w:val="left"/>
+            </w:pPr>
+            <w:r/>
+            <w:r>
+              <w:rPr>
+                <w:rFonts w:ascii="Arial" w:hAnsi="Arial" w:cs="Arial" w:eastAsia="Arial"/>
+                <w:b w:val="0"/>
+                <w:color w:val="000000"/>
+                <w:sz w:val="22"/>
+              </w:rPr>
+              <w:t>No</w:t>
+            </w:r>
+          </w:p>
+        </w:tc>
+      </w:tr>
+    </w:tbl>
+    <w:p>
+      <w:pPr>
+        <w:spacing w:after="0"/>
+      </w:pPr>
+    </w:p>
+    <w:p>
+      <w:pPr>
+        <w:jc w:val="both"/>
+      </w:pPr>
+      <w:r>
+        <w:rPr>
+          <w:rFonts w:ascii="Arial" w:hAnsi="Arial" w:cs="Arial" w:eastAsia="Arial"/>
+          <w:b w:val="0"/>
+          <w:color w:val="000000"/>
+          <w:sz w:val="22"/>
+        </w:rPr>
+        <w:t>Every action taken by a Super Admin on behalf of another role is recorded under the Super Admin's name in the audit trail.</w:t>
+      </w:r>
+    </w:p>
+    <w:p>
+      <w:pPr>
+        <w:pStyle w:val="Heading2"/>
+      </w:pPr>
+      <w:r>
+        <w:rPr>
+          <w:rFonts w:ascii="Arial" w:hAnsi="Arial" w:cs="Arial" w:eastAsia="Arial"/>
+          <w:b/>
+          <w:color w:val="000000"/>
+          <w:sz w:val="23"/>
+        </w:rPr>
+        <w:t>4.2 Sales regions</w:t>
+      </w:r>
     </w:p>
     <w:p>
       <w:pPr>
@@ -2397,6 +4214,73 @@
         <w:t>The process is designed from the franchisor's point of view and has 8 stages. Each stage has one person in charge (PIC) and a deadline.</w:t>
       </w:r>
     </w:p>
+    <w:p>
+      <w:pPr>
+        <w:pStyle w:val="Heading2"/>
+      </w:pPr>
+      <w:r>
+        <w:rPr>
+          <w:rFonts w:ascii="Arial" w:hAnsi="Arial" w:cs="Arial" w:eastAsia="Arial"/>
+          <w:b/>
+          <w:color w:val="000000"/>
+          <w:sz w:val="23"/>
+        </w:rPr>
+        <w:t>5.1 Flowchart</w:t>
+      </w:r>
+    </w:p>
+    <w:p>
+      <w:pPr>
+        <w:jc w:val="center"/>
+      </w:pPr>
+      <w:r>
+        <w:drawing>
+          <wp:inline xmlns:a="http://schemas.openxmlformats.org/drawingml/2006/main" xmlns:pic="http://schemas.openxmlformats.org/drawingml/2006/picture">
+            <wp:extent cx="5220000" cy="7546304"/>
+            <wp:docPr id="1" name="Picture 1"/>
+            <wp:cNvGraphicFramePr>
+              <a:graphicFrameLocks noChangeAspect="1"/>
+            </wp:cNvGraphicFramePr>
+            <a:graphic>
+              <a:graphicData uri="http://schemas.openxmlformats.org/drawingml/2006/picture">
+                <pic:pic>
+                  <pic:nvPicPr>
+                    <pic:cNvPr id="0" name="flowchart.png"/>
+                    <pic:cNvPicPr/>
+                  </pic:nvPicPr>
+                  <pic:blipFill>
+                    <a:blip r:embed="rId10"/>
+                    <a:stretch>
+                      <a:fillRect/>
+                    </a:stretch>
+                  </pic:blipFill>
+                  <pic:spPr>
+                    <a:xfrm>
+                      <a:off x="0" y="0"/>
+                      <a:ext cx="5220000" cy="7546304"/>
+                    </a:xfrm>
+                    <a:prstGeom prst="rect"/>
+                  </pic:spPr>
+                </pic:pic>
+              </a:graphicData>
+            </a:graphic>
+          </wp:inline>
+        </w:drawing>
+      </w:r>
+    </w:p>
+    <w:p>
+      <w:pPr>
+        <w:pStyle w:val="Heading2"/>
+      </w:pPr>
+      <w:r>
+        <w:rPr>
+          <w:rFonts w:ascii="Arial" w:hAnsi="Arial" w:cs="Arial" w:eastAsia="Arial"/>
+          <w:b/>
+          <w:color w:val="000000"/>
+          <w:sz w:val="23"/>
+        </w:rPr>
+        <w:t>5.2 Stages and deadlines</w:t>
+      </w:r>
+    </w:p>
     <w:tbl>
       <w:tblPr>
         <w:tblStyle w:val="TableGrid"/>
@@ -3177,16 +5061,740 @@
     </w:p>
     <w:p>
       <w:pPr>
-        <w:jc w:val="both"/>
+        <w:pStyle w:val="Heading2"/>
       </w:pPr>
       <w:r>
         <w:rPr>
           <w:rFonts w:ascii="Arial" w:hAnsi="Arial" w:cs="Arial" w:eastAsia="Arial"/>
-          <w:b w:val="0"/>
+          <w:b/>
           <w:color w:val="000000"/>
-          <w:sz w:val="22"/>
+          <w:sz w:val="23"/>
         </w:rPr>
-        <w:t>Key business rules:</w:t>
+        <w:t>5.3 Input, Process, Output (IPO) per stage</w:t>
+      </w:r>
+    </w:p>
+    <w:tbl>
+      <w:tblPr>
+        <w:tblStyle w:val="TableGrid"/>
+        <w:tblW w:type="auto" w:w="0"/>
+        <w:tblLook w:firstColumn="1" w:firstRow="1" w:lastColumn="0" w:lastRow="0" w:noHBand="0" w:noVBand="1" w:val="04A0"/>
+      </w:tblPr>
+      <w:tblGrid>
+        <w:gridCol w:w="2436"/>
+        <w:gridCol w:w="2436"/>
+        <w:gridCol w:w="2436"/>
+        <w:gridCol w:w="2436"/>
+      </w:tblGrid>
+      <w:tr>
+        <w:tc>
+          <w:tcPr>
+            <w:tcW w:type="dxa" w:w="2436"/>
+            <w:shd w:val="clear" w:color="auto" w:fill="E7E2DA"/>
+          </w:tcPr>
+          <w:p>
+            <w:pPr>
+              <w:spacing w:after="0"/>
+              <w:jc w:val="left"/>
+            </w:pPr>
+            <w:r/>
+            <w:r>
+              <w:rPr>
+                <w:rFonts w:ascii="Arial" w:hAnsi="Arial" w:cs="Arial" w:eastAsia="Arial"/>
+                <w:b/>
+                <w:color w:val="000000"/>
+                <w:sz w:val="22"/>
+              </w:rPr>
+              <w:t>Stage</w:t>
+            </w:r>
+          </w:p>
+        </w:tc>
+        <w:tc>
+          <w:tcPr>
+            <w:tcW w:type="dxa" w:w="2436"/>
+            <w:shd w:val="clear" w:color="auto" w:fill="E7E2DA"/>
+          </w:tcPr>
+          <w:p>
+            <w:pPr>
+              <w:spacing w:after="0"/>
+              <w:jc w:val="left"/>
+            </w:pPr>
+            <w:r/>
+            <w:r>
+              <w:rPr>
+                <w:rFonts w:ascii="Arial" w:hAnsi="Arial" w:cs="Arial" w:eastAsia="Arial"/>
+                <w:b/>
+                <w:color w:val="000000"/>
+                <w:sz w:val="22"/>
+              </w:rPr>
+              <w:t>Input</w:t>
+            </w:r>
+          </w:p>
+        </w:tc>
+        <w:tc>
+          <w:tcPr>
+            <w:tcW w:type="dxa" w:w="2436"/>
+            <w:shd w:val="clear" w:color="auto" w:fill="E7E2DA"/>
+          </w:tcPr>
+          <w:p>
+            <w:pPr>
+              <w:spacing w:after="0"/>
+              <w:jc w:val="left"/>
+            </w:pPr>
+            <w:r/>
+            <w:r>
+              <w:rPr>
+                <w:rFonts w:ascii="Arial" w:hAnsi="Arial" w:cs="Arial" w:eastAsia="Arial"/>
+                <w:b/>
+                <w:color w:val="000000"/>
+                <w:sz w:val="22"/>
+              </w:rPr>
+              <w:t>Process</w:t>
+            </w:r>
+          </w:p>
+        </w:tc>
+        <w:tc>
+          <w:tcPr>
+            <w:tcW w:type="dxa" w:w="2436"/>
+            <w:shd w:val="clear" w:color="auto" w:fill="E7E2DA"/>
+          </w:tcPr>
+          <w:p>
+            <w:pPr>
+              <w:spacing w:after="0"/>
+              <w:jc w:val="left"/>
+            </w:pPr>
+            <w:r/>
+            <w:r>
+              <w:rPr>
+                <w:rFonts w:ascii="Arial" w:hAnsi="Arial" w:cs="Arial" w:eastAsia="Arial"/>
+                <w:b/>
+                <w:color w:val="000000"/>
+                <w:sz w:val="22"/>
+              </w:rPr>
+              <w:t>Output</w:t>
+            </w:r>
+          </w:p>
+        </w:tc>
+      </w:tr>
+      <w:tr>
+        <w:tc>
+          <w:tcPr>
+            <w:tcW w:type="dxa" w:w="2436"/>
+          </w:tcPr>
+          <w:p>
+            <w:pPr>
+              <w:spacing w:after="0"/>
+              <w:jc w:val="left"/>
+            </w:pPr>
+            <w:r/>
+            <w:r>
+              <w:rPr>
+                <w:rFonts w:ascii="Arial" w:hAnsi="Arial" w:cs="Arial" w:eastAsia="Arial"/>
+                <w:b w:val="0"/>
+                <w:color w:val="000000"/>
+                <w:sz w:val="22"/>
+              </w:rPr>
+              <w:t>1. New lead</w:t>
+            </w:r>
+          </w:p>
+        </w:tc>
+        <w:tc>
+          <w:tcPr>
+            <w:tcW w:type="dxa" w:w="2436"/>
+          </w:tcPr>
+          <w:p>
+            <w:pPr>
+              <w:spacing w:after="0"/>
+              <w:jc w:val="left"/>
+            </w:pPr>
+            <w:r/>
+            <w:r>
+              <w:rPr>
+                <w:rFonts w:ascii="Arial" w:hAnsi="Arial" w:cs="Arial" w:eastAsia="Arial"/>
+                <w:b w:val="0"/>
+                <w:color w:val="000000"/>
+                <w:sz w:val="22"/>
+              </w:rPr>
+              <w:t>Candidate data: name, phone, email, city, package, available capital, source of funds, planned location, personal data consent</w:t>
+            </w:r>
+          </w:p>
+        </w:tc>
+        <w:tc>
+          <w:tcPr>
+            <w:tcW w:type="dxa" w:w="2436"/>
+          </w:tcPr>
+          <w:p>
+            <w:pPr>
+              <w:spacing w:after="0"/>
+              <w:jc w:val="left"/>
+            </w:pPr>
+            <w:r/>
+            <w:r>
+              <w:rPr>
+                <w:rFonts w:ascii="Arial" w:hAnsi="Arial" w:cs="Arial" w:eastAsia="Arial"/>
+                <w:b w:val="0"/>
+                <w:color w:val="000000"/>
+                <w:sz w:val="22"/>
+              </w:rPr>
+              <w:t>Duplicate check, region matching, sales capacity check, AI fit score</w:t>
+            </w:r>
+          </w:p>
+        </w:tc>
+        <w:tc>
+          <w:tcPr>
+            <w:tcW w:type="dxa" w:w="2436"/>
+          </w:tcPr>
+          <w:p>
+            <w:pPr>
+              <w:spacing w:after="0"/>
+              <w:jc w:val="left"/>
+            </w:pPr>
+            <w:r/>
+            <w:r>
+              <w:rPr>
+                <w:rFonts w:ascii="Arial" w:hAnsi="Arial" w:cs="Arial" w:eastAsia="Arial"/>
+                <w:b w:val="0"/>
+                <w:color w:val="000000"/>
+                <w:sz w:val="22"/>
+              </w:rPr>
+              <w:t>Application number, assigned sales (or Manager queue), notification to sales, confirmation and tracker access for the candidate</w:t>
+            </w:r>
+          </w:p>
+        </w:tc>
+      </w:tr>
+      <w:tr>
+        <w:tc>
+          <w:tcPr>
+            <w:tcW w:type="dxa" w:w="2436"/>
+          </w:tcPr>
+          <w:p>
+            <w:pPr>
+              <w:spacing w:after="0"/>
+              <w:jc w:val="left"/>
+            </w:pPr>
+            <w:r/>
+            <w:r>
+              <w:rPr>
+                <w:rFonts w:ascii="Arial" w:hAnsi="Arial" w:cs="Arial" w:eastAsia="Arial"/>
+                <w:b w:val="0"/>
+                <w:color w:val="000000"/>
+                <w:sz w:val="22"/>
+              </w:rPr>
+              <w:t>2. Business presentation</w:t>
+            </w:r>
+          </w:p>
+        </w:tc>
+        <w:tc>
+          <w:tcPr>
+            <w:tcW w:type="dxa" w:w="2436"/>
+          </w:tcPr>
+          <w:p>
+            <w:pPr>
+              <w:spacing w:after="0"/>
+              <w:jc w:val="left"/>
+            </w:pPr>
+            <w:r/>
+            <w:r>
+              <w:rPr>
+                <w:rFonts w:ascii="Arial" w:hAnsi="Arial" w:cs="Arial" w:eastAsia="Arial"/>
+                <w:b w:val="0"/>
+                <w:color w:val="000000"/>
+                <w:sz w:val="22"/>
+              </w:rPr>
+              <w:t>Presentation date and mode, prospectus delivery confirmation, notes</w:t>
+            </w:r>
+          </w:p>
+        </w:tc>
+        <w:tc>
+          <w:tcPr>
+            <w:tcW w:type="dxa" w:w="2436"/>
+          </w:tcPr>
+          <w:p>
+            <w:pPr>
+              <w:spacing w:after="0"/>
+              <w:jc w:val="left"/>
+            </w:pPr>
+            <w:r/>
+            <w:r>
+              <w:rPr>
+                <w:rFonts w:ascii="Arial" w:hAnsi="Arial" w:cs="Arial" w:eastAsia="Arial"/>
+                <w:b w:val="0"/>
+                <w:color w:val="000000"/>
+                <w:sz w:val="22"/>
+              </w:rPr>
+              <w:t>Sales presents the business model and sends the prospectus</w:t>
+            </w:r>
+          </w:p>
+        </w:tc>
+        <w:tc>
+          <w:tcPr>
+            <w:tcW w:type="dxa" w:w="2436"/>
+          </w:tcPr>
+          <w:p>
+            <w:pPr>
+              <w:spacing w:after="0"/>
+              <w:jc w:val="left"/>
+            </w:pPr>
+            <w:r/>
+            <w:r>
+              <w:rPr>
+                <w:rFonts w:ascii="Arial" w:hAnsi="Arial" w:cs="Arial" w:eastAsia="Arial"/>
+                <w:b w:val="0"/>
+                <w:color w:val="000000"/>
+                <w:sz w:val="22"/>
+              </w:rPr>
+              <w:t>Prospectus delivery date recorded, application moves to Location survey</w:t>
+            </w:r>
+          </w:p>
+        </w:tc>
+      </w:tr>
+      <w:tr>
+        <w:tc>
+          <w:tcPr>
+            <w:tcW w:type="dxa" w:w="2436"/>
+          </w:tcPr>
+          <w:p>
+            <w:pPr>
+              <w:spacing w:after="0"/>
+              <w:jc w:val="left"/>
+            </w:pPr>
+            <w:r/>
+            <w:r>
+              <w:rPr>
+                <w:rFonts w:ascii="Arial" w:hAnsi="Arial" w:cs="Arial" w:eastAsia="Arial"/>
+                <w:b w:val="0"/>
+                <w:color w:val="000000"/>
+                <w:sz w:val="22"/>
+              </w:rPr>
+              <w:t>3. Location survey</w:t>
+            </w:r>
+          </w:p>
+        </w:tc>
+        <w:tc>
+          <w:tcPr>
+            <w:tcW w:type="dxa" w:w="2436"/>
+          </w:tcPr>
+          <w:p>
+            <w:pPr>
+              <w:spacing w:after="0"/>
+              <w:jc w:val="left"/>
+            </w:pPr>
+            <w:r/>
+            <w:r>
+              <w:rPr>
+                <w:rFonts w:ascii="Arial" w:hAnsi="Arial" w:cs="Arial" w:eastAsia="Arial"/>
+                <w:b w:val="0"/>
+                <w:color w:val="000000"/>
+                <w:sz w:val="22"/>
+              </w:rPr>
+              <w:t>Location address and type, survey rating, foot traffic, photos, AI location score</w:t>
+            </w:r>
+          </w:p>
+        </w:tc>
+        <w:tc>
+          <w:tcPr>
+            <w:tcW w:type="dxa" w:w="2436"/>
+          </w:tcPr>
+          <w:p>
+            <w:pPr>
+              <w:spacing w:after="0"/>
+              <w:jc w:val="left"/>
+            </w:pPr>
+            <w:r/>
+            <w:r>
+              <w:rPr>
+                <w:rFonts w:ascii="Arial" w:hAnsi="Arial" w:cs="Arial" w:eastAsia="Arial"/>
+                <w:b w:val="0"/>
+                <w:color w:val="000000"/>
+                <w:sz w:val="22"/>
+              </w:rPr>
+              <w:t>Sales assesses the location (discusses with Manager first if the score is below 60)</w:t>
+            </w:r>
+          </w:p>
+        </w:tc>
+        <w:tc>
+          <w:tcPr>
+            <w:tcW w:type="dxa" w:w="2436"/>
+          </w:tcPr>
+          <w:p>
+            <w:pPr>
+              <w:spacing w:after="0"/>
+              <w:jc w:val="left"/>
+            </w:pPr>
+            <w:r/>
+            <w:r>
+              <w:rPr>
+                <w:rFonts w:ascii="Arial" w:hAnsi="Arial" w:cs="Arial" w:eastAsia="Arial"/>
+                <w:b w:val="0"/>
+                <w:color w:val="000000"/>
+                <w:sz w:val="22"/>
+              </w:rPr>
+              <w:t>Feasible: moves to Eligibility assessment. Not feasible: rejected with reason</w:t>
+            </w:r>
+          </w:p>
+        </w:tc>
+      </w:tr>
+      <w:tr>
+        <w:tc>
+          <w:tcPr>
+            <w:tcW w:type="dxa" w:w="2436"/>
+          </w:tcPr>
+          <w:p>
+            <w:pPr>
+              <w:spacing w:after="0"/>
+              <w:jc w:val="left"/>
+            </w:pPr>
+            <w:r/>
+            <w:r>
+              <w:rPr>
+                <w:rFonts w:ascii="Arial" w:hAnsi="Arial" w:cs="Arial" w:eastAsia="Arial"/>
+                <w:b w:val="0"/>
+                <w:color w:val="000000"/>
+                <w:sz w:val="22"/>
+              </w:rPr>
+              <w:t>4. Eligibility assessment</w:t>
+            </w:r>
+          </w:p>
+        </w:tc>
+        <w:tc>
+          <w:tcPr>
+            <w:tcW w:type="dxa" w:w="2436"/>
+          </w:tcPr>
+          <w:p>
+            <w:pPr>
+              <w:spacing w:after="0"/>
+              <w:jc w:val="left"/>
+            </w:pPr>
+            <w:r/>
+            <w:r>
+              <w:rPr>
+                <w:rFonts w:ascii="Arial" w:hAnsi="Arial" w:cs="Arial" w:eastAsia="Arial"/>
+                <w:b w:val="0"/>
+                <w:color w:val="000000"/>
+                <w:sz w:val="22"/>
+              </w:rPr>
+              <w:t>Interview result, background check, bank statement, ID and tax number (KYC), commitment</w:t>
+            </w:r>
+          </w:p>
+        </w:tc>
+        <w:tc>
+          <w:tcPr>
+            <w:tcW w:type="dxa" w:w="2436"/>
+          </w:tcPr>
+          <w:p>
+            <w:pPr>
+              <w:spacing w:after="0"/>
+              <w:jc w:val="left"/>
+            </w:pPr>
+            <w:r/>
+            <w:r>
+              <w:rPr>
+                <w:rFonts w:ascii="Arial" w:hAnsi="Arial" w:cs="Arial" w:eastAsia="Arial"/>
+                <w:b w:val="0"/>
+                <w:color w:val="000000"/>
+                <w:sz w:val="22"/>
+              </w:rPr>
+              <w:t>Reviewer evaluates each item on a checklist</w:t>
+            </w:r>
+          </w:p>
+        </w:tc>
+        <w:tc>
+          <w:tcPr>
+            <w:tcW w:type="dxa" w:w="2436"/>
+          </w:tcPr>
+          <w:p>
+            <w:pPr>
+              <w:spacing w:after="0"/>
+              <w:jc w:val="left"/>
+            </w:pPr>
+            <w:r/>
+            <w:r>
+              <w:rPr>
+                <w:rFonts w:ascii="Arial" w:hAnsi="Arial" w:cs="Arial" w:eastAsia="Arial"/>
+                <w:b w:val="0"/>
+                <w:color w:val="000000"/>
+                <w:sz w:val="22"/>
+              </w:rPr>
+              <w:t>Eligible: moves to Quotation. Not eligible: rejected with reason</w:t>
+            </w:r>
+          </w:p>
+        </w:tc>
+      </w:tr>
+      <w:tr>
+        <w:tc>
+          <w:tcPr>
+            <w:tcW w:type="dxa" w:w="2436"/>
+          </w:tcPr>
+          <w:p>
+            <w:pPr>
+              <w:spacing w:after="0"/>
+              <w:jc w:val="left"/>
+            </w:pPr>
+            <w:r/>
+            <w:r>
+              <w:rPr>
+                <w:rFonts w:ascii="Arial" w:hAnsi="Arial" w:cs="Arial" w:eastAsia="Arial"/>
+                <w:b w:val="0"/>
+                <w:color w:val="000000"/>
+                <w:sz w:val="22"/>
+              </w:rPr>
+              <w:t>5. Quotation</w:t>
+            </w:r>
+          </w:p>
+        </w:tc>
+        <w:tc>
+          <w:tcPr>
+            <w:tcW w:type="dxa" w:w="2436"/>
+          </w:tcPr>
+          <w:p>
+            <w:pPr>
+              <w:spacing w:after="0"/>
+              <w:jc w:val="left"/>
+            </w:pPr>
+            <w:r/>
+            <w:r>
+              <w:rPr>
+                <w:rFonts w:ascii="Arial" w:hAnsi="Arial" w:cs="Arial" w:eastAsia="Arial"/>
+                <w:b w:val="0"/>
+                <w:color w:val="000000"/>
+                <w:sz w:val="22"/>
+              </w:rPr>
+              <w:t>Package, discount, payment terms, target opening date, result of discussion with Manager (for revisions)</w:t>
+            </w:r>
+          </w:p>
+        </w:tc>
+        <w:tc>
+          <w:tcPr>
+            <w:tcW w:type="dxa" w:w="2436"/>
+          </w:tcPr>
+          <w:p>
+            <w:pPr>
+              <w:spacing w:after="0"/>
+              <w:jc w:val="left"/>
+            </w:pPr>
+            <w:r/>
+            <w:r>
+              <w:rPr>
+                <w:rFonts w:ascii="Arial" w:hAnsi="Arial" w:cs="Arial" w:eastAsia="Arial"/>
+                <w:b w:val="0"/>
+                <w:color w:val="000000"/>
+                <w:sz w:val="22"/>
+              </w:rPr>
+              <w:t>System creates quotation version N and emails it with a portal link</w:t>
+            </w:r>
+          </w:p>
+        </w:tc>
+        <w:tc>
+          <w:tcPr>
+            <w:tcW w:type="dxa" w:w="2436"/>
+          </w:tcPr>
+          <w:p>
+            <w:pPr>
+              <w:spacing w:after="0"/>
+              <w:jc w:val="left"/>
+            </w:pPr>
+            <w:r/>
+            <w:r>
+              <w:rPr>
+                <w:rFonts w:ascii="Arial" w:hAnsi="Arial" w:cs="Arial" w:eastAsia="Arial"/>
+                <w:b w:val="0"/>
+                <w:color w:val="000000"/>
+                <w:sz w:val="22"/>
+              </w:rPr>
+              <w:t>Quotation version N sent and recorded</w:t>
+            </w:r>
+          </w:p>
+        </w:tc>
+      </w:tr>
+      <w:tr>
+        <w:tc>
+          <w:tcPr>
+            <w:tcW w:type="dxa" w:w="2436"/>
+          </w:tcPr>
+          <w:p>
+            <w:pPr>
+              <w:spacing w:after="0"/>
+              <w:jc w:val="left"/>
+            </w:pPr>
+            <w:r/>
+            <w:r>
+              <w:rPr>
+                <w:rFonts w:ascii="Arial" w:hAnsi="Arial" w:cs="Arial" w:eastAsia="Arial"/>
+                <w:b w:val="0"/>
+                <w:color w:val="000000"/>
+                <w:sz w:val="22"/>
+              </w:rPr>
+              <w:t>6. Negotiation</w:t>
+            </w:r>
+          </w:p>
+        </w:tc>
+        <w:tc>
+          <w:tcPr>
+            <w:tcW w:type="dxa" w:w="2436"/>
+          </w:tcPr>
+          <w:p>
+            <w:pPr>
+              <w:spacing w:after="0"/>
+              <w:jc w:val="left"/>
+            </w:pPr>
+            <w:r/>
+            <w:r>
+              <w:rPr>
+                <w:rFonts w:ascii="Arial" w:hAnsi="Arial" w:cs="Arial" w:eastAsia="Arial"/>
+                <w:b w:val="0"/>
+                <w:color w:val="000000"/>
+                <w:sz w:val="22"/>
+              </w:rPr>
+              <w:t>Candidate response: agree (with confirmation), request changes (type and details, or new address), or withdraw</w:t>
+            </w:r>
+          </w:p>
+        </w:tc>
+        <w:tc>
+          <w:tcPr>
+            <w:tcW w:type="dxa" w:w="2436"/>
+          </w:tcPr>
+          <w:p>
+            <w:pPr>
+              <w:spacing w:after="0"/>
+              <w:jc w:val="left"/>
+            </w:pPr>
+            <w:r/>
+            <w:r>
+              <w:rPr>
+                <w:rFonts w:ascii="Arial" w:hAnsi="Arial" w:cs="Arial" w:eastAsia="Arial"/>
+                <w:b w:val="0"/>
+                <w:color w:val="000000"/>
+                <w:sz w:val="22"/>
+              </w:rPr>
+              <w:t>System routes the application based on the response</w:t>
+            </w:r>
+          </w:p>
+        </w:tc>
+        <w:tc>
+          <w:tcPr>
+            <w:tcW w:type="dxa" w:w="2436"/>
+          </w:tcPr>
+          <w:p>
+            <w:pPr>
+              <w:spacing w:after="0"/>
+              <w:jc w:val="left"/>
+            </w:pPr>
+            <w:r/>
+            <w:r>
+              <w:rPr>
+                <w:rFonts w:ascii="Arial" w:hAnsi="Arial" w:cs="Arial" w:eastAsia="Arial"/>
+                <w:b w:val="0"/>
+                <w:color w:val="000000"/>
+                <w:sz w:val="22"/>
+              </w:rPr>
+              <w:t>Agree: approval 1 of 2, moves to Final approval. Changes: back to Quotation or Location survey. Withdraw: closed</w:t>
+            </w:r>
+          </w:p>
+        </w:tc>
+      </w:tr>
+      <w:tr>
+        <w:tc>
+          <w:tcPr>
+            <w:tcW w:type="dxa" w:w="2436"/>
+          </w:tcPr>
+          <w:p>
+            <w:pPr>
+              <w:spacing w:after="0"/>
+              <w:jc w:val="left"/>
+            </w:pPr>
+            <w:r/>
+            <w:r>
+              <w:rPr>
+                <w:rFonts w:ascii="Arial" w:hAnsi="Arial" w:cs="Arial" w:eastAsia="Arial"/>
+                <w:b w:val="0"/>
+                <w:color w:val="000000"/>
+                <w:sz w:val="22"/>
+              </w:rPr>
+              <w:t>7. Final approval</w:t>
+            </w:r>
+          </w:p>
+        </w:tc>
+        <w:tc>
+          <w:tcPr>
+            <w:tcW w:type="dxa" w:w="2436"/>
+          </w:tcPr>
+          <w:p>
+            <w:pPr>
+              <w:spacing w:after="0"/>
+              <w:jc w:val="left"/>
+            </w:pPr>
+            <w:r/>
+            <w:r>
+              <w:rPr>
+                <w:rFonts w:ascii="Arial" w:hAnsi="Arial" w:cs="Arial" w:eastAsia="Arial"/>
+                <w:b w:val="0"/>
+                <w:color w:val="000000"/>
+                <w:sz w:val="22"/>
+              </w:rPr>
+              <w:t>Complete application history and the agreed quotation</w:t>
+            </w:r>
+          </w:p>
+        </w:tc>
+        <w:tc>
+          <w:tcPr>
+            <w:tcW w:type="dxa" w:w="2436"/>
+          </w:tcPr>
+          <w:p>
+            <w:pPr>
+              <w:spacing w:after="0"/>
+              <w:jc w:val="left"/>
+            </w:pPr>
+            <w:r/>
+            <w:r>
+              <w:rPr>
+                <w:rFonts w:ascii="Arial" w:hAnsi="Arial" w:cs="Arial" w:eastAsia="Arial"/>
+                <w:b w:val="0"/>
+                <w:color w:val="000000"/>
+                <w:sz w:val="22"/>
+              </w:rPr>
+              <w:t>Manager approves or rejects</w:t>
+            </w:r>
+          </w:p>
+        </w:tc>
+        <w:tc>
+          <w:tcPr>
+            <w:tcW w:type="dxa" w:w="2436"/>
+          </w:tcPr>
+          <w:p>
+            <w:pPr>
+              <w:spacing w:after="0"/>
+              <w:jc w:val="left"/>
+            </w:pPr>
+            <w:r/>
+            <w:r>
+              <w:rPr>
+                <w:rFonts w:ascii="Arial" w:hAnsi="Arial" w:cs="Arial" w:eastAsia="Arial"/>
+                <w:b w:val="0"/>
+                <w:color w:val="000000"/>
+                <w:sz w:val="22"/>
+              </w:rPr>
+              <w:t>Approved: approval 2 of 2, revenue counted, next step is the franchise agreement. Rejected: closed with reason. The candidate is notified in both cases</w:t>
+            </w:r>
+          </w:p>
+        </w:tc>
+      </w:tr>
+    </w:tbl>
+    <w:p>
+      <w:pPr>
+        <w:spacing w:after="0"/>
+      </w:pPr>
+    </w:p>
+    <w:p>
+      <w:pPr>
+        <w:pStyle w:val="Heading2"/>
+      </w:pPr>
+      <w:r>
+        <w:rPr>
+          <w:rFonts w:ascii="Arial" w:hAnsi="Arial" w:cs="Arial" w:eastAsia="Arial"/>
+          <w:b/>
+          <w:color w:val="000000"/>
+          <w:sz w:val="23"/>
+        </w:rPr>
+        <w:t>5.4 Key business rules</w:t>
       </w:r>
     </w:p>
     <w:p>
@@ -3234,7 +5842,7 @@
           <w:color w:val="000000"/>
           <w:sz w:val="22"/>
         </w:rPr>
-        <w:t xml:space="preserve"> The presentation stage requires the sales to confirm that the franchise prospectus has been sent. PP No. 42/2007 requires the franchisor to deliver the prospectus at least two weeks before the franchise agreement is signed.</w:t>
+        <w:t xml:space="preserve"> The presentation stage requires the sales to confirm that the franchise prospectus has been sent. PP No. 35/2024 on Franchising, which replaced PP No. 42/2007, requires the franchisor to deliver the prospectus to the candidate at least 14 calendar days before the franchise agreement is signed [5]. Recording the delivery date in the system makes this easy to prove.</w:t>
       </w:r>
     </w:p>
     <w:p>
@@ -5119,7 +7727,7 @@
           <w:color w:val="000000"/>
           <w:sz w:val="22"/>
         </w:rPr>
-        <w:t>Privacy and security (UU PDP No. 27/2022).</w:t>
+        <w:t>Privacy and security (UU PDP No. 27/2022) [6].</w:t>
       </w:r>
       <w:r>
         <w:rPr>
@@ -6401,7 +9009,7 @@
                 <w:color w:val="000000"/>
                 <w:sz w:val="22"/>
               </w:rPr>
-              <w:t>Asked the AI to verify sources. One statistic turned out to be older data (2016 to 2019) that had been cited as recent, so I described it accurately</w:t>
+              <w:t>Asked the AI to verify sources. One statistic turned out to be older data (2016 to 2019) that had been cited as recent, and the franchise regulation I first used (PP No. 42/2007) had been replaced by PP No. 35/2024, so I corrected both</w:t>
             </w:r>
           </w:p>
         </w:tc>
@@ -6568,6 +9176,110 @@
           <w:sz w:val="22"/>
         </w:rPr>
         <w:t>Screenshots of the AI conversation are attached in the Appendix.</w:t>
+      </w:r>
+    </w:p>
+    <w:p>
+      <w:pPr>
+        <w:pStyle w:val="Heading1"/>
+      </w:pPr>
+      <w:r>
+        <w:rPr>
+          <w:rFonts w:ascii="Arial" w:hAnsi="Arial" w:cs="Arial" w:eastAsia="Arial"/>
+          <w:b/>
+          <w:color w:val="000000"/>
+          <w:sz w:val="26"/>
+        </w:rPr>
+        <w:t>References</w:t>
+      </w:r>
+    </w:p>
+    <w:p>
+      <w:pPr>
+        <w:pStyle w:val="ListNumber"/>
+        <w:jc w:val="left"/>
+      </w:pPr>
+      <w:r>
+        <w:rPr>
+          <w:rFonts w:ascii="Arial" w:hAnsi="Arial" w:cs="Arial" w:eastAsia="Arial"/>
+          <w:b w:val="0"/>
+          <w:color w:val="000000"/>
+          <w:sz w:val="22"/>
+        </w:rPr>
+        <w:t>ANTARA News, "Kemendag sebut sektor kuliner masih mendominasi bisnis waralaba". https://www.antaranews.com/berita/4774885/kemendag-sebut-sektor-kuliner-masih-mendominasi-bisnis-waralaba</w:t>
+      </w:r>
+    </w:p>
+    <w:p>
+      <w:pPr>
+        <w:pStyle w:val="ListNumber"/>
+        <w:jc w:val="left"/>
+      </w:pPr>
+      <w:r>
+        <w:rPr>
+          <w:rFonts w:ascii="Arial" w:hAnsi="Arial" w:cs="Arial" w:eastAsia="Arial"/>
+          <w:b w:val="0"/>
+          <w:color w:val="000000"/>
+          <w:sz w:val="22"/>
+        </w:rPr>
+        <w:t>Tempo, "Mendag: Waralaba Serap 97 Ribu Tenaga Kerja dengan Omzet Rp 143 Triliun". https://www.tempo.co/ekonomi/mendag-waralaba-serap-97-ribu-tenaga-kerja-dengan-omzet-rp-143-triliun-1218788</w:t>
+      </w:r>
+    </w:p>
+    <w:p>
+      <w:pPr>
+        <w:pStyle w:val="ListNumber"/>
+        <w:jc w:val="left"/>
+      </w:pPr>
+      <w:r>
+        <w:rPr>
+          <w:rFonts w:ascii="Arial" w:hAnsi="Arial" w:cs="Arial" w:eastAsia="Arial"/>
+          <w:b w:val="0"/>
+          <w:color w:val="000000"/>
+          <w:sz w:val="22"/>
+        </w:rPr>
+        <w:t>Marketeers, "Toffin: Nilai Pasar Kedai Kopi di Indonesia Capai Rp 4,8 Triliun". https://www.marketeers.com/toffin-nilai-pasar-kedai-kopi-di-indonesia-capai-rp-4-8-triliun/</w:t>
+      </w:r>
+    </w:p>
+    <w:p>
+      <w:pPr>
+        <w:pStyle w:val="ListNumber"/>
+        <w:jc w:val="left"/>
+      </w:pPr>
+      <w:r>
+        <w:rPr>
+          <w:rFonts w:ascii="Arial" w:hAnsi="Arial" w:cs="Arial" w:eastAsia="Arial"/>
+          <w:b w:val="0"/>
+          <w:color w:val="000000"/>
+          <w:sz w:val="22"/>
+        </w:rPr>
+        <w:t>Warta Ekonomi, "Bisnis Kedai Kopi di Indonesia Cerah, Jumlahnya Melesat 3X Lipat". https://wartaekonomi.co.id/read262062/bisnis-kedai-kopi-di-indonesia-cerah-jumlahnya-melesat-3x-lipat</w:t>
+      </w:r>
+    </w:p>
+    <w:p>
+      <w:pPr>
+        <w:pStyle w:val="ListNumber"/>
+        <w:jc w:val="left"/>
+      </w:pPr>
+      <w:r>
+        <w:rPr>
+          <w:rFonts w:ascii="Arial" w:hAnsi="Arial" w:cs="Arial" w:eastAsia="Arial"/>
+          <w:b w:val="0"/>
+          <w:color w:val="000000"/>
+          <w:sz w:val="22"/>
+        </w:rPr>
+        <w:t>JDIH BPK, Peraturan Pemerintah No. 35 Tahun 2024 tentang Waralaba. https://peraturan.bpk.go.id/Details/297489/pp-no-35-tahun-2024</w:t>
+      </w:r>
+    </w:p>
+    <w:p>
+      <w:pPr>
+        <w:pStyle w:val="ListNumber"/>
+        <w:jc w:val="left"/>
+      </w:pPr>
+      <w:r>
+        <w:rPr>
+          <w:rFonts w:ascii="Arial" w:hAnsi="Arial" w:cs="Arial" w:eastAsia="Arial"/>
+          <w:b w:val="0"/>
+          <w:color w:val="000000"/>
+          <w:sz w:val="22"/>
+        </w:rPr>
+        <w:t>JDIH BPK, Undang-Undang No. 27 Tahun 2022 tentang Pelindungan Data Pribadi. https://peraturan.bpk.go.id/Details/229798/uu-no-27-tahun-2022</w:t>
       </w:r>
     </w:p>
     <w:p>

</xml_diff>

<commit_message>
PRD: executive summary, table of contents, manual vs system comparison
Co-Authored-By: Claude Opus 5.5 <noreply@anthropic.com>
Claude-Session: https://claude.ai/code/session_01MyaJcnNN6cea99ff9yeVti
</commit_message>
<xml_diff>
--- a/prd/EDTS APM 2027 - Nadia Rahma Prasanti - Universitas Indonesia.docx
+++ b/prd/EDTS APM 2027 - Nadia Rahma Prasanti - Universitas Indonesia.docx
@@ -18,6 +18,52 @@
     </w:p>
     <w:p>
       <w:pPr>
+        <w:pStyle w:val="Heading1"/>
+      </w:pPr>
+      <w:r>
+        <w:rPr>
+          <w:rFonts w:ascii="Arial" w:hAnsi="Arial" w:cs="Arial" w:eastAsia="Arial"/>
+          <w:b/>
+          <w:color w:val="000000"/>
+          <w:sz w:val="26"/>
+        </w:rPr>
+        <w:t>Table of Contents</w:t>
+      </w:r>
+    </w:p>
+    <w:p>
+      <w:pPr>
+        <w:spacing w:after="40"/>
+        <w:jc w:val="left"/>
+      </w:pPr>
+      <w:r>
+        <w:rPr>
+          <w:rFonts w:ascii="Arial" w:hAnsi="Arial" w:cs="Arial" w:eastAsia="Arial"/>
+          <w:b/>
+          <w:color w:val="000000"/>
+          <w:sz w:val="22"/>
+        </w:rPr>
+        <w:t>1. Executive Summary</w:t>
+      </w:r>
+    </w:p>
+    <w:p>
+      <w:pPr>
+        <w:spacing w:after="40"/>
+        <w:jc w:val="left"/>
+      </w:pPr>
+      <w:r>
+        <w:rPr>
+          <w:rFonts w:ascii="Arial" w:hAnsi="Arial" w:cs="Arial" w:eastAsia="Arial"/>
+          <w:b/>
+          <w:color w:val="000000"/>
+          <w:sz w:val="22"/>
+        </w:rPr>
+        <w:t>2. Background and Assumptions</w:t>
+      </w:r>
+    </w:p>
+    <w:p>
+      <w:pPr>
+        <w:spacing w:after="40"/>
+        <w:ind w:left="454"/>
         <w:jc w:val="left"/>
       </w:pPr>
       <w:r>
@@ -27,11 +73,13 @@
           <w:color w:val="000000"/>
           <w:sz w:val="22"/>
         </w:rPr>
-        <w:t>Prototype (franchisor dashboard): https://kopikomapartnerportal.vercel.app</w:t>
+        <w:t>2.1 Client assumptions</w:t>
       </w:r>
     </w:p>
     <w:p>
       <w:pPr>
+        <w:spacing w:after="40"/>
+        <w:ind w:left="454"/>
         <w:jc w:val="left"/>
       </w:pPr>
       <w:r>
@@ -41,11 +89,13 @@
           <w:color w:val="000000"/>
           <w:sz w:val="22"/>
         </w:rPr>
-        <w:t>Prototype (candidate franchisee portal): https://kopikomapartnerportal.vercel.app/mitra</w:t>
+        <w:t>2.2 Industry context</w:t>
       </w:r>
     </w:p>
     <w:p>
       <w:pPr>
+        <w:spacing w:after="40"/>
+        <w:ind w:left="454"/>
         <w:jc w:val="left"/>
       </w:pPr>
       <w:r>
@@ -55,7 +105,352 @@
           <w:color w:val="000000"/>
           <w:sz w:val="22"/>
         </w:rPr>
-        <w:t>Demo password for all staff accounts: demo123 (accounts are listed on the login page)</w:t>
+        <w:t>2.3 Pain points (assumed)</w:t>
+      </w:r>
+    </w:p>
+    <w:p>
+      <w:pPr>
+        <w:spacing w:after="40"/>
+        <w:ind w:left="454"/>
+        <w:jc w:val="left"/>
+      </w:pPr>
+      <w:r>
+        <w:rPr>
+          <w:rFonts w:ascii="Arial" w:hAnsi="Arial" w:cs="Arial" w:eastAsia="Arial"/>
+          <w:b w:val="0"/>
+          <w:color w:val="000000"/>
+          <w:sz w:val="22"/>
+        </w:rPr>
+        <w:t>2.4 Current process vs proposed system</w:t>
+      </w:r>
+    </w:p>
+    <w:p>
+      <w:pPr>
+        <w:spacing w:after="40"/>
+        <w:jc w:val="left"/>
+      </w:pPr>
+      <w:r>
+        <w:rPr>
+          <w:rFonts w:ascii="Arial" w:hAnsi="Arial" w:cs="Arial" w:eastAsia="Arial"/>
+          <w:b/>
+          <w:color w:val="000000"/>
+          <w:sz w:val="22"/>
+        </w:rPr>
+        <w:t>3. Goals and Success Metrics</w:t>
+      </w:r>
+    </w:p>
+    <w:p>
+      <w:pPr>
+        <w:spacing w:after="40"/>
+        <w:jc w:val="left"/>
+      </w:pPr>
+      <w:r>
+        <w:rPr>
+          <w:rFonts w:ascii="Arial" w:hAnsi="Arial" w:cs="Arial" w:eastAsia="Arial"/>
+          <w:b/>
+          <w:color w:val="000000"/>
+          <w:sz w:val="22"/>
+        </w:rPr>
+        <w:t>4. Users and Roles</w:t>
+      </w:r>
+    </w:p>
+    <w:p>
+      <w:pPr>
+        <w:spacing w:after="40"/>
+        <w:ind w:left="454"/>
+        <w:jc w:val="left"/>
+      </w:pPr>
+      <w:r>
+        <w:rPr>
+          <w:rFonts w:ascii="Arial" w:hAnsi="Arial" w:cs="Arial" w:eastAsia="Arial"/>
+          <w:b w:val="0"/>
+          <w:color w:val="000000"/>
+          <w:sz w:val="22"/>
+        </w:rPr>
+        <w:t>4.1 Role-Based Access Control (RBAC)</w:t>
+      </w:r>
+    </w:p>
+    <w:p>
+      <w:pPr>
+        <w:spacing w:after="40"/>
+        <w:ind w:left="454"/>
+        <w:jc w:val="left"/>
+      </w:pPr>
+      <w:r>
+        <w:rPr>
+          <w:rFonts w:ascii="Arial" w:hAnsi="Arial" w:cs="Arial" w:eastAsia="Arial"/>
+          <w:b w:val="0"/>
+          <w:color w:val="000000"/>
+          <w:sz w:val="22"/>
+        </w:rPr>
+        <w:t>4.2 Sales regions</w:t>
+      </w:r>
+    </w:p>
+    <w:p>
+      <w:pPr>
+        <w:spacing w:after="40"/>
+        <w:jc w:val="left"/>
+      </w:pPr>
+      <w:r>
+        <w:rPr>
+          <w:rFonts w:ascii="Arial" w:hAnsi="Arial" w:cs="Arial" w:eastAsia="Arial"/>
+          <w:b/>
+          <w:color w:val="000000"/>
+          <w:sz w:val="22"/>
+        </w:rPr>
+        <w:t>5. End-to-End Process</w:t>
+      </w:r>
+    </w:p>
+    <w:p>
+      <w:pPr>
+        <w:spacing w:after="40"/>
+        <w:ind w:left="454"/>
+        <w:jc w:val="left"/>
+      </w:pPr>
+      <w:r>
+        <w:rPr>
+          <w:rFonts w:ascii="Arial" w:hAnsi="Arial" w:cs="Arial" w:eastAsia="Arial"/>
+          <w:b w:val="0"/>
+          <w:color w:val="000000"/>
+          <w:sz w:val="22"/>
+        </w:rPr>
+        <w:t>5.1 Flowchart</w:t>
+      </w:r>
+    </w:p>
+    <w:p>
+      <w:pPr>
+        <w:spacing w:after="40"/>
+        <w:ind w:left="454"/>
+        <w:jc w:val="left"/>
+      </w:pPr>
+      <w:r>
+        <w:rPr>
+          <w:rFonts w:ascii="Arial" w:hAnsi="Arial" w:cs="Arial" w:eastAsia="Arial"/>
+          <w:b w:val="0"/>
+          <w:color w:val="000000"/>
+          <w:sz w:val="22"/>
+        </w:rPr>
+        <w:t>5.2 Stages and deadlines</w:t>
+      </w:r>
+    </w:p>
+    <w:p>
+      <w:pPr>
+        <w:spacing w:after="40"/>
+        <w:ind w:left="454"/>
+        <w:jc w:val="left"/>
+      </w:pPr>
+      <w:r>
+        <w:rPr>
+          <w:rFonts w:ascii="Arial" w:hAnsi="Arial" w:cs="Arial" w:eastAsia="Arial"/>
+          <w:b w:val="0"/>
+          <w:color w:val="000000"/>
+          <w:sz w:val="22"/>
+        </w:rPr>
+        <w:t>5.3 Input, Process, Output (IPO) per stage</w:t>
+      </w:r>
+    </w:p>
+    <w:p>
+      <w:pPr>
+        <w:spacing w:after="40"/>
+        <w:ind w:left="454"/>
+        <w:jc w:val="left"/>
+      </w:pPr>
+      <w:r>
+        <w:rPr>
+          <w:rFonts w:ascii="Arial" w:hAnsi="Arial" w:cs="Arial" w:eastAsia="Arial"/>
+          <w:b w:val="0"/>
+          <w:color w:val="000000"/>
+          <w:sz w:val="22"/>
+        </w:rPr>
+        <w:t>5.4 Key business rules</w:t>
+      </w:r>
+    </w:p>
+    <w:p>
+      <w:pPr>
+        <w:spacing w:after="40"/>
+        <w:jc w:val="left"/>
+      </w:pPr>
+      <w:r>
+        <w:rPr>
+          <w:rFonts w:ascii="Arial" w:hAnsi="Arial" w:cs="Arial" w:eastAsia="Arial"/>
+          <w:b/>
+          <w:color w:val="000000"/>
+          <w:sz w:val="22"/>
+        </w:rPr>
+        <w:t>6. Features and Rationale</w:t>
+      </w:r>
+    </w:p>
+    <w:p>
+      <w:pPr>
+        <w:spacing w:after="40"/>
+        <w:ind w:left="454"/>
+        <w:jc w:val="left"/>
+      </w:pPr>
+      <w:r>
+        <w:rPr>
+          <w:rFonts w:ascii="Arial" w:hAnsi="Arial" w:cs="Arial" w:eastAsia="Arial"/>
+          <w:b w:val="0"/>
+          <w:color w:val="000000"/>
+          <w:sz w:val="22"/>
+        </w:rPr>
+        <w:t>6.1 Franchisor dashboard</w:t>
+      </w:r>
+    </w:p>
+    <w:p>
+      <w:pPr>
+        <w:spacing w:after="40"/>
+        <w:ind w:left="454"/>
+        <w:jc w:val="left"/>
+      </w:pPr>
+      <w:r>
+        <w:rPr>
+          <w:rFonts w:ascii="Arial" w:hAnsi="Arial" w:cs="Arial" w:eastAsia="Arial"/>
+          <w:b w:val="0"/>
+          <w:color w:val="000000"/>
+          <w:sz w:val="22"/>
+        </w:rPr>
+        <w:t>6.2 Partner Portal (candidate franchisee)</w:t>
+      </w:r>
+    </w:p>
+    <w:p>
+      <w:pPr>
+        <w:spacing w:after="40"/>
+        <w:ind w:left="454"/>
+        <w:jc w:val="left"/>
+      </w:pPr>
+      <w:r>
+        <w:rPr>
+          <w:rFonts w:ascii="Arial" w:hAnsi="Arial" w:cs="Arial" w:eastAsia="Arial"/>
+          <w:b w:val="0"/>
+          <w:color w:val="000000"/>
+          <w:sz w:val="22"/>
+        </w:rPr>
+        <w:t>6.3 Target design</w:t>
+      </w:r>
+    </w:p>
+    <w:p>
+      <w:pPr>
+        <w:spacing w:after="40"/>
+        <w:jc w:val="left"/>
+      </w:pPr>
+      <w:r>
+        <w:rPr>
+          <w:rFonts w:ascii="Arial" w:hAnsi="Arial" w:cs="Arial" w:eastAsia="Arial"/>
+          <w:b/>
+          <w:color w:val="000000"/>
+          <w:sz w:val="22"/>
+        </w:rPr>
+        <w:t>7. Prioritization (MoSCoW)</w:t>
+      </w:r>
+    </w:p>
+    <w:p>
+      <w:pPr>
+        <w:spacing w:after="40"/>
+        <w:jc w:val="left"/>
+      </w:pPr>
+      <w:r>
+        <w:rPr>
+          <w:rFonts w:ascii="Arial" w:hAnsi="Arial" w:cs="Arial" w:eastAsia="Arial"/>
+          <w:b/>
+          <w:color w:val="000000"/>
+          <w:sz w:val="22"/>
+        </w:rPr>
+        <w:t>8. Non-Functional Requirements</w:t>
+      </w:r>
+    </w:p>
+    <w:p>
+      <w:pPr>
+        <w:spacing w:after="40"/>
+        <w:jc w:val="left"/>
+      </w:pPr>
+      <w:r>
+        <w:rPr>
+          <w:rFonts w:ascii="Arial" w:hAnsi="Arial" w:cs="Arial" w:eastAsia="Arial"/>
+          <w:b/>
+          <w:color w:val="000000"/>
+          <w:sz w:val="22"/>
+        </w:rPr>
+        <w:t>9. Prototype Limitations</w:t>
+      </w:r>
+    </w:p>
+    <w:p>
+      <w:pPr>
+        <w:spacing w:after="40"/>
+        <w:jc w:val="left"/>
+      </w:pPr>
+      <w:r>
+        <w:rPr>
+          <w:rFonts w:ascii="Arial" w:hAnsi="Arial" w:cs="Arial" w:eastAsia="Arial"/>
+          <w:b/>
+          <w:color w:val="000000"/>
+          <w:sz w:val="22"/>
+        </w:rPr>
+        <w:t>10. Roadmap</w:t>
+      </w:r>
+    </w:p>
+    <w:p>
+      <w:pPr>
+        <w:spacing w:after="40"/>
+        <w:jc w:val="left"/>
+      </w:pPr>
+      <w:r>
+        <w:rPr>
+          <w:rFonts w:ascii="Arial" w:hAnsi="Arial" w:cs="Arial" w:eastAsia="Arial"/>
+          <w:b/>
+          <w:color w:val="000000"/>
+          <w:sz w:val="22"/>
+        </w:rPr>
+        <w:t>11. Risks and Open Questions</w:t>
+      </w:r>
+    </w:p>
+    <w:p>
+      <w:pPr>
+        <w:spacing w:after="40"/>
+        <w:jc w:val="left"/>
+      </w:pPr>
+      <w:r>
+        <w:rPr>
+          <w:rFonts w:ascii="Arial" w:hAnsi="Arial" w:cs="Arial" w:eastAsia="Arial"/>
+          <w:b/>
+          <w:color w:val="000000"/>
+          <w:sz w:val="22"/>
+        </w:rPr>
+        <w:t>12. Use of AI During This Project</w:t>
+      </w:r>
+    </w:p>
+    <w:p>
+      <w:pPr>
+        <w:spacing w:after="40"/>
+        <w:jc w:val="left"/>
+      </w:pPr>
+      <w:r>
+        <w:rPr>
+          <w:rFonts w:ascii="Arial" w:hAnsi="Arial" w:cs="Arial" w:eastAsia="Arial"/>
+          <w:b/>
+          <w:color w:val="000000"/>
+          <w:sz w:val="22"/>
+        </w:rPr>
+        <w:t>References</w:t>
+      </w:r>
+    </w:p>
+    <w:p>
+      <w:pPr>
+        <w:spacing w:after="40"/>
+        <w:jc w:val="left"/>
+      </w:pPr>
+      <w:r>
+        <w:rPr>
+          <w:rFonts w:ascii="Arial" w:hAnsi="Arial" w:cs="Arial" w:eastAsia="Arial"/>
+          <w:b/>
+          <w:color w:val="000000"/>
+          <w:sz w:val="22"/>
+        </w:rPr>
+        <w:t>Appendix: AI Conversation Screenshots</w:t>
+      </w:r>
+    </w:p>
+    <w:p>
+      <w:r>
+        <w:br w:type="page"/>
       </w:r>
     </w:p>
     <w:p>
@@ -69,7 +464,78 @@
           <w:color w:val="000000"/>
           <w:sz w:val="26"/>
         </w:rPr>
-        <w:t>1. Summary</w:t>
+        <w:t>1. Executive Summary</w:t>
+      </w:r>
+    </w:p>
+    <w:p>
+      <w:pPr>
+        <w:jc w:val="both"/>
+      </w:pPr>
+      <w:r>
+        <w:rPr>
+          <w:rFonts w:ascii="Arial" w:hAnsi="Arial" w:cs="Arial" w:eastAsia="Arial"/>
+          <w:b/>
+          <w:color w:val="000000"/>
+          <w:sz w:val="22"/>
+        </w:rPr>
+        <w:t>Kopi Koma Partner Portal</w:t>
+      </w:r>
+      <w:r>
+        <w:rPr>
+          <w:rFonts w:ascii="Arial" w:hAnsi="Arial" w:cs="Arial" w:eastAsia="Arial"/>
+          <w:b w:val="0"/>
+          <w:color w:val="000000"/>
+          <w:sz w:val="22"/>
+        </w:rPr>
+        <w:t xml:space="preserve"> is a web application that digitalizes and centralizes the partnership process between Kopi Koma (fictitious name), a local coffee franchisor, and its candidate franchisees, from the first application until the partnership is approved by both parties. The product consists of two connected applications:</w:t>
+      </w:r>
+    </w:p>
+    <w:p>
+      <w:pPr>
+        <w:pStyle w:val="ListBullet"/>
+        <w:jc w:val="both"/>
+      </w:pPr>
+      <w:r>
+        <w:rPr>
+          <w:rFonts w:ascii="Arial" w:hAnsi="Arial" w:cs="Arial" w:eastAsia="Arial"/>
+          <w:b/>
+          <w:color w:val="000000"/>
+          <w:sz w:val="22"/>
+        </w:rPr>
+        <w:t>Franchisor Dashboard</w:t>
+      </w:r>
+      <w:r>
+        <w:rPr>
+          <w:rFonts w:ascii="Arial" w:hAnsi="Arial" w:cs="Arial" w:eastAsia="Arial"/>
+          <w:b w:val="0"/>
+          <w:color w:val="000000"/>
+          <w:sz w:val="22"/>
+        </w:rPr>
+        <w:t>: used by the internal team (Sales, Reviewer, Manager, Super Admin) to capture and assign leads, process each stage of the 8-stage pipeline, give final approval, and monitor sales targets.</w:t>
+      </w:r>
+    </w:p>
+    <w:p>
+      <w:pPr>
+        <w:pStyle w:val="ListBullet"/>
+        <w:jc w:val="both"/>
+      </w:pPr>
+      <w:r>
+        <w:rPr>
+          <w:rFonts w:ascii="Arial" w:hAnsi="Arial" w:cs="Arial" w:eastAsia="Arial"/>
+          <w:b/>
+          <w:color w:val="000000"/>
+          <w:sz w:val="22"/>
+        </w:rPr>
+        <w:t>Partner Portal</w:t>
+      </w:r>
+      <w:r>
+        <w:rPr>
+          <w:rFonts w:ascii="Arial" w:hAnsi="Arial" w:cs="Arial" w:eastAsia="Arial"/>
+          <w:b w:val="0"/>
+          <w:color w:val="000000"/>
+          <w:sz w:val="22"/>
+        </w:rPr>
+        <w:t>: used by candidate franchisees to register, track the status of their application, and respond to quotations.</w:t>
       </w:r>
     </w:p>
     <w:p>
@@ -83,7 +549,7 @@
           <w:color w:val="000000"/>
           <w:sz w:val="22"/>
         </w:rPr>
-        <w:t>Kopi Koma Partner Portal is a web platform that digitalizes the partnership process between a coffee franchisor and its candidate franchisees, from the first application until the partnership is approved by both parties. It consists of two connected applications: an internal dashboard for the franchisor team (Sales, Reviewer, Manager, Super Admin) and a Partner Portal for candidate franchisees. Every application moves through one shared 8-stage pipeline with a clear owner and deadline per stage. Reminders are sent automatically when a deadline is missed, and every action is recorded in an audit trail.</w:t>
+        <w:t>This product addresses three core pain points: leads scattered across WhatsApp chats and personal spreadsheets with no central record; applications that get stuck because no stage has a clear owner or deadline; and quotations and approvals negotiated by chat with no traceable agreement.</w:t>
       </w:r>
     </w:p>
     <w:p>
@@ -97,7 +563,76 @@
           <w:color w:val="000000"/>
           <w:sz w:val="22"/>
         </w:rPr>
-        <w:t>The goal is simple: no lead is forgotten, every candidate knows the status of their application, and management can see at any time whether the expansion target is on track.</w:t>
+        <w:t>Activities after both parties approve, such as signing the franchise agreement, opening the outlet, and collecting royalty, are out of scope. Signing the agreement through Privy (electronic signature) is referenced only as the next step after approval.</w:t>
+      </w:r>
+    </w:p>
+    <w:p>
+      <w:pPr>
+        <w:jc w:val="both"/>
+      </w:pPr>
+      <w:r>
+        <w:rPr>
+          <w:rFonts w:ascii="Arial" w:hAnsi="Arial" w:cs="Arial" w:eastAsia="Arial"/>
+          <w:b/>
+          <w:color w:val="000000"/>
+          <w:sz w:val="22"/>
+        </w:rPr>
+        <w:t>Prototype (Franchisor Dashboard):</w:t>
+      </w:r>
+      <w:r>
+        <w:rPr>
+          <w:rFonts w:ascii="Arial" w:hAnsi="Arial" w:cs="Arial" w:eastAsia="Arial"/>
+          <w:b w:val="0"/>
+          <w:color w:val="000000"/>
+          <w:sz w:val="22"/>
+        </w:rPr>
+        <w:t xml:space="preserve"> https://kopikomapartnerportal.vercel.app</w:t>
+      </w:r>
+    </w:p>
+    <w:p>
+      <w:pPr>
+        <w:jc w:val="both"/>
+      </w:pPr>
+      <w:r>
+        <w:rPr>
+          <w:rFonts w:ascii="Arial" w:hAnsi="Arial" w:cs="Arial" w:eastAsia="Arial"/>
+          <w:b/>
+          <w:color w:val="000000"/>
+          <w:sz w:val="22"/>
+        </w:rPr>
+        <w:t>Prototype (Partner Portal):</w:t>
+      </w:r>
+      <w:r>
+        <w:rPr>
+          <w:rFonts w:ascii="Arial" w:hAnsi="Arial" w:cs="Arial" w:eastAsia="Arial"/>
+          <w:b w:val="0"/>
+          <w:color w:val="000000"/>
+          <w:sz w:val="22"/>
+        </w:rPr>
+        <w:t xml:space="preserve"> https://kopikomapartnerportal.vercel.app/mitra</w:t>
+      </w:r>
+    </w:p>
+    <w:p>
+      <w:pPr>
+        <w:jc w:val="both"/>
+      </w:pPr>
+      <w:r>
+        <w:rPr>
+          <w:rFonts w:ascii="Arial" w:hAnsi="Arial" w:cs="Arial" w:eastAsia="Arial"/>
+          <w:b/>
+          <w:color w:val="000000"/>
+          <w:sz w:val="22"/>
+        </w:rPr>
+        <w:t>Demo password:</w:t>
+      </w:r>
+      <w:r>
+        <w:rPr>
+          <w:rFonts w:ascii="Arial" w:hAnsi="Arial" w:cs="Arial" w:eastAsia="Arial"/>
+          <w:b w:val="0"/>
+          <w:color w:val="000000"/>
+          <w:sz w:val="22"/>
+        </w:rPr>
+        <w:t xml:space="preserve"> demo123 (all staff accounts are listed on the login page)</w:t>
       </w:r>
     </w:p>
     <w:p>
@@ -1254,6 +1789,1174 @@
                 <w:sz w:val="22"/>
               </w:rPr>
               <w:t>Legal risk under the franchise regulation (PP No. 35/2024) [5] and the Personal Data Protection Law (UU PDP No. 27/2022) [6].</w:t>
+            </w:r>
+          </w:p>
+        </w:tc>
+      </w:tr>
+    </w:tbl>
+    <w:p>
+      <w:pPr>
+        <w:spacing w:after="0"/>
+      </w:pPr>
+    </w:p>
+    <w:p>
+      <w:pPr>
+        <w:pStyle w:val="Heading2"/>
+      </w:pPr>
+      <w:r>
+        <w:rPr>
+          <w:rFonts w:ascii="Arial" w:hAnsi="Arial" w:cs="Arial" w:eastAsia="Arial"/>
+          <w:b/>
+          <w:color w:val="000000"/>
+          <w:sz w:val="23"/>
+        </w:rPr>
+        <w:t>2.4 Current process vs proposed system</w:t>
+      </w:r>
+    </w:p>
+    <w:p>
+      <w:pPr>
+        <w:jc w:val="both"/>
+      </w:pPr>
+      <w:r>
+        <w:rPr>
+          <w:rFonts w:ascii="Arial" w:hAnsi="Arial" w:cs="Arial" w:eastAsia="Arial"/>
+          <w:b w:val="0"/>
+          <w:color w:val="000000"/>
+          <w:sz w:val="22"/>
+        </w:rPr>
+        <w:t>The table below compares what the franchisor team and candidates can do today with the manual process against what they can do with the proposed system.</w:t>
+      </w:r>
+    </w:p>
+    <w:tbl>
+      <w:tblPr>
+        <w:tblStyle w:val="TableGrid"/>
+        <w:tblW w:type="auto" w:w="0"/>
+        <w:tblLook w:firstColumn="1" w:firstRow="1" w:lastColumn="0" w:lastRow="0" w:noHBand="0" w:noVBand="1" w:val="04A0"/>
+      </w:tblPr>
+      <w:tblGrid>
+        <w:gridCol w:w="2436"/>
+        <w:gridCol w:w="2436"/>
+        <w:gridCol w:w="2436"/>
+        <w:gridCol w:w="2436"/>
+      </w:tblGrid>
+      <w:tr>
+        <w:tc>
+          <w:tcPr>
+            <w:tcW w:type="dxa" w:w="2381"/>
+            <w:shd w:val="clear" w:color="auto" w:fill="E7E2DA"/>
+          </w:tcPr>
+          <w:p>
+            <w:pPr>
+              <w:spacing w:after="0"/>
+              <w:jc w:val="left"/>
+            </w:pPr>
+            <w:r/>
+            <w:r>
+              <w:rPr>
+                <w:rFonts w:ascii="Arial" w:hAnsi="Arial" w:cs="Arial" w:eastAsia="Arial"/>
+                <w:b/>
+                <w:color w:val="000000"/>
+                <w:sz w:val="22"/>
+              </w:rPr>
+              <w:t>Capability</w:t>
+            </w:r>
+          </w:p>
+        </w:tc>
+        <w:tc>
+          <w:tcPr>
+            <w:tcW w:type="dxa" w:w="1644"/>
+            <w:shd w:val="clear" w:color="auto" w:fill="E7E2DA"/>
+          </w:tcPr>
+          <w:p>
+            <w:pPr>
+              <w:spacing w:after="0"/>
+              <w:jc w:val="center"/>
+            </w:pPr>
+            <w:r/>
+            <w:r>
+              <w:rPr>
+                <w:rFonts w:ascii="Arial" w:hAnsi="Arial" w:cs="Arial" w:eastAsia="Arial"/>
+                <w:b/>
+                <w:color w:val="000000"/>
+                <w:sz w:val="22"/>
+              </w:rPr>
+              <w:t>Manual (current)</w:t>
+            </w:r>
+          </w:p>
+        </w:tc>
+        <w:tc>
+          <w:tcPr>
+            <w:tcW w:type="dxa" w:w="964"/>
+            <w:shd w:val="clear" w:color="auto" w:fill="E7E2DA"/>
+          </w:tcPr>
+          <w:p>
+            <w:pPr>
+              <w:spacing w:after="0"/>
+              <w:jc w:val="center"/>
+            </w:pPr>
+            <w:r/>
+            <w:r>
+              <w:rPr>
+                <w:rFonts w:ascii="Arial" w:hAnsi="Arial" w:cs="Arial" w:eastAsia="Arial"/>
+                <w:b/>
+                <w:color w:val="000000"/>
+                <w:sz w:val="22"/>
+              </w:rPr>
+              <w:t>System</w:t>
+            </w:r>
+          </w:p>
+        </w:tc>
+        <w:tc>
+          <w:tcPr>
+            <w:tcW w:type="dxa" w:w="4422"/>
+            <w:shd w:val="clear" w:color="auto" w:fill="E7E2DA"/>
+          </w:tcPr>
+          <w:p>
+            <w:pPr>
+              <w:spacing w:after="0"/>
+              <w:jc w:val="left"/>
+            </w:pPr>
+            <w:r/>
+            <w:r>
+              <w:rPr>
+                <w:rFonts w:ascii="Arial" w:hAnsi="Arial" w:cs="Arial" w:eastAsia="Arial"/>
+                <w:b/>
+                <w:color w:val="000000"/>
+                <w:sz w:val="22"/>
+              </w:rPr>
+              <w:t>Notes</w:t>
+            </w:r>
+          </w:p>
+        </w:tc>
+      </w:tr>
+      <w:tr>
+        <w:tc>
+          <w:tcPr>
+            <w:tcW w:type="dxa" w:w="2381"/>
+          </w:tcPr>
+          <w:p>
+            <w:pPr>
+              <w:spacing w:after="0"/>
+              <w:jc w:val="left"/>
+            </w:pPr>
+            <w:r/>
+            <w:r>
+              <w:rPr>
+                <w:rFonts w:ascii="Arial" w:hAnsi="Arial" w:cs="Arial" w:eastAsia="Arial"/>
+                <w:b w:val="0"/>
+                <w:color w:val="000000"/>
+                <w:sz w:val="22"/>
+              </w:rPr>
+              <w:t>Capture leads from all channels in one place</w:t>
+            </w:r>
+          </w:p>
+        </w:tc>
+        <w:tc>
+          <w:tcPr>
+            <w:tcW w:type="dxa" w:w="1644"/>
+          </w:tcPr>
+          <w:p>
+            <w:pPr>
+              <w:spacing w:after="0"/>
+              <w:jc w:val="center"/>
+            </w:pPr>
+            <w:r/>
+            <w:r>
+              <w:rPr>
+                <w:rFonts w:ascii="Arial" w:hAnsi="Arial" w:cs="Arial" w:eastAsia="Arial"/>
+                <w:b w:val="0"/>
+                <w:color w:val="000000"/>
+                <w:sz w:val="22"/>
+              </w:rPr>
+              <w:t>⚠️ Limited</w:t>
+            </w:r>
+          </w:p>
+        </w:tc>
+        <w:tc>
+          <w:tcPr>
+            <w:tcW w:type="dxa" w:w="964"/>
+          </w:tcPr>
+          <w:p>
+            <w:pPr>
+              <w:spacing w:after="0"/>
+              <w:jc w:val="center"/>
+            </w:pPr>
+            <w:r/>
+            <w:r>
+              <w:rPr>
+                <w:rFonts w:ascii="Arial" w:hAnsi="Arial" w:cs="Arial" w:eastAsia="Arial"/>
+                <w:b w:val="0"/>
+                <w:color w:val="000000"/>
+                <w:sz w:val="22"/>
+              </w:rPr>
+              <w:t>✅</w:t>
+            </w:r>
+          </w:p>
+        </w:tc>
+        <w:tc>
+          <w:tcPr>
+            <w:tcW w:type="dxa" w:w="4422"/>
+          </w:tcPr>
+          <w:p>
+            <w:pPr>
+              <w:spacing w:after="0"/>
+              <w:jc w:val="left"/>
+            </w:pPr>
+            <w:r/>
+            <w:r>
+              <w:rPr>
+                <w:rFonts w:ascii="Arial" w:hAnsi="Arial" w:cs="Arial" w:eastAsia="Arial"/>
+                <w:b w:val="0"/>
+                <w:color w:val="000000"/>
+                <w:sz w:val="22"/>
+              </w:rPr>
+              <w:t>Leads are currently scattered in each sales' WhatsApp and spreadsheets. The system stores every lead, from sales input or portal registration, in one pipeline.</w:t>
+            </w:r>
+          </w:p>
+        </w:tc>
+      </w:tr>
+      <w:tr>
+        <w:tc>
+          <w:tcPr>
+            <w:tcW w:type="dxa" w:w="2381"/>
+          </w:tcPr>
+          <w:p>
+            <w:pPr>
+              <w:spacing w:after="0"/>
+              <w:jc w:val="left"/>
+            </w:pPr>
+            <w:r/>
+            <w:r>
+              <w:rPr>
+                <w:rFonts w:ascii="Arial" w:hAnsi="Arial" w:cs="Arial" w:eastAsia="Arial"/>
+                <w:b w:val="0"/>
+                <w:color w:val="000000"/>
+                <w:sz w:val="22"/>
+              </w:rPr>
+              <w:t>Assign leads to sales by region and detect duplicates</w:t>
+            </w:r>
+          </w:p>
+        </w:tc>
+        <w:tc>
+          <w:tcPr>
+            <w:tcW w:type="dxa" w:w="1644"/>
+          </w:tcPr>
+          <w:p>
+            <w:pPr>
+              <w:spacing w:after="0"/>
+              <w:jc w:val="center"/>
+            </w:pPr>
+            <w:r/>
+            <w:r>
+              <w:rPr>
+                <w:rFonts w:ascii="Arial" w:hAnsi="Arial" w:cs="Arial" w:eastAsia="Arial"/>
+                <w:b w:val="0"/>
+                <w:color w:val="000000"/>
+                <w:sz w:val="22"/>
+              </w:rPr>
+              <w:t>❌ Not available</w:t>
+            </w:r>
+          </w:p>
+        </w:tc>
+        <w:tc>
+          <w:tcPr>
+            <w:tcW w:type="dxa" w:w="964"/>
+          </w:tcPr>
+          <w:p>
+            <w:pPr>
+              <w:spacing w:after="0"/>
+              <w:jc w:val="center"/>
+            </w:pPr>
+            <w:r/>
+            <w:r>
+              <w:rPr>
+                <w:rFonts w:ascii="Arial" w:hAnsi="Arial" w:cs="Arial" w:eastAsia="Arial"/>
+                <w:b w:val="0"/>
+                <w:color w:val="000000"/>
+                <w:sz w:val="22"/>
+              </w:rPr>
+              <w:t>✅</w:t>
+            </w:r>
+          </w:p>
+        </w:tc>
+        <w:tc>
+          <w:tcPr>
+            <w:tcW w:type="dxa" w:w="4422"/>
+          </w:tcPr>
+          <w:p>
+            <w:pPr>
+              <w:spacing w:after="0"/>
+              <w:jc w:val="left"/>
+            </w:pPr>
+            <w:r/>
+            <w:r>
+              <w:rPr>
+                <w:rFonts w:ascii="Arial" w:hAnsi="Arial" w:cs="Arial" w:eastAsia="Arial"/>
+                <w:b w:val="0"/>
+                <w:color w:val="000000"/>
+                <w:sz w:val="22"/>
+              </w:rPr>
+              <w:t>The Manager currently forwards leads by chat, and two sales can contact the same person. The system assigns portal leads by region and flags duplicates and full sales capacity.</w:t>
+            </w:r>
+          </w:p>
+        </w:tc>
+      </w:tr>
+      <w:tr>
+        <w:tc>
+          <w:tcPr>
+            <w:tcW w:type="dxa" w:w="2381"/>
+          </w:tcPr>
+          <w:p>
+            <w:pPr>
+              <w:spacing w:after="0"/>
+              <w:jc w:val="left"/>
+            </w:pPr>
+            <w:r/>
+            <w:r>
+              <w:rPr>
+                <w:rFonts w:ascii="Arial" w:hAnsi="Arial" w:cs="Arial" w:eastAsia="Arial"/>
+                <w:b w:val="0"/>
+                <w:color w:val="000000"/>
+                <w:sz w:val="22"/>
+              </w:rPr>
+              <w:t>See the stage and owner of every application</w:t>
+            </w:r>
+          </w:p>
+        </w:tc>
+        <w:tc>
+          <w:tcPr>
+            <w:tcW w:type="dxa" w:w="1644"/>
+          </w:tcPr>
+          <w:p>
+            <w:pPr>
+              <w:spacing w:after="0"/>
+              <w:jc w:val="center"/>
+            </w:pPr>
+            <w:r/>
+            <w:r>
+              <w:rPr>
+                <w:rFonts w:ascii="Arial" w:hAnsi="Arial" w:cs="Arial" w:eastAsia="Arial"/>
+                <w:b w:val="0"/>
+                <w:color w:val="000000"/>
+                <w:sz w:val="22"/>
+              </w:rPr>
+              <w:t>⚠️ Limited</w:t>
+            </w:r>
+          </w:p>
+        </w:tc>
+        <w:tc>
+          <w:tcPr>
+            <w:tcW w:type="dxa" w:w="964"/>
+          </w:tcPr>
+          <w:p>
+            <w:pPr>
+              <w:spacing w:after="0"/>
+              <w:jc w:val="center"/>
+            </w:pPr>
+            <w:r/>
+            <w:r>
+              <w:rPr>
+                <w:rFonts w:ascii="Arial" w:hAnsi="Arial" w:cs="Arial" w:eastAsia="Arial"/>
+                <w:b w:val="0"/>
+                <w:color w:val="000000"/>
+                <w:sz w:val="22"/>
+              </w:rPr>
+              <w:t>✅</w:t>
+            </w:r>
+          </w:p>
+        </w:tc>
+        <w:tc>
+          <w:tcPr>
+            <w:tcW w:type="dxa" w:w="4422"/>
+          </w:tcPr>
+          <w:p>
+            <w:pPr>
+              <w:spacing w:after="0"/>
+              <w:jc w:val="left"/>
+            </w:pPr>
+            <w:r/>
+            <w:r>
+              <w:rPr>
+                <w:rFonts w:ascii="Arial" w:hAnsi="Arial" w:cs="Arial" w:eastAsia="Arial"/>
+                <w:b w:val="0"/>
+                <w:color w:val="000000"/>
+                <w:sz w:val="22"/>
+              </w:rPr>
+              <w:t>The Manager has to ask each sales. The system shows every application on a pipeline board with its current PIC and days waiting.</w:t>
+            </w:r>
+          </w:p>
+        </w:tc>
+      </w:tr>
+      <w:tr>
+        <w:tc>
+          <w:tcPr>
+            <w:tcW w:type="dxa" w:w="2381"/>
+          </w:tcPr>
+          <w:p>
+            <w:pPr>
+              <w:spacing w:after="0"/>
+              <w:jc w:val="left"/>
+            </w:pPr>
+            <w:r/>
+            <w:r>
+              <w:rPr>
+                <w:rFonts w:ascii="Arial" w:hAnsi="Arial" w:cs="Arial" w:eastAsia="Arial"/>
+                <w:b w:val="0"/>
+                <w:color w:val="000000"/>
+                <w:sz w:val="22"/>
+              </w:rPr>
+              <w:t>Track deadlines and send reminders</w:t>
+            </w:r>
+          </w:p>
+        </w:tc>
+        <w:tc>
+          <w:tcPr>
+            <w:tcW w:type="dxa" w:w="1644"/>
+          </w:tcPr>
+          <w:p>
+            <w:pPr>
+              <w:spacing w:after="0"/>
+              <w:jc w:val="center"/>
+            </w:pPr>
+            <w:r/>
+            <w:r>
+              <w:rPr>
+                <w:rFonts w:ascii="Arial" w:hAnsi="Arial" w:cs="Arial" w:eastAsia="Arial"/>
+                <w:b w:val="0"/>
+                <w:color w:val="000000"/>
+                <w:sz w:val="22"/>
+              </w:rPr>
+              <w:t>❌ Not available</w:t>
+            </w:r>
+          </w:p>
+        </w:tc>
+        <w:tc>
+          <w:tcPr>
+            <w:tcW w:type="dxa" w:w="964"/>
+          </w:tcPr>
+          <w:p>
+            <w:pPr>
+              <w:spacing w:after="0"/>
+              <w:jc w:val="center"/>
+            </w:pPr>
+            <w:r/>
+            <w:r>
+              <w:rPr>
+                <w:rFonts w:ascii="Arial" w:hAnsi="Arial" w:cs="Arial" w:eastAsia="Arial"/>
+                <w:b w:val="0"/>
+                <w:color w:val="000000"/>
+                <w:sz w:val="22"/>
+              </w:rPr>
+              <w:t>✅</w:t>
+            </w:r>
+          </w:p>
+        </w:tc>
+        <w:tc>
+          <w:tcPr>
+            <w:tcW w:type="dxa" w:w="4422"/>
+          </w:tcPr>
+          <w:p>
+            <w:pPr>
+              <w:spacing w:after="0"/>
+              <w:jc w:val="left"/>
+            </w:pPr>
+            <w:r/>
+            <w:r>
+              <w:rPr>
+                <w:rFonts w:ascii="Arial" w:hAnsi="Arial" w:cs="Arial" w:eastAsia="Arial"/>
+                <w:b w:val="0"/>
+                <w:color w:val="000000"/>
+                <w:sz w:val="22"/>
+              </w:rPr>
+              <w:t>Nothing tells the team when an application has been stuck too long. The system sends automatic reminders to the PIC and Manager when a stage passes its deadline.</w:t>
+            </w:r>
+          </w:p>
+        </w:tc>
+      </w:tr>
+      <w:tr>
+        <w:tc>
+          <w:tcPr>
+            <w:tcW w:type="dxa" w:w="2381"/>
+          </w:tcPr>
+          <w:p>
+            <w:pPr>
+              <w:spacing w:after="0"/>
+              <w:jc w:val="left"/>
+            </w:pPr>
+            <w:r/>
+            <w:r>
+              <w:rPr>
+                <w:rFonts w:ascii="Arial" w:hAnsi="Arial" w:cs="Arial" w:eastAsia="Arial"/>
+                <w:b w:val="0"/>
+                <w:color w:val="000000"/>
+                <w:sz w:val="22"/>
+              </w:rPr>
+              <w:t>Record prospectus delivery (PP No. 35/2024)</w:t>
+            </w:r>
+          </w:p>
+        </w:tc>
+        <w:tc>
+          <w:tcPr>
+            <w:tcW w:type="dxa" w:w="1644"/>
+          </w:tcPr>
+          <w:p>
+            <w:pPr>
+              <w:spacing w:after="0"/>
+              <w:jc w:val="center"/>
+            </w:pPr>
+            <w:r/>
+            <w:r>
+              <w:rPr>
+                <w:rFonts w:ascii="Arial" w:hAnsi="Arial" w:cs="Arial" w:eastAsia="Arial"/>
+                <w:b w:val="0"/>
+                <w:color w:val="000000"/>
+                <w:sz w:val="22"/>
+              </w:rPr>
+              <w:t>⚠️ Limited</w:t>
+            </w:r>
+          </w:p>
+        </w:tc>
+        <w:tc>
+          <w:tcPr>
+            <w:tcW w:type="dxa" w:w="964"/>
+          </w:tcPr>
+          <w:p>
+            <w:pPr>
+              <w:spacing w:after="0"/>
+              <w:jc w:val="center"/>
+            </w:pPr>
+            <w:r/>
+            <w:r>
+              <w:rPr>
+                <w:rFonts w:ascii="Arial" w:hAnsi="Arial" w:cs="Arial" w:eastAsia="Arial"/>
+                <w:b w:val="0"/>
+                <w:color w:val="000000"/>
+                <w:sz w:val="22"/>
+              </w:rPr>
+              <w:t>✅</w:t>
+            </w:r>
+          </w:p>
+        </w:tc>
+        <w:tc>
+          <w:tcPr>
+            <w:tcW w:type="dxa" w:w="4422"/>
+          </w:tcPr>
+          <w:p>
+            <w:pPr>
+              <w:spacing w:after="0"/>
+              <w:jc w:val="left"/>
+            </w:pPr>
+            <w:r/>
+            <w:r>
+              <w:rPr>
+                <w:rFonts w:ascii="Arial" w:hAnsi="Arial" w:cs="Arial" w:eastAsia="Arial"/>
+                <w:b w:val="0"/>
+                <w:color w:val="000000"/>
+                <w:sz w:val="22"/>
+              </w:rPr>
+              <w:t>Delivery is not recorded consistently. The system requires the sales to confirm it and records the date.</w:t>
+            </w:r>
+          </w:p>
+        </w:tc>
+      </w:tr>
+      <w:tr>
+        <w:tc>
+          <w:tcPr>
+            <w:tcW w:type="dxa" w:w="2381"/>
+          </w:tcPr>
+          <w:p>
+            <w:pPr>
+              <w:spacing w:after="0"/>
+              <w:jc w:val="left"/>
+            </w:pPr>
+            <w:r/>
+            <w:r>
+              <w:rPr>
+                <w:rFonts w:ascii="Arial" w:hAnsi="Arial" w:cs="Arial" w:eastAsia="Arial"/>
+                <w:b w:val="0"/>
+                <w:color w:val="000000"/>
+                <w:sz w:val="22"/>
+              </w:rPr>
+              <w:t>Assess candidates and locations consistently</w:t>
+            </w:r>
+          </w:p>
+        </w:tc>
+        <w:tc>
+          <w:tcPr>
+            <w:tcW w:type="dxa" w:w="1644"/>
+          </w:tcPr>
+          <w:p>
+            <w:pPr>
+              <w:spacing w:after="0"/>
+              <w:jc w:val="center"/>
+            </w:pPr>
+            <w:r/>
+            <w:r>
+              <w:rPr>
+                <w:rFonts w:ascii="Arial" w:hAnsi="Arial" w:cs="Arial" w:eastAsia="Arial"/>
+                <w:b w:val="0"/>
+                <w:color w:val="000000"/>
+                <w:sz w:val="22"/>
+              </w:rPr>
+              <w:t>⚠️ Limited</w:t>
+            </w:r>
+          </w:p>
+        </w:tc>
+        <w:tc>
+          <w:tcPr>
+            <w:tcW w:type="dxa" w:w="964"/>
+          </w:tcPr>
+          <w:p>
+            <w:pPr>
+              <w:spacing w:after="0"/>
+              <w:jc w:val="center"/>
+            </w:pPr>
+            <w:r/>
+            <w:r>
+              <w:rPr>
+                <w:rFonts w:ascii="Arial" w:hAnsi="Arial" w:cs="Arial" w:eastAsia="Arial"/>
+                <w:b w:val="0"/>
+                <w:color w:val="000000"/>
+                <w:sz w:val="22"/>
+              </w:rPr>
+              <w:t>✅</w:t>
+            </w:r>
+          </w:p>
+        </w:tc>
+        <w:tc>
+          <w:tcPr>
+            <w:tcW w:type="dxa" w:w="4422"/>
+          </w:tcPr>
+          <w:p>
+            <w:pPr>
+              <w:spacing w:after="0"/>
+              <w:jc w:val="left"/>
+            </w:pPr>
+            <w:r/>
+            <w:r>
+              <w:rPr>
+                <w:rFonts w:ascii="Arial" w:hAnsi="Arial" w:cs="Arial" w:eastAsia="Arial"/>
+                <w:b w:val="0"/>
+                <w:color w:val="000000"/>
+                <w:sz w:val="22"/>
+              </w:rPr>
+              <w:t>Decisions rely on individual judgment. The system uses structured forms per stage and an AI fit score with reasons as a decision aid.</w:t>
+            </w:r>
+          </w:p>
+        </w:tc>
+      </w:tr>
+      <w:tr>
+        <w:tc>
+          <w:tcPr>
+            <w:tcW w:type="dxa" w:w="2381"/>
+          </w:tcPr>
+          <w:p>
+            <w:pPr>
+              <w:spacing w:after="0"/>
+              <w:jc w:val="left"/>
+            </w:pPr>
+            <w:r/>
+            <w:r>
+              <w:rPr>
+                <w:rFonts w:ascii="Arial" w:hAnsi="Arial" w:cs="Arial" w:eastAsia="Arial"/>
+                <w:b w:val="0"/>
+                <w:color w:val="000000"/>
+                <w:sz w:val="22"/>
+              </w:rPr>
+              <w:t>Manage quotation versions and discounts</w:t>
+            </w:r>
+          </w:p>
+        </w:tc>
+        <w:tc>
+          <w:tcPr>
+            <w:tcW w:type="dxa" w:w="1644"/>
+          </w:tcPr>
+          <w:p>
+            <w:pPr>
+              <w:spacing w:after="0"/>
+              <w:jc w:val="center"/>
+            </w:pPr>
+            <w:r/>
+            <w:r>
+              <w:rPr>
+                <w:rFonts w:ascii="Arial" w:hAnsi="Arial" w:cs="Arial" w:eastAsia="Arial"/>
+                <w:b w:val="0"/>
+                <w:color w:val="000000"/>
+                <w:sz w:val="22"/>
+              </w:rPr>
+              <w:t>⚠️ Limited</w:t>
+            </w:r>
+          </w:p>
+        </w:tc>
+        <w:tc>
+          <w:tcPr>
+            <w:tcW w:type="dxa" w:w="964"/>
+          </w:tcPr>
+          <w:p>
+            <w:pPr>
+              <w:spacing w:after="0"/>
+              <w:jc w:val="center"/>
+            </w:pPr>
+            <w:r/>
+            <w:r>
+              <w:rPr>
+                <w:rFonts w:ascii="Arial" w:hAnsi="Arial" w:cs="Arial" w:eastAsia="Arial"/>
+                <w:b w:val="0"/>
+                <w:color w:val="000000"/>
+                <w:sz w:val="22"/>
+              </w:rPr>
+              <w:t>✅</w:t>
+            </w:r>
+          </w:p>
+        </w:tc>
+        <w:tc>
+          <w:tcPr>
+            <w:tcW w:type="dxa" w:w="4422"/>
+          </w:tcPr>
+          <w:p>
+            <w:pPr>
+              <w:spacing w:after="0"/>
+              <w:jc w:val="left"/>
+            </w:pPr>
+            <w:r/>
+            <w:r>
+              <w:rPr>
+                <w:rFonts w:ascii="Arial" w:hAnsi="Arial" w:cs="Arial" w:eastAsia="Arial"/>
+                <w:b w:val="0"/>
+                <w:color w:val="000000"/>
+                <w:sz w:val="22"/>
+              </w:rPr>
+              <w:t>Quotations are revised by chat, so the agreed version is unclear. The system keeps every version and requires the Manager's input for revisions.</w:t>
+            </w:r>
+          </w:p>
+        </w:tc>
+      </w:tr>
+      <w:tr>
+        <w:tc>
+          <w:tcPr>
+            <w:tcW w:type="dxa" w:w="2381"/>
+          </w:tcPr>
+          <w:p>
+            <w:pPr>
+              <w:spacing w:after="0"/>
+              <w:jc w:val="left"/>
+            </w:pPr>
+            <w:r/>
+            <w:r>
+              <w:rPr>
+                <w:rFonts w:ascii="Arial" w:hAnsi="Arial" w:cs="Arial" w:eastAsia="Arial"/>
+                <w:b w:val="0"/>
+                <w:color w:val="000000"/>
+                <w:sz w:val="22"/>
+              </w:rPr>
+              <w:t>Candidate checks application status</w:t>
+            </w:r>
+          </w:p>
+        </w:tc>
+        <w:tc>
+          <w:tcPr>
+            <w:tcW w:type="dxa" w:w="1644"/>
+          </w:tcPr>
+          <w:p>
+            <w:pPr>
+              <w:spacing w:after="0"/>
+              <w:jc w:val="center"/>
+            </w:pPr>
+            <w:r/>
+            <w:r>
+              <w:rPr>
+                <w:rFonts w:ascii="Arial" w:hAnsi="Arial" w:cs="Arial" w:eastAsia="Arial"/>
+                <w:b w:val="0"/>
+                <w:color w:val="000000"/>
+                <w:sz w:val="22"/>
+              </w:rPr>
+              <w:t>❌ Not available</w:t>
+            </w:r>
+          </w:p>
+        </w:tc>
+        <w:tc>
+          <w:tcPr>
+            <w:tcW w:type="dxa" w:w="964"/>
+          </w:tcPr>
+          <w:p>
+            <w:pPr>
+              <w:spacing w:after="0"/>
+              <w:jc w:val="center"/>
+            </w:pPr>
+            <w:r/>
+            <w:r>
+              <w:rPr>
+                <w:rFonts w:ascii="Arial" w:hAnsi="Arial" w:cs="Arial" w:eastAsia="Arial"/>
+                <w:b w:val="0"/>
+                <w:color w:val="000000"/>
+                <w:sz w:val="22"/>
+              </w:rPr>
+              <w:t>✅</w:t>
+            </w:r>
+          </w:p>
+        </w:tc>
+        <w:tc>
+          <w:tcPr>
+            <w:tcW w:type="dxa" w:w="4422"/>
+          </w:tcPr>
+          <w:p>
+            <w:pPr>
+              <w:spacing w:after="0"/>
+              <w:jc w:val="left"/>
+            </w:pPr>
+            <w:r/>
+            <w:r>
+              <w:rPr>
+                <w:rFonts w:ascii="Arial" w:hAnsi="Arial" w:cs="Arial" w:eastAsia="Arial"/>
+                <w:b w:val="0"/>
+                <w:color w:val="000000"/>
+                <w:sz w:val="22"/>
+              </w:rPr>
+              <w:t>Candidates must ask their sales. The Partner Portal shows a 7-step tracker with the assigned sales' contact.</w:t>
+            </w:r>
+          </w:p>
+        </w:tc>
+      </w:tr>
+      <w:tr>
+        <w:tc>
+          <w:tcPr>
+            <w:tcW w:type="dxa" w:w="2381"/>
+          </w:tcPr>
+          <w:p>
+            <w:pPr>
+              <w:spacing w:after="0"/>
+              <w:jc w:val="left"/>
+            </w:pPr>
+            <w:r/>
+            <w:r>
+              <w:rPr>
+                <w:rFonts w:ascii="Arial" w:hAnsi="Arial" w:cs="Arial" w:eastAsia="Arial"/>
+                <w:b w:val="0"/>
+                <w:color w:val="000000"/>
+                <w:sz w:val="22"/>
+              </w:rPr>
+              <w:t>Candidate responds to a quotation with a written record</w:t>
+            </w:r>
+          </w:p>
+        </w:tc>
+        <w:tc>
+          <w:tcPr>
+            <w:tcW w:type="dxa" w:w="1644"/>
+          </w:tcPr>
+          <w:p>
+            <w:pPr>
+              <w:spacing w:after="0"/>
+              <w:jc w:val="center"/>
+            </w:pPr>
+            <w:r/>
+            <w:r>
+              <w:rPr>
+                <w:rFonts w:ascii="Arial" w:hAnsi="Arial" w:cs="Arial" w:eastAsia="Arial"/>
+                <w:b w:val="0"/>
+                <w:color w:val="000000"/>
+                <w:sz w:val="22"/>
+              </w:rPr>
+              <w:t>⚠️ Limited</w:t>
+            </w:r>
+          </w:p>
+        </w:tc>
+        <w:tc>
+          <w:tcPr>
+            <w:tcW w:type="dxa" w:w="964"/>
+          </w:tcPr>
+          <w:p>
+            <w:pPr>
+              <w:spacing w:after="0"/>
+              <w:jc w:val="center"/>
+            </w:pPr>
+            <w:r/>
+            <w:r>
+              <w:rPr>
+                <w:rFonts w:ascii="Arial" w:hAnsi="Arial" w:cs="Arial" w:eastAsia="Arial"/>
+                <w:b w:val="0"/>
+                <w:color w:val="000000"/>
+                <w:sz w:val="22"/>
+              </w:rPr>
+              <w:t>✅</w:t>
+            </w:r>
+          </w:p>
+        </w:tc>
+        <w:tc>
+          <w:tcPr>
+            <w:tcW w:type="dxa" w:w="4422"/>
+          </w:tcPr>
+          <w:p>
+            <w:pPr>
+              <w:spacing w:after="0"/>
+              <w:jc w:val="left"/>
+            </w:pPr>
+            <w:r/>
+            <w:r>
+              <w:rPr>
+                <w:rFonts w:ascii="Arial" w:hAnsi="Arial" w:cs="Arial" w:eastAsia="Arial"/>
+                <w:b w:val="0"/>
+                <w:color w:val="000000"/>
+                <w:sz w:val="22"/>
+              </w:rPr>
+              <w:t>Responses come by chat or phone. In the portal, the candidate agrees with an explicit confirmation, requests changes, or withdraws, and each action is recorded.</w:t>
+            </w:r>
+          </w:p>
+        </w:tc>
+      </w:tr>
+      <w:tr>
+        <w:tc>
+          <w:tcPr>
+            <w:tcW w:type="dxa" w:w="2381"/>
+          </w:tcPr>
+          <w:p>
+            <w:pPr>
+              <w:spacing w:after="0"/>
+              <w:jc w:val="left"/>
+            </w:pPr>
+            <w:r/>
+            <w:r>
+              <w:rPr>
+                <w:rFonts w:ascii="Arial" w:hAnsi="Arial" w:cs="Arial" w:eastAsia="Arial"/>
+                <w:b w:val="0"/>
+                <w:color w:val="000000"/>
+                <w:sz w:val="22"/>
+              </w:rPr>
+              <w:t>Trace two-party approval</w:t>
+            </w:r>
+          </w:p>
+        </w:tc>
+        <w:tc>
+          <w:tcPr>
+            <w:tcW w:type="dxa" w:w="1644"/>
+          </w:tcPr>
+          <w:p>
+            <w:pPr>
+              <w:spacing w:after="0"/>
+              <w:jc w:val="center"/>
+            </w:pPr>
+            <w:r/>
+            <w:r>
+              <w:rPr>
+                <w:rFonts w:ascii="Arial" w:hAnsi="Arial" w:cs="Arial" w:eastAsia="Arial"/>
+                <w:b w:val="0"/>
+                <w:color w:val="000000"/>
+                <w:sz w:val="22"/>
+              </w:rPr>
+              <w:t>⚠️ Limited</w:t>
+            </w:r>
+          </w:p>
+        </w:tc>
+        <w:tc>
+          <w:tcPr>
+            <w:tcW w:type="dxa" w:w="964"/>
+          </w:tcPr>
+          <w:p>
+            <w:pPr>
+              <w:spacing w:after="0"/>
+              <w:jc w:val="center"/>
+            </w:pPr>
+            <w:r/>
+            <w:r>
+              <w:rPr>
+                <w:rFonts w:ascii="Arial" w:hAnsi="Arial" w:cs="Arial" w:eastAsia="Arial"/>
+                <w:b w:val="0"/>
+                <w:color w:val="000000"/>
+                <w:sz w:val="22"/>
+              </w:rPr>
+              <w:t>✅</w:t>
+            </w:r>
+          </w:p>
+        </w:tc>
+        <w:tc>
+          <w:tcPr>
+            <w:tcW w:type="dxa" w:w="4422"/>
+          </w:tcPr>
+          <w:p>
+            <w:pPr>
+              <w:spacing w:after="0"/>
+              <w:jc w:val="left"/>
+            </w:pPr>
+            <w:r/>
+            <w:r>
+              <w:rPr>
+                <w:rFonts w:ascii="Arial" w:hAnsi="Arial" w:cs="Arial" w:eastAsia="Arial"/>
+                <w:b w:val="0"/>
+                <w:color w:val="000000"/>
+                <w:sz w:val="22"/>
+              </w:rPr>
+              <w:t>Approval is scattered across chats. The system records approval 1 of 2 (candidate) and 2 of 2 (Manager) in the audit trail.</w:t>
+            </w:r>
+          </w:p>
+        </w:tc>
+      </w:tr>
+      <w:tr>
+        <w:tc>
+          <w:tcPr>
+            <w:tcW w:type="dxa" w:w="2381"/>
+          </w:tcPr>
+          <w:p>
+            <w:pPr>
+              <w:spacing w:after="0"/>
+              <w:jc w:val="left"/>
+            </w:pPr>
+            <w:r/>
+            <w:r>
+              <w:rPr>
+                <w:rFonts w:ascii="Arial" w:hAnsi="Arial" w:cs="Arial" w:eastAsia="Arial"/>
+                <w:b w:val="0"/>
+                <w:color w:val="000000"/>
+                <w:sz w:val="22"/>
+              </w:rPr>
+              <w:t>Monitor target vs achievement during the period</w:t>
+            </w:r>
+          </w:p>
+        </w:tc>
+        <w:tc>
+          <w:tcPr>
+            <w:tcW w:type="dxa" w:w="1644"/>
+          </w:tcPr>
+          <w:p>
+            <w:pPr>
+              <w:spacing w:after="0"/>
+              <w:jc w:val="center"/>
+            </w:pPr>
+            <w:r/>
+            <w:r>
+              <w:rPr>
+                <w:rFonts w:ascii="Arial" w:hAnsi="Arial" w:cs="Arial" w:eastAsia="Arial"/>
+                <w:b w:val="0"/>
+                <w:color w:val="000000"/>
+                <w:sz w:val="22"/>
+              </w:rPr>
+              <w:t>⚠️ Limited</w:t>
+            </w:r>
+          </w:p>
+        </w:tc>
+        <w:tc>
+          <w:tcPr>
+            <w:tcW w:type="dxa" w:w="964"/>
+          </w:tcPr>
+          <w:p>
+            <w:pPr>
+              <w:spacing w:after="0"/>
+              <w:jc w:val="center"/>
+            </w:pPr>
+            <w:r/>
+            <w:r>
+              <w:rPr>
+                <w:rFonts w:ascii="Arial" w:hAnsi="Arial" w:cs="Arial" w:eastAsia="Arial"/>
+                <w:b w:val="0"/>
+                <w:color w:val="000000"/>
+                <w:sz w:val="22"/>
+              </w:rPr>
+              <w:t>✅</w:t>
+            </w:r>
+          </w:p>
+        </w:tc>
+        <w:tc>
+          <w:tcPr>
+            <w:tcW w:type="dxa" w:w="4422"/>
+          </w:tcPr>
+          <w:p>
+            <w:pPr>
+              <w:spacing w:after="0"/>
+              <w:jc w:val="left"/>
+            </w:pPr>
+            <w:r/>
+            <w:r>
+              <w:rPr>
+                <w:rFonts w:ascii="Arial" w:hAnsi="Arial" w:cs="Arial" w:eastAsia="Arial"/>
+                <w:b w:val="0"/>
+                <w:color w:val="000000"/>
+                <w:sz w:val="22"/>
+              </w:rPr>
+              <w:t>Targets are checked in a spreadsheet at the end of the month. The system shows achievement against the target to date, per sales and per package.</w:t>
+            </w:r>
+          </w:p>
+        </w:tc>
+      </w:tr>
+      <w:tr>
+        <w:tc>
+          <w:tcPr>
+            <w:tcW w:type="dxa" w:w="2381"/>
+          </w:tcPr>
+          <w:p>
+            <w:pPr>
+              <w:spacing w:after="0"/>
+              <w:jc w:val="left"/>
+            </w:pPr>
+            <w:r/>
+            <w:r>
+              <w:rPr>
+                <w:rFonts w:ascii="Arial" w:hAnsi="Arial" w:cs="Arial" w:eastAsia="Arial"/>
+                <w:b w:val="0"/>
+                <w:color w:val="000000"/>
+                <w:sz w:val="22"/>
+              </w:rPr>
+              <w:t>Keep an audit trail and document access log (UU PDP)</w:t>
+            </w:r>
+          </w:p>
+        </w:tc>
+        <w:tc>
+          <w:tcPr>
+            <w:tcW w:type="dxa" w:w="1644"/>
+          </w:tcPr>
+          <w:p>
+            <w:pPr>
+              <w:spacing w:after="0"/>
+              <w:jc w:val="center"/>
+            </w:pPr>
+            <w:r/>
+            <w:r>
+              <w:rPr>
+                <w:rFonts w:ascii="Arial" w:hAnsi="Arial" w:cs="Arial" w:eastAsia="Arial"/>
+                <w:b w:val="0"/>
+                <w:color w:val="000000"/>
+                <w:sz w:val="22"/>
+              </w:rPr>
+              <w:t>❌ Not available</w:t>
+            </w:r>
+          </w:p>
+        </w:tc>
+        <w:tc>
+          <w:tcPr>
+            <w:tcW w:type="dxa" w:w="964"/>
+          </w:tcPr>
+          <w:p>
+            <w:pPr>
+              <w:spacing w:after="0"/>
+              <w:jc w:val="center"/>
+            </w:pPr>
+            <w:r/>
+            <w:r>
+              <w:rPr>
+                <w:rFonts w:ascii="Arial" w:hAnsi="Arial" w:cs="Arial" w:eastAsia="Arial"/>
+                <w:b w:val="0"/>
+                <w:color w:val="000000"/>
+                <w:sz w:val="22"/>
+              </w:rPr>
+              <w:t>✅</w:t>
+            </w:r>
+          </w:p>
+        </w:tc>
+        <w:tc>
+          <w:tcPr>
+            <w:tcW w:type="dxa" w:w="4422"/>
+          </w:tcPr>
+          <w:p>
+            <w:pPr>
+              <w:spacing w:after="0"/>
+              <w:jc w:val="left"/>
+            </w:pPr>
+            <w:r/>
+            <w:r>
+              <w:rPr>
+                <w:rFonts w:ascii="Arial" w:hAnsi="Arial" w:cs="Arial" w:eastAsia="Arial"/>
+                <w:b w:val="0"/>
+                <w:color w:val="000000"/>
+                <w:sz w:val="22"/>
+              </w:rPr>
+              <w:t>There is no record of who saw candidate data. The system logs every action and document access.</w:t>
             </w:r>
           </w:p>
         </w:tc>

</xml_diff>

<commit_message>
PRD: add business impact section
Co-Authored-By: Claude Opus 5.5 <noreply@anthropic.com>
Claude-Session: https://claude.ai/code/session_01MyaJcnNN6cea99ff9yeVti
</commit_message>
<xml_diff>
--- a/prd/EDTS APM 2027 - Nadia Rahma Prasanti - Universitas Indonesia.docx
+++ b/prd/EDTS APM 2027 - Nadia Rahma Prasanti - Universitas Indonesia.docx
@@ -108,6 +108,22 @@
           <w:sz w:val="22"/>
         </w:rPr>
         <w:t>Human vs System</w:t>
+      </w:r>
+    </w:p>
+    <w:p>
+      <w:pPr>
+        <w:pStyle w:val="ListBullet"/>
+        <w:spacing w:after="0"/>
+        <w:jc w:val="left"/>
+      </w:pPr>
+      <w:r>
+        <w:rPr>
+          <w:rFonts w:ascii="Arial" w:hAnsi="Arial" w:cs="Arial" w:eastAsia="Arial"/>
+          <w:b w:val="0"/>
+          <w:color w:val="000000"/>
+          <w:sz w:val="22"/>
+        </w:rPr>
+        <w:t>Business Impact</w:t>
       </w:r>
     </w:p>
     <w:p>
@@ -625,6 +641,20 @@
           <w:color w:val="000000"/>
           <w:sz w:val="22"/>
         </w:rPr>
+        <w:t>For the business, this is a growth tool: Kopi Koma grows by opening outlets through partners, so every lead that is not lost and every day cut from the process turns directly into more outlets and revenue, without adding more sales.</w:t>
+      </w:r>
+    </w:p>
+    <w:p>
+      <w:pPr>
+        <w:jc w:val="both"/>
+      </w:pPr>
+      <w:r>
+        <w:rPr>
+          <w:rFonts w:ascii="Arial" w:hAnsi="Arial" w:cs="Arial" w:eastAsia="Arial"/>
+          <w:b w:val="0"/>
+          <w:color w:val="000000"/>
+          <w:sz w:val="22"/>
+        </w:rPr>
         <w:t>Out of scope: everything after both parties approve (agreement signing, outlet opening, royalty). Signing through Privy is shown only as the next step.</w:t>
       </w:r>
     </w:p>
@@ -2756,6 +2786,595 @@
       <w:pPr>
         <w:spacing w:after="0"/>
       </w:pPr>
+    </w:p>
+    <w:p>
+      <w:pPr>
+        <w:pStyle w:val="Heading1"/>
+      </w:pPr>
+      <w:r>
+        <w:rPr>
+          <w:rFonts w:ascii="Arial" w:hAnsi="Arial" w:cs="Arial" w:eastAsia="Arial"/>
+          <w:b/>
+          <w:color w:val="000000"/>
+          <w:sz w:val="28"/>
+        </w:rPr>
+        <w:t>Business Impact</w:t>
+      </w:r>
+    </w:p>
+    <w:p>
+      <w:pPr>
+        <w:jc w:val="both"/>
+      </w:pPr>
+      <w:r>
+        <w:rPr>
+          <w:rFonts w:ascii="Arial" w:hAnsi="Arial" w:cs="Arial" w:eastAsia="Arial"/>
+          <w:b w:val="0"/>
+          <w:color w:val="000000"/>
+          <w:sz w:val="22"/>
+        </w:rPr>
+        <w:t>Kopi Koma's growth equals the number of new partner outlets. The product supports growth through five levers:</w:t>
+      </w:r>
+    </w:p>
+    <w:tbl>
+      <w:tblPr>
+        <w:tblStyle w:val="TableGrid"/>
+        <w:tblW w:type="auto" w:w="0"/>
+        <w:tblLook w:firstColumn="1" w:firstRow="1" w:lastColumn="0" w:lastRow="0" w:noHBand="0" w:noVBand="1" w:val="04A0"/>
+      </w:tblPr>
+      <w:tblGrid>
+        <w:gridCol w:w="2436"/>
+        <w:gridCol w:w="2436"/>
+        <w:gridCol w:w="2436"/>
+        <w:gridCol w:w="2436"/>
+      </w:tblGrid>
+      <w:tr>
+        <w:tc>
+          <w:tcPr>
+            <w:tcW w:type="dxa" w:w="2436"/>
+            <w:shd w:val="clear" w:color="auto" w:fill="E7E2DA"/>
+          </w:tcPr>
+          <w:p>
+            <w:pPr>
+              <w:spacing w:after="0"/>
+              <w:jc w:val="left"/>
+            </w:pPr>
+            <w:r/>
+            <w:r>
+              <w:rPr>
+                <w:rFonts w:ascii="Arial" w:hAnsi="Arial" w:cs="Arial" w:eastAsia="Arial"/>
+                <w:b/>
+                <w:color w:val="000000"/>
+                <w:sz w:val="22"/>
+              </w:rPr>
+              <w:t>Lever</w:t>
+            </w:r>
+          </w:p>
+        </w:tc>
+        <w:tc>
+          <w:tcPr>
+            <w:tcW w:type="dxa" w:w="2436"/>
+            <w:shd w:val="clear" w:color="auto" w:fill="E7E2DA"/>
+          </w:tcPr>
+          <w:p>
+            <w:pPr>
+              <w:spacing w:after="0"/>
+              <w:jc w:val="left"/>
+            </w:pPr>
+            <w:r/>
+            <w:r>
+              <w:rPr>
+                <w:rFonts w:ascii="Arial" w:hAnsi="Arial" w:cs="Arial" w:eastAsia="Arial"/>
+                <w:b/>
+                <w:color w:val="000000"/>
+                <w:sz w:val="22"/>
+              </w:rPr>
+              <w:t>How the product drives it</w:t>
+            </w:r>
+          </w:p>
+        </w:tc>
+        <w:tc>
+          <w:tcPr>
+            <w:tcW w:type="dxa" w:w="2436"/>
+            <w:shd w:val="clear" w:color="auto" w:fill="E7E2DA"/>
+          </w:tcPr>
+          <w:p>
+            <w:pPr>
+              <w:spacing w:after="0"/>
+              <w:jc w:val="left"/>
+            </w:pPr>
+            <w:r/>
+            <w:r>
+              <w:rPr>
+                <w:rFonts w:ascii="Arial" w:hAnsi="Arial" w:cs="Arial" w:eastAsia="Arial"/>
+                <w:b/>
+                <w:color w:val="000000"/>
+                <w:sz w:val="22"/>
+              </w:rPr>
+              <w:t>Growth effect</w:t>
+            </w:r>
+          </w:p>
+        </w:tc>
+        <w:tc>
+          <w:tcPr>
+            <w:tcW w:type="dxa" w:w="2436"/>
+            <w:shd w:val="clear" w:color="auto" w:fill="E7E2DA"/>
+          </w:tcPr>
+          <w:p>
+            <w:pPr>
+              <w:spacing w:after="0"/>
+              <w:jc w:val="left"/>
+            </w:pPr>
+            <w:r/>
+            <w:r>
+              <w:rPr>
+                <w:rFonts w:ascii="Arial" w:hAnsi="Arial" w:cs="Arial" w:eastAsia="Arial"/>
+                <w:b/>
+                <w:color w:val="000000"/>
+                <w:sz w:val="22"/>
+              </w:rPr>
+              <w:t>Metric to watch</w:t>
+            </w:r>
+          </w:p>
+        </w:tc>
+      </w:tr>
+      <w:tr>
+        <w:tc>
+          <w:tcPr>
+            <w:tcW w:type="dxa" w:w="2436"/>
+          </w:tcPr>
+          <w:p>
+            <w:pPr>
+              <w:spacing w:after="0"/>
+              <w:jc w:val="left"/>
+            </w:pPr>
+            <w:r/>
+            <w:r>
+              <w:rPr>
+                <w:rFonts w:ascii="Arial" w:hAnsi="Arial" w:cs="Arial" w:eastAsia="Arial"/>
+                <w:b w:val="0"/>
+                <w:color w:val="000000"/>
+                <w:sz w:val="22"/>
+              </w:rPr>
+              <w:t>Fewer lost leads</w:t>
+            </w:r>
+          </w:p>
+        </w:tc>
+        <w:tc>
+          <w:tcPr>
+            <w:tcW w:type="dxa" w:w="2436"/>
+          </w:tcPr>
+          <w:p>
+            <w:pPr>
+              <w:spacing w:after="0"/>
+              <w:jc w:val="left"/>
+            </w:pPr>
+            <w:r/>
+            <w:r>
+              <w:rPr>
+                <w:rFonts w:ascii="Arial" w:hAnsi="Arial" w:cs="Arial" w:eastAsia="Arial"/>
+                <w:b w:val="0"/>
+                <w:color w:val="000000"/>
+                <w:sz w:val="22"/>
+              </w:rPr>
+              <w:t>Every lead is recorded and assigned within 1 day, with reminders when it stalls</w:t>
+            </w:r>
+          </w:p>
+        </w:tc>
+        <w:tc>
+          <w:tcPr>
+            <w:tcW w:type="dxa" w:w="2436"/>
+          </w:tcPr>
+          <w:p>
+            <w:pPr>
+              <w:spacing w:after="0"/>
+              <w:jc w:val="left"/>
+            </w:pPr>
+            <w:r/>
+            <w:r>
+              <w:rPr>
+                <w:rFonts w:ascii="Arial" w:hAnsi="Arial" w:cs="Arial" w:eastAsia="Arial"/>
+                <w:b w:val="0"/>
+                <w:color w:val="000000"/>
+                <w:sz w:val="22"/>
+              </w:rPr>
+              <w:t>More candidates reach the quotation stage</w:t>
+            </w:r>
+          </w:p>
+        </w:tc>
+        <w:tc>
+          <w:tcPr>
+            <w:tcW w:type="dxa" w:w="2436"/>
+          </w:tcPr>
+          <w:p>
+            <w:pPr>
+              <w:spacing w:after="0"/>
+              <w:jc w:val="left"/>
+            </w:pPr>
+            <w:r/>
+            <w:r>
+              <w:rPr>
+                <w:rFonts w:ascii="Arial" w:hAnsi="Arial" w:cs="Arial" w:eastAsia="Arial"/>
+                <w:b w:val="0"/>
+                <w:color w:val="000000"/>
+                <w:sz w:val="22"/>
+              </w:rPr>
+              <w:t>Leads assigned within 1 day, lead to approved conversion</w:t>
+            </w:r>
+          </w:p>
+        </w:tc>
+      </w:tr>
+      <w:tr>
+        <w:tc>
+          <w:tcPr>
+            <w:tcW w:type="dxa" w:w="2436"/>
+          </w:tcPr>
+          <w:p>
+            <w:pPr>
+              <w:spacing w:after="0"/>
+              <w:jc w:val="left"/>
+            </w:pPr>
+            <w:r/>
+            <w:r>
+              <w:rPr>
+                <w:rFonts w:ascii="Arial" w:hAnsi="Arial" w:cs="Arial" w:eastAsia="Arial"/>
+                <w:b w:val="0"/>
+                <w:color w:val="000000"/>
+                <w:sz w:val="22"/>
+              </w:rPr>
+              <w:t>Faster closing</w:t>
+            </w:r>
+          </w:p>
+        </w:tc>
+        <w:tc>
+          <w:tcPr>
+            <w:tcW w:type="dxa" w:w="2436"/>
+          </w:tcPr>
+          <w:p>
+            <w:pPr>
+              <w:spacing w:after="0"/>
+              <w:jc w:val="left"/>
+            </w:pPr>
+            <w:r/>
+            <w:r>
+              <w:rPr>
+                <w:rFonts w:ascii="Arial" w:hAnsi="Arial" w:cs="Arial" w:eastAsia="Arial"/>
+                <w:b w:val="0"/>
+                <w:color w:val="000000"/>
+                <w:sz w:val="22"/>
+              </w:rPr>
+              <w:t>Clear PIC and deadline per stage, quotation response directly in the portal</w:t>
+            </w:r>
+          </w:p>
+        </w:tc>
+        <w:tc>
+          <w:tcPr>
+            <w:tcW w:type="dxa" w:w="2436"/>
+          </w:tcPr>
+          <w:p>
+            <w:pPr>
+              <w:spacing w:after="0"/>
+              <w:jc w:val="left"/>
+            </w:pPr>
+            <w:r/>
+            <w:r>
+              <w:rPr>
+                <w:rFonts w:ascii="Arial" w:hAnsi="Arial" w:cs="Arial" w:eastAsia="Arial"/>
+                <w:b w:val="0"/>
+                <w:color w:val="000000"/>
+                <w:sz w:val="22"/>
+              </w:rPr>
+              <w:t>Deals close within the same month instead of dragging on, and fewer candidates move to competitors</w:t>
+            </w:r>
+          </w:p>
+        </w:tc>
+        <w:tc>
+          <w:tcPr>
+            <w:tcW w:type="dxa" w:w="2436"/>
+          </w:tcPr>
+          <w:p>
+            <w:pPr>
+              <w:spacing w:after="0"/>
+              <w:jc w:val="left"/>
+            </w:pPr>
+            <w:r/>
+            <w:r>
+              <w:rPr>
+                <w:rFonts w:ascii="Arial" w:hAnsi="Arial" w:cs="Arial" w:eastAsia="Arial"/>
+                <w:b w:val="0"/>
+                <w:color w:val="000000"/>
+                <w:sz w:val="22"/>
+              </w:rPr>
+              <w:t>Days from lead to decision</w:t>
+            </w:r>
+          </w:p>
+        </w:tc>
+      </w:tr>
+      <w:tr>
+        <w:tc>
+          <w:tcPr>
+            <w:tcW w:type="dxa" w:w="2436"/>
+          </w:tcPr>
+          <w:p>
+            <w:pPr>
+              <w:spacing w:after="0"/>
+              <w:jc w:val="left"/>
+            </w:pPr>
+            <w:r/>
+            <w:r>
+              <w:rPr>
+                <w:rFonts w:ascii="Arial" w:hAnsi="Arial" w:cs="Arial" w:eastAsia="Arial"/>
+                <w:b w:val="0"/>
+                <w:color w:val="000000"/>
+                <w:sz w:val="22"/>
+              </w:rPr>
+              <w:t>More capacity per sales</w:t>
+            </w:r>
+          </w:p>
+        </w:tc>
+        <w:tc>
+          <w:tcPr>
+            <w:tcW w:type="dxa" w:w="2436"/>
+          </w:tcPr>
+          <w:p>
+            <w:pPr>
+              <w:spacing w:after="0"/>
+              <w:jc w:val="left"/>
+            </w:pPr>
+            <w:r/>
+            <w:r>
+              <w:rPr>
+                <w:rFonts w:ascii="Arial" w:hAnsi="Arial" w:cs="Arial" w:eastAsia="Arial"/>
+                <w:b w:val="0"/>
+                <w:color w:val="000000"/>
+                <w:sz w:val="22"/>
+              </w:rPr>
+              <w:t>Auto-assignment, task list, and self-service tracker reduce manual follow-up</w:t>
+            </w:r>
+          </w:p>
+        </w:tc>
+        <w:tc>
+          <w:tcPr>
+            <w:tcW w:type="dxa" w:w="2436"/>
+          </w:tcPr>
+          <w:p>
+            <w:pPr>
+              <w:spacing w:after="0"/>
+              <w:jc w:val="left"/>
+            </w:pPr>
+            <w:r/>
+            <w:r>
+              <w:rPr>
+                <w:rFonts w:ascii="Arial" w:hAnsi="Arial" w:cs="Arial" w:eastAsia="Arial"/>
+                <w:b w:val="0"/>
+                <w:color w:val="000000"/>
+                <w:sz w:val="22"/>
+              </w:rPr>
+              <w:t>Each sales can handle more leads (lead cap 15 senior, 10 junior), so expansion does not need proportional new hires</w:t>
+            </w:r>
+          </w:p>
+        </w:tc>
+        <w:tc>
+          <w:tcPr>
+            <w:tcW w:type="dxa" w:w="2436"/>
+          </w:tcPr>
+          <w:p>
+            <w:pPr>
+              <w:spacing w:after="0"/>
+              <w:jc w:val="left"/>
+            </w:pPr>
+            <w:r/>
+            <w:r>
+              <w:rPr>
+                <w:rFonts w:ascii="Arial" w:hAnsi="Arial" w:cs="Arial" w:eastAsia="Arial"/>
+                <w:b w:val="0"/>
+                <w:color w:val="000000"/>
+                <w:sz w:val="22"/>
+              </w:rPr>
+              <w:t>Active leads per sales</w:t>
+            </w:r>
+          </w:p>
+        </w:tc>
+      </w:tr>
+      <w:tr>
+        <w:tc>
+          <w:tcPr>
+            <w:tcW w:type="dxa" w:w="2436"/>
+          </w:tcPr>
+          <w:p>
+            <w:pPr>
+              <w:spacing w:after="0"/>
+              <w:jc w:val="left"/>
+            </w:pPr>
+            <w:r/>
+            <w:r>
+              <w:rPr>
+                <w:rFonts w:ascii="Arial" w:hAnsi="Arial" w:cs="Arial" w:eastAsia="Arial"/>
+                <w:b w:val="0"/>
+                <w:color w:val="000000"/>
+                <w:sz w:val="22"/>
+              </w:rPr>
+              <w:t>Better outlet quality</w:t>
+            </w:r>
+          </w:p>
+        </w:tc>
+        <w:tc>
+          <w:tcPr>
+            <w:tcW w:type="dxa" w:w="2436"/>
+          </w:tcPr>
+          <w:p>
+            <w:pPr>
+              <w:spacing w:after="0"/>
+              <w:jc w:val="left"/>
+            </w:pPr>
+            <w:r/>
+            <w:r>
+              <w:rPr>
+                <w:rFonts w:ascii="Arial" w:hAnsi="Arial" w:cs="Arial" w:eastAsia="Arial"/>
+                <w:b w:val="0"/>
+                <w:color w:val="000000"/>
+                <w:sz w:val="22"/>
+              </w:rPr>
+              <w:t>Structured assessment and AI fit score with location data</w:t>
+            </w:r>
+          </w:p>
+        </w:tc>
+        <w:tc>
+          <w:tcPr>
+            <w:tcW w:type="dxa" w:w="2436"/>
+          </w:tcPr>
+          <w:p>
+            <w:pPr>
+              <w:spacing w:after="0"/>
+              <w:jc w:val="left"/>
+            </w:pPr>
+            <w:r/>
+            <w:r>
+              <w:rPr>
+                <w:rFonts w:ascii="Arial" w:hAnsi="Arial" w:cs="Arial" w:eastAsia="Arial"/>
+                <w:b w:val="0"/>
+                <w:color w:val="000000"/>
+                <w:sz w:val="22"/>
+              </w:rPr>
+              <w:t>Fewer failing outlets, which protects the brand and brings referrals for the next partners</w:t>
+            </w:r>
+          </w:p>
+        </w:tc>
+        <w:tc>
+          <w:tcPr>
+            <w:tcW w:type="dxa" w:w="2436"/>
+          </w:tcPr>
+          <w:p>
+            <w:pPr>
+              <w:spacing w:after="0"/>
+              <w:jc w:val="left"/>
+            </w:pPr>
+            <w:r/>
+            <w:r>
+              <w:rPr>
+                <w:rFonts w:ascii="Arial" w:hAnsi="Arial" w:cs="Arial" w:eastAsia="Arial"/>
+                <w:b w:val="0"/>
+                <w:color w:val="000000"/>
+                <w:sz w:val="22"/>
+              </w:rPr>
+              <w:t>Outlet survival rate after 12 months (phase 3)</w:t>
+            </w:r>
+          </w:p>
+        </w:tc>
+      </w:tr>
+      <w:tr>
+        <w:tc>
+          <w:tcPr>
+            <w:tcW w:type="dxa" w:w="2436"/>
+          </w:tcPr>
+          <w:p>
+            <w:pPr>
+              <w:spacing w:after="0"/>
+              <w:jc w:val="left"/>
+            </w:pPr>
+            <w:r/>
+            <w:r>
+              <w:rPr>
+                <w:rFonts w:ascii="Arial" w:hAnsi="Arial" w:cs="Arial" w:eastAsia="Arial"/>
+                <w:b w:val="0"/>
+                <w:color w:val="000000"/>
+                <w:sz w:val="22"/>
+              </w:rPr>
+              <w:t>Early course correction</w:t>
+            </w:r>
+          </w:p>
+        </w:tc>
+        <w:tc>
+          <w:tcPr>
+            <w:tcW w:type="dxa" w:w="2436"/>
+          </w:tcPr>
+          <w:p>
+            <w:pPr>
+              <w:spacing w:after="0"/>
+              <w:jc w:val="left"/>
+            </w:pPr>
+            <w:r/>
+            <w:r>
+              <w:rPr>
+                <w:rFonts w:ascii="Arial" w:hAnsi="Arial" w:cs="Arial" w:eastAsia="Arial"/>
+                <w:b w:val="0"/>
+                <w:color w:val="000000"/>
+                <w:sz w:val="22"/>
+              </w:rPr>
+              <w:t>Target vs Achievement shows the gap during the period</w:t>
+            </w:r>
+          </w:p>
+        </w:tc>
+        <w:tc>
+          <w:tcPr>
+            <w:tcW w:type="dxa" w:w="2436"/>
+          </w:tcPr>
+          <w:p>
+            <w:pPr>
+              <w:spacing w:after="0"/>
+              <w:jc w:val="left"/>
+            </w:pPr>
+            <w:r/>
+            <w:r>
+              <w:rPr>
+                <w:rFonts w:ascii="Arial" w:hAnsi="Arial" w:cs="Arial" w:eastAsia="Arial"/>
+                <w:b w:val="0"/>
+                <w:color w:val="000000"/>
+                <w:sz w:val="22"/>
+              </w:rPr>
+              <w:t>Management can push the pipeline before the month ends</w:t>
+            </w:r>
+          </w:p>
+        </w:tc>
+        <w:tc>
+          <w:tcPr>
+            <w:tcW w:type="dxa" w:w="2436"/>
+          </w:tcPr>
+          <w:p>
+            <w:pPr>
+              <w:spacing w:after="0"/>
+              <w:jc w:val="left"/>
+            </w:pPr>
+            <w:r/>
+            <w:r>
+              <w:rPr>
+                <w:rFonts w:ascii="Arial" w:hAnsi="Arial" w:cs="Arial" w:eastAsia="Arial"/>
+                <w:b w:val="0"/>
+                <w:color w:val="000000"/>
+                <w:sz w:val="22"/>
+              </w:rPr>
+              <w:t>Achievement vs target to date</w:t>
+            </w:r>
+          </w:p>
+        </w:tc>
+      </w:tr>
+    </w:tbl>
+    <w:p>
+      <w:pPr>
+        <w:spacing w:after="0"/>
+      </w:pPr>
+    </w:p>
+    <w:p>
+      <w:pPr>
+        <w:jc w:val="both"/>
+      </w:pPr>
+      <w:r>
+        <w:rPr>
+          <w:rFonts w:ascii="Arial" w:hAnsi="Arial" w:cs="Arial" w:eastAsia="Arial"/>
+          <w:b/>
+          <w:color w:val="000000"/>
+          <w:sz w:val="22"/>
+        </w:rPr>
+        <w:t>Illustration (not a forecast):</w:t>
+      </w:r>
+      <w:r>
+        <w:rPr>
+          <w:rFonts w:ascii="Arial" w:hAnsi="Arial" w:cs="Arial" w:eastAsia="Arial"/>
+          <w:b w:val="0"/>
+          <w:color w:val="000000"/>
+          <w:sz w:val="22"/>
+        </w:rPr>
+        <w:t xml:space="preserve"> with about 92 leads per month, raising lead to approved conversion from 12% to 14% by losing fewer leads adds about 1.8 outlets per month, or about 22 outlets per year. At the target package mix (60% Gerobak, 40% Cafe, average deal around Rp 207 million), that is about Rp 4.5 billion in additional deal value per year with the same team.</w:t>
+      </w:r>
     </w:p>
     <w:p>
       <w:pPr>

</xml_diff>

<commit_message>
PRD: tighten business impact to defensible levers
Co-Authored-By: Claude Opus 5.5 <noreply@anthropic.com>
Claude-Session: https://claude.ai/code/session_01MyaJcnNN6cea99ff9yeVti
</commit_message>
<xml_diff>
--- a/prd/EDTS APM 2027 - Nadia Rahma Prasanti - Universitas Indonesia.docx
+++ b/prd/EDTS APM 2027 - Nadia Rahma Prasanti - Universitas Indonesia.docx
@@ -641,7 +641,7 @@
           <w:color w:val="000000"/>
           <w:sz w:val="22"/>
         </w:rPr>
-        <w:t>For the business, this is a growth tool: Kopi Koma grows by opening outlets through partners, so every lead that is not lost and every day cut from the process turns directly into more outlets and revenue, without adding more sales.</w:t>
+        <w:t>For the business, this is a growth tool: Kopi Koma grows by opening outlets through partners, so capturing more leads and losing fewer of them turns directly into more outlets and revenue.</w:t>
       </w:r>
     </w:p>
     <w:p>
@@ -2812,7 +2812,7 @@
           <w:color w:val="000000"/>
           <w:sz w:val="22"/>
         </w:rPr>
-        <w:t>Kopi Koma's growth equals the number of new partner outlets. The product supports growth through five levers:</w:t>
+        <w:t>Kopi Koma grows by adding partner outlets, and every outlet starts as a lead. The product supports growth through three levers that follow directly from its features:</w:t>
       </w:r>
     </w:p>
     <w:tbl>
@@ -2822,15 +2822,14 @@
         <w:tblLook w:firstColumn="1" w:firstRow="1" w:lastColumn="0" w:lastRow="0" w:noHBand="0" w:noVBand="1" w:val="04A0"/>
       </w:tblPr>
       <w:tblGrid>
-        <w:gridCol w:w="2436"/>
-        <w:gridCol w:w="2436"/>
-        <w:gridCol w:w="2436"/>
-        <w:gridCol w:w="2436"/>
+        <w:gridCol w:w="3249"/>
+        <w:gridCol w:w="3249"/>
+        <w:gridCol w:w="3249"/>
       </w:tblGrid>
       <w:tr>
         <w:tc>
           <w:tcPr>
-            <w:tcW w:type="dxa" w:w="2436"/>
+            <w:tcW w:type="dxa" w:w="3249"/>
             <w:shd w:val="clear" w:color="auto" w:fill="E7E2DA"/>
           </w:tcPr>
           <w:p>
@@ -2852,7 +2851,7 @@
         </w:tc>
         <w:tc>
           <w:tcPr>
-            <w:tcW w:type="dxa" w:w="2436"/>
+            <w:tcW w:type="dxa" w:w="3249"/>
             <w:shd w:val="clear" w:color="auto" w:fill="E7E2DA"/>
           </w:tcPr>
           <w:p>
@@ -2874,29 +2873,7 @@
         </w:tc>
         <w:tc>
           <w:tcPr>
-            <w:tcW w:type="dxa" w:w="2436"/>
-            <w:shd w:val="clear" w:color="auto" w:fill="E7E2DA"/>
-          </w:tcPr>
-          <w:p>
-            <w:pPr>
-              <w:spacing w:after="0"/>
-              <w:jc w:val="left"/>
-            </w:pPr>
-            <w:r/>
-            <w:r>
-              <w:rPr>
-                <w:rFonts w:ascii="Arial" w:hAnsi="Arial" w:cs="Arial" w:eastAsia="Arial"/>
-                <w:b/>
-                <w:color w:val="000000"/>
-                <w:sz w:val="22"/>
-              </w:rPr>
-              <w:t>Growth effect</w:t>
-            </w:r>
-          </w:p>
-        </w:tc>
-        <w:tc>
-          <w:tcPr>
-            <w:tcW w:type="dxa" w:w="2436"/>
+            <w:tcW w:type="dxa" w:w="3249"/>
             <w:shd w:val="clear" w:color="auto" w:fill="E7E2DA"/>
           </w:tcPr>
           <w:p>
@@ -2920,85 +2897,64 @@
       <w:tr>
         <w:tc>
           <w:tcPr>
-            <w:tcW w:type="dxa" w:w="2436"/>
-          </w:tcPr>
-          <w:p>
-            <w:pPr>
-              <w:spacing w:after="0"/>
-              <w:jc w:val="left"/>
-            </w:pPr>
-            <w:r/>
-            <w:r>
-              <w:rPr>
-                <w:rFonts w:ascii="Arial" w:hAnsi="Arial" w:cs="Arial" w:eastAsia="Arial"/>
-                <w:b w:val="0"/>
-                <w:color w:val="000000"/>
-                <w:sz w:val="22"/>
-              </w:rPr>
-              <w:t>Fewer lost leads</w:t>
-            </w:r>
-          </w:p>
-        </w:tc>
-        <w:tc>
-          <w:tcPr>
-            <w:tcW w:type="dxa" w:w="2436"/>
-          </w:tcPr>
-          <w:p>
-            <w:pPr>
-              <w:spacing w:after="0"/>
-              <w:jc w:val="left"/>
-            </w:pPr>
-            <w:r/>
-            <w:r>
-              <w:rPr>
-                <w:rFonts w:ascii="Arial" w:hAnsi="Arial" w:cs="Arial" w:eastAsia="Arial"/>
-                <w:b w:val="0"/>
-                <w:color w:val="000000"/>
-                <w:sz w:val="22"/>
-              </w:rPr>
-              <w:t>Every lead is recorded and assigned within 1 day, with reminders when it stalls</w:t>
-            </w:r>
-          </w:p>
-        </w:tc>
-        <w:tc>
-          <w:tcPr>
-            <w:tcW w:type="dxa" w:w="2436"/>
-          </w:tcPr>
-          <w:p>
-            <w:pPr>
-              <w:spacing w:after="0"/>
-              <w:jc w:val="left"/>
-            </w:pPr>
-            <w:r/>
-            <w:r>
-              <w:rPr>
-                <w:rFonts w:ascii="Arial" w:hAnsi="Arial" w:cs="Arial" w:eastAsia="Arial"/>
-                <w:b w:val="0"/>
-                <w:color w:val="000000"/>
-                <w:sz w:val="22"/>
-              </w:rPr>
-              <w:t>More candidates reach the quotation stage</w:t>
-            </w:r>
-          </w:p>
-        </w:tc>
-        <w:tc>
-          <w:tcPr>
-            <w:tcW w:type="dxa" w:w="2436"/>
-          </w:tcPr>
-          <w:p>
-            <w:pPr>
-              <w:spacing w:after="0"/>
-              <w:jc w:val="left"/>
-            </w:pPr>
-            <w:r/>
-            <w:r>
-              <w:rPr>
-                <w:rFonts w:ascii="Arial" w:hAnsi="Arial" w:cs="Arial" w:eastAsia="Arial"/>
-                <w:b w:val="0"/>
-                <w:color w:val="000000"/>
-                <w:sz w:val="22"/>
-              </w:rPr>
-              <w:t>Leads assigned within 1 day, lead to approved conversion</w:t>
+            <w:tcW w:type="dxa" w:w="3249"/>
+          </w:tcPr>
+          <w:p>
+            <w:pPr>
+              <w:spacing w:after="0"/>
+              <w:jc w:val="left"/>
+            </w:pPr>
+            <w:r/>
+            <w:r>
+              <w:rPr>
+                <w:rFonts w:ascii="Arial" w:hAnsi="Arial" w:cs="Arial" w:eastAsia="Arial"/>
+                <w:b w:val="0"/>
+                <w:color w:val="000000"/>
+                <w:sz w:val="22"/>
+              </w:rPr>
+              <w:t>Capture more leads</w:t>
+            </w:r>
+          </w:p>
+        </w:tc>
+        <w:tc>
+          <w:tcPr>
+            <w:tcW w:type="dxa" w:w="3249"/>
+          </w:tcPr>
+          <w:p>
+            <w:pPr>
+              <w:spacing w:after="0"/>
+              <w:jc w:val="left"/>
+            </w:pPr>
+            <w:r/>
+            <w:r>
+              <w:rPr>
+                <w:rFonts w:ascii="Arial" w:hAnsi="Arial" w:cs="Arial" w:eastAsia="Arial"/>
+                <w:b w:val="0"/>
+                <w:color w:val="000000"/>
+                <w:sz w:val="22"/>
+              </w:rPr>
+              <w:t>The Partner Portal lets candidates apply anytime from Instagram or the website, and every lead from every channel lands in one pipeline</w:t>
+            </w:r>
+          </w:p>
+        </w:tc>
+        <w:tc>
+          <w:tcPr>
+            <w:tcW w:type="dxa" w:w="3249"/>
+          </w:tcPr>
+          <w:p>
+            <w:pPr>
+              <w:spacing w:after="0"/>
+              <w:jc w:val="left"/>
+            </w:pPr>
+            <w:r/>
+            <w:r>
+              <w:rPr>
+                <w:rFonts w:ascii="Arial" w:hAnsi="Arial" w:cs="Arial" w:eastAsia="Arial"/>
+                <w:b w:val="0"/>
+                <w:color w:val="000000"/>
+                <w:sz w:val="22"/>
+              </w:rPr>
+              <w:t>New leads per month by source</w:t>
             </w:r>
           </w:p>
         </w:tc>
@@ -3006,85 +2962,64 @@
       <w:tr>
         <w:tc>
           <w:tcPr>
-            <w:tcW w:type="dxa" w:w="2436"/>
-          </w:tcPr>
-          <w:p>
-            <w:pPr>
-              <w:spacing w:after="0"/>
-              <w:jc w:val="left"/>
-            </w:pPr>
-            <w:r/>
-            <w:r>
-              <w:rPr>
-                <w:rFonts w:ascii="Arial" w:hAnsi="Arial" w:cs="Arial" w:eastAsia="Arial"/>
-                <w:b w:val="0"/>
-                <w:color w:val="000000"/>
-                <w:sz w:val="22"/>
-              </w:rPr>
-              <w:t>Faster closing</w:t>
-            </w:r>
-          </w:p>
-        </w:tc>
-        <w:tc>
-          <w:tcPr>
-            <w:tcW w:type="dxa" w:w="2436"/>
-          </w:tcPr>
-          <w:p>
-            <w:pPr>
-              <w:spacing w:after="0"/>
-              <w:jc w:val="left"/>
-            </w:pPr>
-            <w:r/>
-            <w:r>
-              <w:rPr>
-                <w:rFonts w:ascii="Arial" w:hAnsi="Arial" w:cs="Arial" w:eastAsia="Arial"/>
-                <w:b w:val="0"/>
-                <w:color w:val="000000"/>
-                <w:sz w:val="22"/>
-              </w:rPr>
-              <w:t>Clear PIC and deadline per stage, quotation response directly in the portal</w:t>
-            </w:r>
-          </w:p>
-        </w:tc>
-        <w:tc>
-          <w:tcPr>
-            <w:tcW w:type="dxa" w:w="2436"/>
-          </w:tcPr>
-          <w:p>
-            <w:pPr>
-              <w:spacing w:after="0"/>
-              <w:jc w:val="left"/>
-            </w:pPr>
-            <w:r/>
-            <w:r>
-              <w:rPr>
-                <w:rFonts w:ascii="Arial" w:hAnsi="Arial" w:cs="Arial" w:eastAsia="Arial"/>
-                <w:b w:val="0"/>
-                <w:color w:val="000000"/>
-                <w:sz w:val="22"/>
-              </w:rPr>
-              <w:t>Deals close within the same month instead of dragging on, and fewer candidates move to competitors</w:t>
-            </w:r>
-          </w:p>
-        </w:tc>
-        <w:tc>
-          <w:tcPr>
-            <w:tcW w:type="dxa" w:w="2436"/>
-          </w:tcPr>
-          <w:p>
-            <w:pPr>
-              <w:spacing w:after="0"/>
-              <w:jc w:val="left"/>
-            </w:pPr>
-            <w:r/>
-            <w:r>
-              <w:rPr>
-                <w:rFonts w:ascii="Arial" w:hAnsi="Arial" w:cs="Arial" w:eastAsia="Arial"/>
-                <w:b w:val="0"/>
-                <w:color w:val="000000"/>
-                <w:sz w:val="22"/>
-              </w:rPr>
-              <w:t>Days from lead to decision</w:t>
+            <w:tcW w:type="dxa" w:w="3249"/>
+          </w:tcPr>
+          <w:p>
+            <w:pPr>
+              <w:spacing w:after="0"/>
+              <w:jc w:val="left"/>
+            </w:pPr>
+            <w:r/>
+            <w:r>
+              <w:rPr>
+                <w:rFonts w:ascii="Arial" w:hAnsi="Arial" w:cs="Arial" w:eastAsia="Arial"/>
+                <w:b w:val="0"/>
+                <w:color w:val="000000"/>
+                <w:sz w:val="22"/>
+              </w:rPr>
+              <w:t>Lose fewer leads</w:t>
+            </w:r>
+          </w:p>
+        </w:tc>
+        <w:tc>
+          <w:tcPr>
+            <w:tcW w:type="dxa" w:w="3249"/>
+          </w:tcPr>
+          <w:p>
+            <w:pPr>
+              <w:spacing w:after="0"/>
+              <w:jc w:val="left"/>
+            </w:pPr>
+            <w:r/>
+            <w:r>
+              <w:rPr>
+                <w:rFonts w:ascii="Arial" w:hAnsi="Arial" w:cs="Arial" w:eastAsia="Arial"/>
+                <w:b w:val="0"/>
+                <w:color w:val="000000"/>
+                <w:sz w:val="22"/>
+              </w:rPr>
+              <w:t>Leads are assigned within 1 day, every stage has an owner and a deadline, and stalled applications trigger reminders</w:t>
+            </w:r>
+          </w:p>
+        </w:tc>
+        <w:tc>
+          <w:tcPr>
+            <w:tcW w:type="dxa" w:w="3249"/>
+          </w:tcPr>
+          <w:p>
+            <w:pPr>
+              <w:spacing w:after="0"/>
+              <w:jc w:val="left"/>
+            </w:pPr>
+            <w:r/>
+            <w:r>
+              <w:rPr>
+                <w:rFonts w:ascii="Arial" w:hAnsi="Arial" w:cs="Arial" w:eastAsia="Arial"/>
+                <w:b w:val="0"/>
+                <w:color w:val="000000"/>
+                <w:sz w:val="22"/>
+              </w:rPr>
+              <w:t>Leads assigned within 1 day, overdue stages, lead to approved conversion</w:t>
             </w:r>
           </w:p>
         </w:tc>
@@ -3092,242 +3027,49 @@
       <w:tr>
         <w:tc>
           <w:tcPr>
-            <w:tcW w:type="dxa" w:w="2436"/>
-          </w:tcPr>
-          <w:p>
-            <w:pPr>
-              <w:spacing w:after="0"/>
-              <w:jc w:val="left"/>
-            </w:pPr>
-            <w:r/>
-            <w:r>
-              <w:rPr>
-                <w:rFonts w:ascii="Arial" w:hAnsi="Arial" w:cs="Arial" w:eastAsia="Arial"/>
-                <w:b w:val="0"/>
-                <w:color w:val="000000"/>
-                <w:sz w:val="22"/>
-              </w:rPr>
-              <w:t>More capacity per sales</w:t>
-            </w:r>
-          </w:p>
-        </w:tc>
-        <w:tc>
-          <w:tcPr>
-            <w:tcW w:type="dxa" w:w="2436"/>
-          </w:tcPr>
-          <w:p>
-            <w:pPr>
-              <w:spacing w:after="0"/>
-              <w:jc w:val="left"/>
-            </w:pPr>
-            <w:r/>
-            <w:r>
-              <w:rPr>
-                <w:rFonts w:ascii="Arial" w:hAnsi="Arial" w:cs="Arial" w:eastAsia="Arial"/>
-                <w:b w:val="0"/>
-                <w:color w:val="000000"/>
-                <w:sz w:val="22"/>
-              </w:rPr>
-              <w:t>Auto-assignment, task list, and self-service tracker reduce manual follow-up</w:t>
-            </w:r>
-          </w:p>
-        </w:tc>
-        <w:tc>
-          <w:tcPr>
-            <w:tcW w:type="dxa" w:w="2436"/>
-          </w:tcPr>
-          <w:p>
-            <w:pPr>
-              <w:spacing w:after="0"/>
-              <w:jc w:val="left"/>
-            </w:pPr>
-            <w:r/>
-            <w:r>
-              <w:rPr>
-                <w:rFonts w:ascii="Arial" w:hAnsi="Arial" w:cs="Arial" w:eastAsia="Arial"/>
-                <w:b w:val="0"/>
-                <w:color w:val="000000"/>
-                <w:sz w:val="22"/>
-              </w:rPr>
-              <w:t>Each sales can handle more leads (lead cap 15 senior, 10 junior), so expansion does not need proportional new hires</w:t>
-            </w:r>
-          </w:p>
-        </w:tc>
-        <w:tc>
-          <w:tcPr>
-            <w:tcW w:type="dxa" w:w="2436"/>
-          </w:tcPr>
-          <w:p>
-            <w:pPr>
-              <w:spacing w:after="0"/>
-              <w:jc w:val="left"/>
-            </w:pPr>
-            <w:r/>
-            <w:r>
-              <w:rPr>
-                <w:rFonts w:ascii="Arial" w:hAnsi="Arial" w:cs="Arial" w:eastAsia="Arial"/>
-                <w:b w:val="0"/>
-                <w:color w:val="000000"/>
-                <w:sz w:val="22"/>
-              </w:rPr>
-              <w:t>Active leads per sales</w:t>
-            </w:r>
-          </w:p>
-        </w:tc>
-      </w:tr>
-      <w:tr>
-        <w:tc>
-          <w:tcPr>
-            <w:tcW w:type="dxa" w:w="2436"/>
-          </w:tcPr>
-          <w:p>
-            <w:pPr>
-              <w:spacing w:after="0"/>
-              <w:jc w:val="left"/>
-            </w:pPr>
-            <w:r/>
-            <w:r>
-              <w:rPr>
-                <w:rFonts w:ascii="Arial" w:hAnsi="Arial" w:cs="Arial" w:eastAsia="Arial"/>
-                <w:b w:val="0"/>
-                <w:color w:val="000000"/>
-                <w:sz w:val="22"/>
-              </w:rPr>
-              <w:t>Better outlet quality</w:t>
-            </w:r>
-          </w:p>
-        </w:tc>
-        <w:tc>
-          <w:tcPr>
-            <w:tcW w:type="dxa" w:w="2436"/>
-          </w:tcPr>
-          <w:p>
-            <w:pPr>
-              <w:spacing w:after="0"/>
-              <w:jc w:val="left"/>
-            </w:pPr>
-            <w:r/>
-            <w:r>
-              <w:rPr>
-                <w:rFonts w:ascii="Arial" w:hAnsi="Arial" w:cs="Arial" w:eastAsia="Arial"/>
-                <w:b w:val="0"/>
-                <w:color w:val="000000"/>
-                <w:sz w:val="22"/>
-              </w:rPr>
-              <w:t>Structured assessment and AI fit score with location data</w:t>
-            </w:r>
-          </w:p>
-        </w:tc>
-        <w:tc>
-          <w:tcPr>
-            <w:tcW w:type="dxa" w:w="2436"/>
-          </w:tcPr>
-          <w:p>
-            <w:pPr>
-              <w:spacing w:after="0"/>
-              <w:jc w:val="left"/>
-            </w:pPr>
-            <w:r/>
-            <w:r>
-              <w:rPr>
-                <w:rFonts w:ascii="Arial" w:hAnsi="Arial" w:cs="Arial" w:eastAsia="Arial"/>
-                <w:b w:val="0"/>
-                <w:color w:val="000000"/>
-                <w:sz w:val="22"/>
-              </w:rPr>
-              <w:t>Fewer failing outlets, which protects the brand and brings referrals for the next partners</w:t>
-            </w:r>
-          </w:p>
-        </w:tc>
-        <w:tc>
-          <w:tcPr>
-            <w:tcW w:type="dxa" w:w="2436"/>
-          </w:tcPr>
-          <w:p>
-            <w:pPr>
-              <w:spacing w:after="0"/>
-              <w:jc w:val="left"/>
-            </w:pPr>
-            <w:r/>
-            <w:r>
-              <w:rPr>
-                <w:rFonts w:ascii="Arial" w:hAnsi="Arial" w:cs="Arial" w:eastAsia="Arial"/>
-                <w:b w:val="0"/>
-                <w:color w:val="000000"/>
-                <w:sz w:val="22"/>
-              </w:rPr>
-              <w:t>Outlet survival rate after 12 months (phase 3)</w:t>
-            </w:r>
-          </w:p>
-        </w:tc>
-      </w:tr>
-      <w:tr>
-        <w:tc>
-          <w:tcPr>
-            <w:tcW w:type="dxa" w:w="2436"/>
-          </w:tcPr>
-          <w:p>
-            <w:pPr>
-              <w:spacing w:after="0"/>
-              <w:jc w:val="left"/>
-            </w:pPr>
-            <w:r/>
-            <w:r>
-              <w:rPr>
-                <w:rFonts w:ascii="Arial" w:hAnsi="Arial" w:cs="Arial" w:eastAsia="Arial"/>
-                <w:b w:val="0"/>
-                <w:color w:val="000000"/>
-                <w:sz w:val="22"/>
-              </w:rPr>
-              <w:t>Early course correction</w:t>
-            </w:r>
-          </w:p>
-        </w:tc>
-        <w:tc>
-          <w:tcPr>
-            <w:tcW w:type="dxa" w:w="2436"/>
-          </w:tcPr>
-          <w:p>
-            <w:pPr>
-              <w:spacing w:after="0"/>
-              <w:jc w:val="left"/>
-            </w:pPr>
-            <w:r/>
-            <w:r>
-              <w:rPr>
-                <w:rFonts w:ascii="Arial" w:hAnsi="Arial" w:cs="Arial" w:eastAsia="Arial"/>
-                <w:b w:val="0"/>
-                <w:color w:val="000000"/>
-                <w:sz w:val="22"/>
-              </w:rPr>
-              <w:t>Target vs Achievement shows the gap during the period</w:t>
-            </w:r>
-          </w:p>
-        </w:tc>
-        <w:tc>
-          <w:tcPr>
-            <w:tcW w:type="dxa" w:w="2436"/>
-          </w:tcPr>
-          <w:p>
-            <w:pPr>
-              <w:spacing w:after="0"/>
-              <w:jc w:val="left"/>
-            </w:pPr>
-            <w:r/>
-            <w:r>
-              <w:rPr>
-                <w:rFonts w:ascii="Arial" w:hAnsi="Arial" w:cs="Arial" w:eastAsia="Arial"/>
-                <w:b w:val="0"/>
-                <w:color w:val="000000"/>
-                <w:sz w:val="22"/>
-              </w:rPr>
-              <w:t>Management can push the pipeline before the month ends</w:t>
-            </w:r>
-          </w:p>
-        </w:tc>
-        <w:tc>
-          <w:tcPr>
-            <w:tcW w:type="dxa" w:w="2436"/>
+            <w:tcW w:type="dxa" w:w="3249"/>
+          </w:tcPr>
+          <w:p>
+            <w:pPr>
+              <w:spacing w:after="0"/>
+              <w:jc w:val="left"/>
+            </w:pPr>
+            <w:r/>
+            <w:r>
+              <w:rPr>
+                <w:rFonts w:ascii="Arial" w:hAnsi="Arial" w:cs="Arial" w:eastAsia="Arial"/>
+                <w:b w:val="0"/>
+                <w:color w:val="000000"/>
+                <w:sz w:val="22"/>
+              </w:rPr>
+              <w:t>Correct course early</w:t>
+            </w:r>
+          </w:p>
+        </w:tc>
+        <w:tc>
+          <w:tcPr>
+            <w:tcW w:type="dxa" w:w="3249"/>
+          </w:tcPr>
+          <w:p>
+            <w:pPr>
+              <w:spacing w:after="0"/>
+              <w:jc w:val="left"/>
+            </w:pPr>
+            <w:r/>
+            <w:r>
+              <w:rPr>
+                <w:rFonts w:ascii="Arial" w:hAnsi="Arial" w:cs="Arial" w:eastAsia="Arial"/>
+                <w:b w:val="0"/>
+                <w:color w:val="000000"/>
+                <w:sz w:val="22"/>
+              </w:rPr>
+              <w:t>Target vs Achievement shows the gap during the period, and the funnel shows how many leads are needed</w:t>
+            </w:r>
+          </w:p>
+        </w:tc>
+        <w:tc>
+          <w:tcPr>
+            <w:tcW w:type="dxa" w:w="3249"/>
           </w:tcPr>
           <w:p>
             <w:pPr>
@@ -3364,7 +3106,7 @@
           <w:color w:val="000000"/>
           <w:sz w:val="22"/>
         </w:rPr>
-        <w:t>Illustration (not a forecast):</w:t>
+        <w:t>Why it matters:</w:t>
       </w:r>
       <w:r>
         <w:rPr>
@@ -3373,7 +3115,7 @@
           <w:color w:val="000000"/>
           <w:sz w:val="22"/>
         </w:rPr>
-        <w:t xml:space="preserve"> with about 92 leads per month, raising lead to approved conversion from 12% to 14% by losing fewer leads adds about 1.8 outlets per month, or about 22 outlets per year. At the target package mix (60% Gerobak, 40% Cafe, average deal around Rp 207 million), that is about Rp 4.5 billion in additional deal value per year with the same team.</w:t>
+        <w:t xml:space="preserve"> at the default conversion of 12%, about 8 leads produce 1 approved outlet. Each additional approved outlet per month at the target package mix (average deal around Rp 207 million) adds about Rp 2.5 billion in deal value per year.</w:t>
       </w:r>
     </w:p>
     <w:p>

</xml_diff>

<commit_message>
PRD: app names, prototype links in mock ups, AI usage wording, table widths
Co-Authored-By: Claude Opus 5.5 <noreply@anthropic.com>
Claude-Session: https://claude.ai/code/session_01MyaJcnNN6cea99ff9yeVti
</commit_message>
<xml_diff>
--- a/prd/EDTS APM 2027 - Nadia Rahma Prasanti - Universitas Indonesia.docx
+++ b/prd/EDTS APM 2027 - Nadia Rahma Prasanti - Universitas Indonesia.docx
@@ -1654,10 +1654,10 @@
         <w:tblLook w:firstColumn="1" w:firstRow="1" w:lastColumn="0" w:lastRow="0" w:noHBand="0" w:noVBand="1" w:val="04A0"/>
       </w:tblPr>
       <w:tblGrid>
-        <w:gridCol w:w="2436"/>
-        <w:gridCol w:w="2436"/>
-        <w:gridCol w:w="2436"/>
-        <w:gridCol w:w="2436"/>
+        <w:gridCol w:w="2721"/>
+        <w:gridCol w:w="1644"/>
+        <w:gridCol w:w="963"/>
+        <w:gridCol w:w="4082"/>
       </w:tblGrid>
       <w:tr>
         <w:tc>
@@ -4531,11 +4531,11 @@
         <w:tblLook w:firstColumn="1" w:firstRow="1" w:lastColumn="0" w:lastRow="0" w:noHBand="0" w:noVBand="1" w:val="04A0"/>
       </w:tblPr>
       <w:tblGrid>
-        <w:gridCol w:w="1949"/>
-        <w:gridCol w:w="1949"/>
-        <w:gridCol w:w="1949"/>
-        <w:gridCol w:w="1949"/>
-        <w:gridCol w:w="1949"/>
+        <w:gridCol w:w="567"/>
+        <w:gridCol w:w="2041"/>
+        <w:gridCol w:w="2268"/>
+        <w:gridCol w:w="1020"/>
+        <w:gridCol w:w="3402"/>
       </w:tblGrid>
       <w:tr>
         <w:tc>
@@ -4562,7 +4562,7 @@
         </w:tc>
         <w:tc>
           <w:tcPr>
-            <w:tcW w:type="dxa" w:w="1247"/>
+            <w:tcW w:type="dxa" w:w="2041"/>
             <w:shd w:val="clear" w:color="auto" w:fill="E7E2DA"/>
           </w:tcPr>
           <w:p>
@@ -4584,7 +4584,7 @@
         </w:tc>
         <w:tc>
           <w:tcPr>
-            <w:tcW w:type="dxa" w:w="2494"/>
+            <w:tcW w:type="dxa" w:w="2268"/>
             <w:shd w:val="clear" w:color="auto" w:fill="E7E2DA"/>
           </w:tcPr>
           <w:p>
@@ -4628,7 +4628,7 @@
         </w:tc>
         <w:tc>
           <w:tcPr>
-            <w:tcW w:type="dxa" w:w="3969"/>
+            <w:tcW w:type="dxa" w:w="3402"/>
             <w:shd w:val="clear" w:color="auto" w:fill="E7E2DA"/>
           </w:tcPr>
           <w:p>
@@ -4673,28 +4673,28 @@
         </w:tc>
         <w:tc>
           <w:tcPr>
-            <w:tcW w:type="dxa" w:w="1247"/>
-          </w:tcPr>
-          <w:p>
-            <w:pPr>
-              <w:spacing w:after="0"/>
-              <w:jc w:val="left"/>
-            </w:pPr>
-            <w:r/>
-            <w:r>
-              <w:rPr>
-                <w:rFonts w:ascii="Arial" w:hAnsi="Arial" w:cs="Arial" w:eastAsia="Arial"/>
-                <w:b w:val="0"/>
-                <w:color w:val="000000"/>
-                <w:sz w:val="22"/>
-              </w:rPr>
-              <w:t>Dashboard</w:t>
-            </w:r>
-          </w:p>
-        </w:tc>
-        <w:tc>
-          <w:tcPr>
-            <w:tcW w:type="dxa" w:w="2494"/>
+            <w:tcW w:type="dxa" w:w="2041"/>
+          </w:tcPr>
+          <w:p>
+            <w:pPr>
+              <w:spacing w:after="0"/>
+              <w:jc w:val="left"/>
+            </w:pPr>
+            <w:r/>
+            <w:r>
+              <w:rPr>
+                <w:rFonts w:ascii="Arial" w:hAnsi="Arial" w:cs="Arial" w:eastAsia="Arial"/>
+                <w:b w:val="0"/>
+                <w:color w:val="000000"/>
+                <w:sz w:val="22"/>
+              </w:rPr>
+              <w:t>Franchisor Dashboard</w:t>
+            </w:r>
+          </w:p>
+        </w:tc>
+        <w:tc>
+          <w:tcPr>
+            <w:tcW w:type="dxa" w:w="2268"/>
           </w:tcPr>
           <w:p>
             <w:pPr>
@@ -4736,7 +4736,7 @@
         </w:tc>
         <w:tc>
           <w:tcPr>
-            <w:tcW w:type="dxa" w:w="3969"/>
+            <w:tcW w:type="dxa" w:w="3402"/>
           </w:tcPr>
           <w:p>
             <w:pPr>
@@ -4780,28 +4780,28 @@
         </w:tc>
         <w:tc>
           <w:tcPr>
-            <w:tcW w:type="dxa" w:w="1247"/>
-          </w:tcPr>
-          <w:p>
-            <w:pPr>
-              <w:spacing w:after="0"/>
-              <w:jc w:val="left"/>
-            </w:pPr>
-            <w:r/>
-            <w:r>
-              <w:rPr>
-                <w:rFonts w:ascii="Arial" w:hAnsi="Arial" w:cs="Arial" w:eastAsia="Arial"/>
-                <w:b w:val="0"/>
-                <w:color w:val="000000"/>
-                <w:sz w:val="22"/>
-              </w:rPr>
-              <w:t>Dashboard</w:t>
-            </w:r>
-          </w:p>
-        </w:tc>
-        <w:tc>
-          <w:tcPr>
-            <w:tcW w:type="dxa" w:w="2494"/>
+            <w:tcW w:type="dxa" w:w="2041"/>
+          </w:tcPr>
+          <w:p>
+            <w:pPr>
+              <w:spacing w:after="0"/>
+              <w:jc w:val="left"/>
+            </w:pPr>
+            <w:r/>
+            <w:r>
+              <w:rPr>
+                <w:rFonts w:ascii="Arial" w:hAnsi="Arial" w:cs="Arial" w:eastAsia="Arial"/>
+                <w:b w:val="0"/>
+                <w:color w:val="000000"/>
+                <w:sz w:val="22"/>
+              </w:rPr>
+              <w:t>Franchisor Dashboard</w:t>
+            </w:r>
+          </w:p>
+        </w:tc>
+        <w:tc>
+          <w:tcPr>
+            <w:tcW w:type="dxa" w:w="2268"/>
           </w:tcPr>
           <w:p>
             <w:pPr>
@@ -4843,7 +4843,7 @@
         </w:tc>
         <w:tc>
           <w:tcPr>
-            <w:tcW w:type="dxa" w:w="3969"/>
+            <w:tcW w:type="dxa" w:w="3402"/>
           </w:tcPr>
           <w:p>
             <w:pPr>
@@ -4887,28 +4887,28 @@
         </w:tc>
         <w:tc>
           <w:tcPr>
-            <w:tcW w:type="dxa" w:w="1247"/>
-          </w:tcPr>
-          <w:p>
-            <w:pPr>
-              <w:spacing w:after="0"/>
-              <w:jc w:val="left"/>
-            </w:pPr>
-            <w:r/>
-            <w:r>
-              <w:rPr>
-                <w:rFonts w:ascii="Arial" w:hAnsi="Arial" w:cs="Arial" w:eastAsia="Arial"/>
-                <w:b w:val="0"/>
-                <w:color w:val="000000"/>
-                <w:sz w:val="22"/>
-              </w:rPr>
-              <w:t>Dashboard</w:t>
-            </w:r>
-          </w:p>
-        </w:tc>
-        <w:tc>
-          <w:tcPr>
-            <w:tcW w:type="dxa" w:w="2494"/>
+            <w:tcW w:type="dxa" w:w="2041"/>
+          </w:tcPr>
+          <w:p>
+            <w:pPr>
+              <w:spacing w:after="0"/>
+              <w:jc w:val="left"/>
+            </w:pPr>
+            <w:r/>
+            <w:r>
+              <w:rPr>
+                <w:rFonts w:ascii="Arial" w:hAnsi="Arial" w:cs="Arial" w:eastAsia="Arial"/>
+                <w:b w:val="0"/>
+                <w:color w:val="000000"/>
+                <w:sz w:val="22"/>
+              </w:rPr>
+              <w:t>Franchisor Dashboard</w:t>
+            </w:r>
+          </w:p>
+        </w:tc>
+        <w:tc>
+          <w:tcPr>
+            <w:tcW w:type="dxa" w:w="2268"/>
           </w:tcPr>
           <w:p>
             <w:pPr>
@@ -4950,7 +4950,7 @@
         </w:tc>
         <w:tc>
           <w:tcPr>
-            <w:tcW w:type="dxa" w:w="3969"/>
+            <w:tcW w:type="dxa" w:w="3402"/>
           </w:tcPr>
           <w:p>
             <w:pPr>
@@ -4994,28 +4994,28 @@
         </w:tc>
         <w:tc>
           <w:tcPr>
-            <w:tcW w:type="dxa" w:w="1247"/>
-          </w:tcPr>
-          <w:p>
-            <w:pPr>
-              <w:spacing w:after="0"/>
-              <w:jc w:val="left"/>
-            </w:pPr>
-            <w:r/>
-            <w:r>
-              <w:rPr>
-                <w:rFonts w:ascii="Arial" w:hAnsi="Arial" w:cs="Arial" w:eastAsia="Arial"/>
-                <w:b w:val="0"/>
-                <w:color w:val="000000"/>
-                <w:sz w:val="22"/>
-              </w:rPr>
-              <w:t>Dashboard</w:t>
-            </w:r>
-          </w:p>
-        </w:tc>
-        <w:tc>
-          <w:tcPr>
-            <w:tcW w:type="dxa" w:w="2494"/>
+            <w:tcW w:type="dxa" w:w="2041"/>
+          </w:tcPr>
+          <w:p>
+            <w:pPr>
+              <w:spacing w:after="0"/>
+              <w:jc w:val="left"/>
+            </w:pPr>
+            <w:r/>
+            <w:r>
+              <w:rPr>
+                <w:rFonts w:ascii="Arial" w:hAnsi="Arial" w:cs="Arial" w:eastAsia="Arial"/>
+                <w:b w:val="0"/>
+                <w:color w:val="000000"/>
+                <w:sz w:val="22"/>
+              </w:rPr>
+              <w:t>Franchisor Dashboard</w:t>
+            </w:r>
+          </w:p>
+        </w:tc>
+        <w:tc>
+          <w:tcPr>
+            <w:tcW w:type="dxa" w:w="2268"/>
           </w:tcPr>
           <w:p>
             <w:pPr>
@@ -5057,7 +5057,7 @@
         </w:tc>
         <w:tc>
           <w:tcPr>
-            <w:tcW w:type="dxa" w:w="3969"/>
+            <w:tcW w:type="dxa" w:w="3402"/>
           </w:tcPr>
           <w:p>
             <w:pPr>
@@ -5101,28 +5101,28 @@
         </w:tc>
         <w:tc>
           <w:tcPr>
-            <w:tcW w:type="dxa" w:w="1247"/>
-          </w:tcPr>
-          <w:p>
-            <w:pPr>
-              <w:spacing w:after="0"/>
-              <w:jc w:val="left"/>
-            </w:pPr>
-            <w:r/>
-            <w:r>
-              <w:rPr>
-                <w:rFonts w:ascii="Arial" w:hAnsi="Arial" w:cs="Arial" w:eastAsia="Arial"/>
-                <w:b w:val="0"/>
-                <w:color w:val="000000"/>
-                <w:sz w:val="22"/>
-              </w:rPr>
-              <w:t>Dashboard</w:t>
-            </w:r>
-          </w:p>
-        </w:tc>
-        <w:tc>
-          <w:tcPr>
-            <w:tcW w:type="dxa" w:w="2494"/>
+            <w:tcW w:type="dxa" w:w="2041"/>
+          </w:tcPr>
+          <w:p>
+            <w:pPr>
+              <w:spacing w:after="0"/>
+              <w:jc w:val="left"/>
+            </w:pPr>
+            <w:r/>
+            <w:r>
+              <w:rPr>
+                <w:rFonts w:ascii="Arial" w:hAnsi="Arial" w:cs="Arial" w:eastAsia="Arial"/>
+                <w:b w:val="0"/>
+                <w:color w:val="000000"/>
+                <w:sz w:val="22"/>
+              </w:rPr>
+              <w:t>Franchisor Dashboard</w:t>
+            </w:r>
+          </w:p>
+        </w:tc>
+        <w:tc>
+          <w:tcPr>
+            <w:tcW w:type="dxa" w:w="2268"/>
           </w:tcPr>
           <w:p>
             <w:pPr>
@@ -5164,7 +5164,7 @@
         </w:tc>
         <w:tc>
           <w:tcPr>
-            <w:tcW w:type="dxa" w:w="3969"/>
+            <w:tcW w:type="dxa" w:w="3402"/>
           </w:tcPr>
           <w:p>
             <w:pPr>
@@ -5208,28 +5208,28 @@
         </w:tc>
         <w:tc>
           <w:tcPr>
-            <w:tcW w:type="dxa" w:w="1247"/>
-          </w:tcPr>
-          <w:p>
-            <w:pPr>
-              <w:spacing w:after="0"/>
-              <w:jc w:val="left"/>
-            </w:pPr>
-            <w:r/>
-            <w:r>
-              <w:rPr>
-                <w:rFonts w:ascii="Arial" w:hAnsi="Arial" w:cs="Arial" w:eastAsia="Arial"/>
-                <w:b w:val="0"/>
-                <w:color w:val="000000"/>
-                <w:sz w:val="22"/>
-              </w:rPr>
-              <w:t>Dashboard</w:t>
-            </w:r>
-          </w:p>
-        </w:tc>
-        <w:tc>
-          <w:tcPr>
-            <w:tcW w:type="dxa" w:w="2494"/>
+            <w:tcW w:type="dxa" w:w="2041"/>
+          </w:tcPr>
+          <w:p>
+            <w:pPr>
+              <w:spacing w:after="0"/>
+              <w:jc w:val="left"/>
+            </w:pPr>
+            <w:r/>
+            <w:r>
+              <w:rPr>
+                <w:rFonts w:ascii="Arial" w:hAnsi="Arial" w:cs="Arial" w:eastAsia="Arial"/>
+                <w:b w:val="0"/>
+                <w:color w:val="000000"/>
+                <w:sz w:val="22"/>
+              </w:rPr>
+              <w:t>Franchisor Dashboard</w:t>
+            </w:r>
+          </w:p>
+        </w:tc>
+        <w:tc>
+          <w:tcPr>
+            <w:tcW w:type="dxa" w:w="2268"/>
           </w:tcPr>
           <w:p>
             <w:pPr>
@@ -5271,7 +5271,7 @@
         </w:tc>
         <w:tc>
           <w:tcPr>
-            <w:tcW w:type="dxa" w:w="3969"/>
+            <w:tcW w:type="dxa" w:w="3402"/>
           </w:tcPr>
           <w:p>
             <w:pPr>
@@ -5315,28 +5315,28 @@
         </w:tc>
         <w:tc>
           <w:tcPr>
-            <w:tcW w:type="dxa" w:w="1247"/>
-          </w:tcPr>
-          <w:p>
-            <w:pPr>
-              <w:spacing w:after="0"/>
-              <w:jc w:val="left"/>
-            </w:pPr>
-            <w:r/>
-            <w:r>
-              <w:rPr>
-                <w:rFonts w:ascii="Arial" w:hAnsi="Arial" w:cs="Arial" w:eastAsia="Arial"/>
-                <w:b w:val="0"/>
-                <w:color w:val="000000"/>
-                <w:sz w:val="22"/>
-              </w:rPr>
-              <w:t>Dashboard</w:t>
-            </w:r>
-          </w:p>
-        </w:tc>
-        <w:tc>
-          <w:tcPr>
-            <w:tcW w:type="dxa" w:w="2494"/>
+            <w:tcW w:type="dxa" w:w="2041"/>
+          </w:tcPr>
+          <w:p>
+            <w:pPr>
+              <w:spacing w:after="0"/>
+              <w:jc w:val="left"/>
+            </w:pPr>
+            <w:r/>
+            <w:r>
+              <w:rPr>
+                <w:rFonts w:ascii="Arial" w:hAnsi="Arial" w:cs="Arial" w:eastAsia="Arial"/>
+                <w:b w:val="0"/>
+                <w:color w:val="000000"/>
+                <w:sz w:val="22"/>
+              </w:rPr>
+              <w:t>Franchisor Dashboard</w:t>
+            </w:r>
+          </w:p>
+        </w:tc>
+        <w:tc>
+          <w:tcPr>
+            <w:tcW w:type="dxa" w:w="2268"/>
           </w:tcPr>
           <w:p>
             <w:pPr>
@@ -5378,7 +5378,7 @@
         </w:tc>
         <w:tc>
           <w:tcPr>
-            <w:tcW w:type="dxa" w:w="3969"/>
+            <w:tcW w:type="dxa" w:w="3402"/>
           </w:tcPr>
           <w:p>
             <w:pPr>
@@ -5422,28 +5422,28 @@
         </w:tc>
         <w:tc>
           <w:tcPr>
-            <w:tcW w:type="dxa" w:w="1247"/>
-          </w:tcPr>
-          <w:p>
-            <w:pPr>
-              <w:spacing w:after="0"/>
-              <w:jc w:val="left"/>
-            </w:pPr>
-            <w:r/>
-            <w:r>
-              <w:rPr>
-                <w:rFonts w:ascii="Arial" w:hAnsi="Arial" w:cs="Arial" w:eastAsia="Arial"/>
-                <w:b w:val="0"/>
-                <w:color w:val="000000"/>
-                <w:sz w:val="22"/>
-              </w:rPr>
-              <w:t>Dashboard</w:t>
-            </w:r>
-          </w:p>
-        </w:tc>
-        <w:tc>
-          <w:tcPr>
-            <w:tcW w:type="dxa" w:w="2494"/>
+            <w:tcW w:type="dxa" w:w="2041"/>
+          </w:tcPr>
+          <w:p>
+            <w:pPr>
+              <w:spacing w:after="0"/>
+              <w:jc w:val="left"/>
+            </w:pPr>
+            <w:r/>
+            <w:r>
+              <w:rPr>
+                <w:rFonts w:ascii="Arial" w:hAnsi="Arial" w:cs="Arial" w:eastAsia="Arial"/>
+                <w:b w:val="0"/>
+                <w:color w:val="000000"/>
+                <w:sz w:val="22"/>
+              </w:rPr>
+              <w:t>Franchisor Dashboard</w:t>
+            </w:r>
+          </w:p>
+        </w:tc>
+        <w:tc>
+          <w:tcPr>
+            <w:tcW w:type="dxa" w:w="2268"/>
           </w:tcPr>
           <w:p>
             <w:pPr>
@@ -5485,7 +5485,7 @@
         </w:tc>
         <w:tc>
           <w:tcPr>
-            <w:tcW w:type="dxa" w:w="3969"/>
+            <w:tcW w:type="dxa" w:w="3402"/>
           </w:tcPr>
           <w:p>
             <w:pPr>
@@ -5529,28 +5529,28 @@
         </w:tc>
         <w:tc>
           <w:tcPr>
-            <w:tcW w:type="dxa" w:w="1247"/>
-          </w:tcPr>
-          <w:p>
-            <w:pPr>
-              <w:spacing w:after="0"/>
-              <w:jc w:val="left"/>
-            </w:pPr>
-            <w:r/>
-            <w:r>
-              <w:rPr>
-                <w:rFonts w:ascii="Arial" w:hAnsi="Arial" w:cs="Arial" w:eastAsia="Arial"/>
-                <w:b w:val="0"/>
-                <w:color w:val="000000"/>
-                <w:sz w:val="22"/>
-              </w:rPr>
-              <w:t>Dashboard</w:t>
-            </w:r>
-          </w:p>
-        </w:tc>
-        <w:tc>
-          <w:tcPr>
-            <w:tcW w:type="dxa" w:w="2494"/>
+            <w:tcW w:type="dxa" w:w="2041"/>
+          </w:tcPr>
+          <w:p>
+            <w:pPr>
+              <w:spacing w:after="0"/>
+              <w:jc w:val="left"/>
+            </w:pPr>
+            <w:r/>
+            <w:r>
+              <w:rPr>
+                <w:rFonts w:ascii="Arial" w:hAnsi="Arial" w:cs="Arial" w:eastAsia="Arial"/>
+                <w:b w:val="0"/>
+                <w:color w:val="000000"/>
+                <w:sz w:val="22"/>
+              </w:rPr>
+              <w:t>Franchisor Dashboard</w:t>
+            </w:r>
+          </w:p>
+        </w:tc>
+        <w:tc>
+          <w:tcPr>
+            <w:tcW w:type="dxa" w:w="2268"/>
           </w:tcPr>
           <w:p>
             <w:pPr>
@@ -5592,7 +5592,7 @@
         </w:tc>
         <w:tc>
           <w:tcPr>
-            <w:tcW w:type="dxa" w:w="3969"/>
+            <w:tcW w:type="dxa" w:w="3402"/>
           </w:tcPr>
           <w:p>
             <w:pPr>
@@ -5636,28 +5636,28 @@
         </w:tc>
         <w:tc>
           <w:tcPr>
-            <w:tcW w:type="dxa" w:w="1247"/>
-          </w:tcPr>
-          <w:p>
-            <w:pPr>
-              <w:spacing w:after="0"/>
-              <w:jc w:val="left"/>
-            </w:pPr>
-            <w:r/>
-            <w:r>
-              <w:rPr>
-                <w:rFonts w:ascii="Arial" w:hAnsi="Arial" w:cs="Arial" w:eastAsia="Arial"/>
-                <w:b w:val="0"/>
-                <w:color w:val="000000"/>
-                <w:sz w:val="22"/>
-              </w:rPr>
-              <w:t>Portal</w:t>
-            </w:r>
-          </w:p>
-        </w:tc>
-        <w:tc>
-          <w:tcPr>
-            <w:tcW w:type="dxa" w:w="2494"/>
+            <w:tcW w:type="dxa" w:w="2041"/>
+          </w:tcPr>
+          <w:p>
+            <w:pPr>
+              <w:spacing w:after="0"/>
+              <w:jc w:val="left"/>
+            </w:pPr>
+            <w:r/>
+            <w:r>
+              <w:rPr>
+                <w:rFonts w:ascii="Arial" w:hAnsi="Arial" w:cs="Arial" w:eastAsia="Arial"/>
+                <w:b w:val="0"/>
+                <w:color w:val="000000"/>
+                <w:sz w:val="22"/>
+              </w:rPr>
+              <w:t>Partner Portal (Franchisee)</w:t>
+            </w:r>
+          </w:p>
+        </w:tc>
+        <w:tc>
+          <w:tcPr>
+            <w:tcW w:type="dxa" w:w="2268"/>
           </w:tcPr>
           <w:p>
             <w:pPr>
@@ -5699,7 +5699,7 @@
         </w:tc>
         <w:tc>
           <w:tcPr>
-            <w:tcW w:type="dxa" w:w="3969"/>
+            <w:tcW w:type="dxa" w:w="3402"/>
           </w:tcPr>
           <w:p>
             <w:pPr>
@@ -5743,28 +5743,28 @@
         </w:tc>
         <w:tc>
           <w:tcPr>
-            <w:tcW w:type="dxa" w:w="1247"/>
-          </w:tcPr>
-          <w:p>
-            <w:pPr>
-              <w:spacing w:after="0"/>
-              <w:jc w:val="left"/>
-            </w:pPr>
-            <w:r/>
-            <w:r>
-              <w:rPr>
-                <w:rFonts w:ascii="Arial" w:hAnsi="Arial" w:cs="Arial" w:eastAsia="Arial"/>
-                <w:b w:val="0"/>
-                <w:color w:val="000000"/>
-                <w:sz w:val="22"/>
-              </w:rPr>
-              <w:t>Portal</w:t>
-            </w:r>
-          </w:p>
-        </w:tc>
-        <w:tc>
-          <w:tcPr>
-            <w:tcW w:type="dxa" w:w="2494"/>
+            <w:tcW w:type="dxa" w:w="2041"/>
+          </w:tcPr>
+          <w:p>
+            <w:pPr>
+              <w:spacing w:after="0"/>
+              <w:jc w:val="left"/>
+            </w:pPr>
+            <w:r/>
+            <w:r>
+              <w:rPr>
+                <w:rFonts w:ascii="Arial" w:hAnsi="Arial" w:cs="Arial" w:eastAsia="Arial"/>
+                <w:b w:val="0"/>
+                <w:color w:val="000000"/>
+                <w:sz w:val="22"/>
+              </w:rPr>
+              <w:t>Partner Portal (Franchisee)</w:t>
+            </w:r>
+          </w:p>
+        </w:tc>
+        <w:tc>
+          <w:tcPr>
+            <w:tcW w:type="dxa" w:w="2268"/>
           </w:tcPr>
           <w:p>
             <w:pPr>
@@ -5806,7 +5806,7 @@
         </w:tc>
         <w:tc>
           <w:tcPr>
-            <w:tcW w:type="dxa" w:w="3969"/>
+            <w:tcW w:type="dxa" w:w="3402"/>
           </w:tcPr>
           <w:p>
             <w:pPr>
@@ -5850,28 +5850,28 @@
         </w:tc>
         <w:tc>
           <w:tcPr>
-            <w:tcW w:type="dxa" w:w="1247"/>
-          </w:tcPr>
-          <w:p>
-            <w:pPr>
-              <w:spacing w:after="0"/>
-              <w:jc w:val="left"/>
-            </w:pPr>
-            <w:r/>
-            <w:r>
-              <w:rPr>
-                <w:rFonts w:ascii="Arial" w:hAnsi="Arial" w:cs="Arial" w:eastAsia="Arial"/>
-                <w:b w:val="0"/>
-                <w:color w:val="000000"/>
-                <w:sz w:val="22"/>
-              </w:rPr>
-              <w:t>Portal</w:t>
-            </w:r>
-          </w:p>
-        </w:tc>
-        <w:tc>
-          <w:tcPr>
-            <w:tcW w:type="dxa" w:w="2494"/>
+            <w:tcW w:type="dxa" w:w="2041"/>
+          </w:tcPr>
+          <w:p>
+            <w:pPr>
+              <w:spacing w:after="0"/>
+              <w:jc w:val="left"/>
+            </w:pPr>
+            <w:r/>
+            <w:r>
+              <w:rPr>
+                <w:rFonts w:ascii="Arial" w:hAnsi="Arial" w:cs="Arial" w:eastAsia="Arial"/>
+                <w:b w:val="0"/>
+                <w:color w:val="000000"/>
+                <w:sz w:val="22"/>
+              </w:rPr>
+              <w:t>Partner Portal (Franchisee)</w:t>
+            </w:r>
+          </w:p>
+        </w:tc>
+        <w:tc>
+          <w:tcPr>
+            <w:tcW w:type="dxa" w:w="2268"/>
           </w:tcPr>
           <w:p>
             <w:pPr>
@@ -5913,7 +5913,7 @@
         </w:tc>
         <w:tc>
           <w:tcPr>
-            <w:tcW w:type="dxa" w:w="3969"/>
+            <w:tcW w:type="dxa" w:w="3402"/>
           </w:tcPr>
           <w:p>
             <w:pPr>
@@ -5975,10 +5975,10 @@
         <w:tblLook w:firstColumn="1" w:firstRow="1" w:lastColumn="0" w:lastRow="0" w:noHBand="0" w:noVBand="1" w:val="04A0"/>
       </w:tblPr>
       <w:tblGrid>
-        <w:gridCol w:w="2436"/>
-        <w:gridCol w:w="2436"/>
-        <w:gridCol w:w="2436"/>
-        <w:gridCol w:w="2436"/>
+        <w:gridCol w:w="1304"/>
+        <w:gridCol w:w="2494"/>
+        <w:gridCol w:w="2835"/>
+        <w:gridCol w:w="2778"/>
       </w:tblGrid>
       <w:tr>
         <w:tc>
@@ -6270,10 +6270,10 @@
         <w:tblLook w:firstColumn="1" w:firstRow="1" w:lastColumn="0" w:lastRow="0" w:noHBand="0" w:noVBand="1" w:val="04A0"/>
       </w:tblPr>
       <w:tblGrid>
-        <w:gridCol w:w="2436"/>
-        <w:gridCol w:w="2436"/>
-        <w:gridCol w:w="2436"/>
-        <w:gridCol w:w="2436"/>
+        <w:gridCol w:w="1304"/>
+        <w:gridCol w:w="2494"/>
+        <w:gridCol w:w="2835"/>
+        <w:gridCol w:w="2778"/>
       </w:tblGrid>
       <w:tr>
         <w:tc>
@@ -6565,10 +6565,10 @@
         <w:tblLook w:firstColumn="1" w:firstRow="1" w:lastColumn="0" w:lastRow="0" w:noHBand="0" w:noVBand="1" w:val="04A0"/>
       </w:tblPr>
       <w:tblGrid>
-        <w:gridCol w:w="2436"/>
-        <w:gridCol w:w="2436"/>
-        <w:gridCol w:w="2436"/>
-        <w:gridCol w:w="2436"/>
+        <w:gridCol w:w="1304"/>
+        <w:gridCol w:w="2494"/>
+        <w:gridCol w:w="2835"/>
+        <w:gridCol w:w="2778"/>
       </w:tblGrid>
       <w:tr>
         <w:tc>
@@ -6946,10 +6946,10 @@
         <w:tblLook w:firstColumn="1" w:firstRow="1" w:lastColumn="0" w:lastRow="0" w:noHBand="0" w:noVBand="1" w:val="04A0"/>
       </w:tblPr>
       <w:tblGrid>
-        <w:gridCol w:w="2436"/>
-        <w:gridCol w:w="2436"/>
-        <w:gridCol w:w="2436"/>
-        <w:gridCol w:w="2436"/>
+        <w:gridCol w:w="1304"/>
+        <w:gridCol w:w="2494"/>
+        <w:gridCol w:w="2835"/>
+        <w:gridCol w:w="2778"/>
       </w:tblGrid>
       <w:tr>
         <w:tc>
@@ -7155,10 +7155,10 @@
         <w:tblLook w:firstColumn="1" w:firstRow="1" w:lastColumn="0" w:lastRow="0" w:noHBand="0" w:noVBand="1" w:val="04A0"/>
       </w:tblPr>
       <w:tblGrid>
-        <w:gridCol w:w="2436"/>
-        <w:gridCol w:w="2436"/>
-        <w:gridCol w:w="2436"/>
-        <w:gridCol w:w="2436"/>
+        <w:gridCol w:w="1304"/>
+        <w:gridCol w:w="2494"/>
+        <w:gridCol w:w="2835"/>
+        <w:gridCol w:w="2778"/>
       </w:tblGrid>
       <w:tr>
         <w:tc>
@@ -7450,10 +7450,10 @@
         <w:tblLook w:firstColumn="1" w:firstRow="1" w:lastColumn="0" w:lastRow="0" w:noHBand="0" w:noVBand="1" w:val="04A0"/>
       </w:tblPr>
       <w:tblGrid>
-        <w:gridCol w:w="2436"/>
-        <w:gridCol w:w="2436"/>
-        <w:gridCol w:w="2436"/>
-        <w:gridCol w:w="2436"/>
+        <w:gridCol w:w="1304"/>
+        <w:gridCol w:w="2494"/>
+        <w:gridCol w:w="2835"/>
+        <w:gridCol w:w="2778"/>
       </w:tblGrid>
       <w:tr>
         <w:tc>
@@ -7659,10 +7659,10 @@
         <w:tblLook w:firstColumn="1" w:firstRow="1" w:lastColumn="0" w:lastRow="0" w:noHBand="0" w:noVBand="1" w:val="04A0"/>
       </w:tblPr>
       <w:tblGrid>
-        <w:gridCol w:w="2436"/>
-        <w:gridCol w:w="2436"/>
-        <w:gridCol w:w="2436"/>
-        <w:gridCol w:w="2436"/>
+        <w:gridCol w:w="1304"/>
+        <w:gridCol w:w="2494"/>
+        <w:gridCol w:w="2835"/>
+        <w:gridCol w:w="2778"/>
       </w:tblGrid>
       <w:tr>
         <w:tc>
@@ -7954,10 +7954,10 @@
         <w:tblLook w:firstColumn="1" w:firstRow="1" w:lastColumn="0" w:lastRow="0" w:noHBand="0" w:noVBand="1" w:val="04A0"/>
       </w:tblPr>
       <w:tblGrid>
-        <w:gridCol w:w="2436"/>
-        <w:gridCol w:w="2436"/>
-        <w:gridCol w:w="2436"/>
-        <w:gridCol w:w="2436"/>
+        <w:gridCol w:w="1304"/>
+        <w:gridCol w:w="2494"/>
+        <w:gridCol w:w="2835"/>
+        <w:gridCol w:w="2778"/>
       </w:tblGrid>
       <w:tr>
         <w:tc>
@@ -8249,10 +8249,10 @@
         <w:tblLook w:firstColumn="1" w:firstRow="1" w:lastColumn="0" w:lastRow="0" w:noHBand="0" w:noVBand="1" w:val="04A0"/>
       </w:tblPr>
       <w:tblGrid>
-        <w:gridCol w:w="2436"/>
-        <w:gridCol w:w="2436"/>
-        <w:gridCol w:w="2436"/>
-        <w:gridCol w:w="2436"/>
+        <w:gridCol w:w="1304"/>
+        <w:gridCol w:w="2494"/>
+        <w:gridCol w:w="2835"/>
+        <w:gridCol w:w="2778"/>
       </w:tblGrid>
       <w:tr>
         <w:tc>
@@ -9850,10 +9850,10 @@
         <w:tblLook w:firstColumn="1" w:firstRow="1" w:lastColumn="0" w:lastRow="0" w:noHBand="0" w:noVBand="1" w:val="04A0"/>
       </w:tblPr>
       <w:tblGrid>
-        <w:gridCol w:w="2436"/>
-        <w:gridCol w:w="2436"/>
-        <w:gridCol w:w="2436"/>
-        <w:gridCol w:w="2436"/>
+        <w:gridCol w:w="1304"/>
+        <w:gridCol w:w="2494"/>
+        <w:gridCol w:w="2835"/>
+        <w:gridCol w:w="2778"/>
       </w:tblGrid>
       <w:tr>
         <w:tc>
@@ -10945,6 +10945,56 @@
           <w:sz w:val="24"/>
         </w:rPr>
         <w:t>Mock Ups</w:t>
+      </w:r>
+    </w:p>
+    <w:p>
+      <w:pPr>
+        <w:jc w:val="both"/>
+      </w:pPr>
+      <w:r>
+        <w:rPr>
+          <w:rFonts w:ascii="Arial" w:hAnsi="Arial" w:cs="Arial" w:eastAsia="Arial"/>
+          <w:b w:val="0"/>
+          <w:color w:val="000000"/>
+          <w:sz w:val="22"/>
+        </w:rPr>
+        <w:t xml:space="preserve">Try the clickable prototype: </w:t>
+      </w:r>
+      <w:r>
+        <w:rPr>
+          <w:rFonts w:ascii="Arial" w:hAnsi="Arial" w:cs="Arial" w:eastAsia="Arial"/>
+          <w:b/>
+          <w:color w:val="000000"/>
+          <w:sz w:val="22"/>
+        </w:rPr>
+        <w:t>Franchisor Dashboard</w:t>
+      </w:r>
+      <w:r>
+        <w:rPr>
+          <w:rFonts w:ascii="Arial" w:hAnsi="Arial" w:cs="Arial" w:eastAsia="Arial"/>
+          <w:b w:val="0"/>
+          <w:color w:val="000000"/>
+          <w:sz w:val="22"/>
+        </w:rPr>
+        <w:t xml:space="preserve"> https://kopikomapartnerportal.vercel.app (password demo123) and </w:t>
+      </w:r>
+      <w:r>
+        <w:rPr>
+          <w:rFonts w:ascii="Arial" w:hAnsi="Arial" w:cs="Arial" w:eastAsia="Arial"/>
+          <w:b/>
+          <w:color w:val="000000"/>
+          <w:sz w:val="22"/>
+        </w:rPr>
+        <w:t>Partner Portal</w:t>
+      </w:r>
+      <w:r>
+        <w:rPr>
+          <w:rFonts w:ascii="Arial" w:hAnsi="Arial" w:cs="Arial" w:eastAsia="Arial"/>
+          <w:b w:val="0"/>
+          <w:color w:val="000000"/>
+          <w:sz w:val="22"/>
+        </w:rPr>
+        <w:t xml:space="preserve"> https://kopikomapartnerportal.vercel.app/mitra</w:t>
       </w:r>
     </w:p>
     <w:tbl>
@@ -12358,7 +12408,7 @@
                 <w:color w:val="000000"/>
                 <w:sz w:val="22"/>
               </w:rPr>
-              <w:t>Case and process</w:t>
+              <w:t>Pain points and flow</w:t>
             </w:r>
           </w:p>
         </w:tc>
@@ -12379,7 +12429,7 @@
                 <w:color w:val="000000"/>
                 <w:sz w:val="22"/>
               </w:rPr>
-              <w:t>Explored client profiles, pain points, and flow options</w:t>
+              <w:t>Reviewed my pain points and flow, pointed out edge cases (for example, where a location change should go back to), and proposed options for business rules</w:t>
             </w:r>
           </w:p>
         </w:tc>
@@ -12400,7 +12450,7 @@
                 <w:color w:val="000000"/>
                 <w:sz w:val="22"/>
               </w:rPr>
-              <w:t>Chose the scope and simplified the flow and rules</w:t>
+              <w:t>Defined the scope and pain points and designed the end-to-end flow, then decided which suggestions to accept</w:t>
             </w:r>
           </w:p>
         </w:tc>

</xml_diff>

<commit_message>
AI log: include Claude chat excerpts; update Use of AI table
Co-Authored-By: Claude Opus 5.5 <noreply@anthropic.com>
Claude-Session: https://claude.ai/code/session_01MyaJcnNN6cea99ff9yeVti
</commit_message>
<xml_diff>
--- a/prd/EDTS APM 2027 - Nadia Rahma Prasanti - Universitas Indonesia.docx
+++ b/prd/EDTS APM 2027 - Nadia Rahma Prasanti - Universitas Indonesia.docx
@@ -12408,7 +12408,7 @@
                 <w:color w:val="000000"/>
                 <w:sz w:val="22"/>
               </w:rPr>
-              <w:t>Pain points and flow</w:t>
+              <w:t>Understanding the case</w:t>
             </w:r>
           </w:p>
         </w:tc>
@@ -12429,7 +12429,7 @@
                 <w:color w:val="000000"/>
                 <w:sz w:val="22"/>
               </w:rPr>
-              <w:t>Reviewed my pain points and flow, pointed out edge cases (for example, where a location change should go back to), and proposed options for business rules</w:t>
+              <w:t>Explained the brief, clarified the scope (a franchise recruitment portal, not an ERP), and suggested the F&amp;B sector with supporting data</w:t>
             </w:r>
           </w:p>
         </w:tc>
@@ -12450,7 +12450,7 @@
                 <w:color w:val="000000"/>
                 <w:sz w:val="22"/>
               </w:rPr>
-              <w:t>Defined the scope and pain points and designed the end-to-end flow, then decided which suggestions to accept</w:t>
+              <w:t>Chose the sector, the franchisor point of view, and the scope</w:t>
             </w:r>
           </w:p>
         </w:tc>
@@ -12473,6 +12473,71 @@
                 <w:color w:val="000000"/>
                 <w:sz w:val="22"/>
               </w:rPr>
+              <w:t>Pain points, features, and flow</w:t>
+            </w:r>
+          </w:p>
+        </w:tc>
+        <w:tc>
+          <w:tcPr>
+            <w:tcW w:type="dxa" w:w="3249"/>
+          </w:tcPr>
+          <w:p>
+            <w:pPr>
+              <w:spacing w:after="0"/>
+              <w:jc w:val="left"/>
+            </w:pPr>
+            <w:r/>
+            <w:r>
+              <w:rPr>
+                <w:rFonts w:ascii="Arial" w:hAnsi="Arial" w:cs="Arial" w:eastAsia="Arial"/>
+                <w:b w:val="0"/>
+                <w:color w:val="000000"/>
+                <w:sz w:val="22"/>
+              </w:rPr>
+              <w:t>Proposed an initial pain point list, MVP feature list (MoSCoW), and funnel stages; reviewed my flow and pointed out edge cases</w:t>
+            </w:r>
+          </w:p>
+        </w:tc>
+        <w:tc>
+          <w:tcPr>
+            <w:tcW w:type="dxa" w:w="3249"/>
+          </w:tcPr>
+          <w:p>
+            <w:pPr>
+              <w:spacing w:after="0"/>
+              <w:jc w:val="left"/>
+            </w:pPr>
+            <w:r/>
+            <w:r>
+              <w:rPr>
+                <w:rFonts w:ascii="Arial" w:hAnsi="Arial" w:cs="Arial" w:eastAsia="Arial"/>
+                <w:b w:val="0"/>
+                <w:color w:val="000000"/>
+                <w:sz w:val="22"/>
+              </w:rPr>
+              <w:t>Finalized the pain points and defined the business process (stages, PIC, deadlines, and approval rules), designed the end-to-end flow, added features such as Target vs Achievement, sales performance, notifications, and roles, then decided which suggestions to accept</w:t>
+            </w:r>
+          </w:p>
+        </w:tc>
+      </w:tr>
+      <w:tr>
+        <w:tc>
+          <w:tcPr>
+            <w:tcW w:type="dxa" w:w="3249"/>
+          </w:tcPr>
+          <w:p>
+            <w:pPr>
+              <w:spacing w:after="0"/>
+              <w:jc w:val="left"/>
+            </w:pPr>
+            <w:r/>
+            <w:r>
+              <w:rPr>
+                <w:rFonts w:ascii="Arial" w:hAnsi="Arial" w:cs="Arial" w:eastAsia="Arial"/>
+                <w:b w:val="0"/>
+                <w:color w:val="000000"/>
+                <w:sz w:val="22"/>
+              </w:rPr>
               <w:t>Prototype</w:t>
             </w:r>
           </w:p>
@@ -12494,7 +12559,7 @@
                 <w:color w:val="000000"/>
                 <w:sz w:val="22"/>
               </w:rPr>
-              <w:t>Built the HTML prototype through Claude Code over many feedback rounds</w:t>
+              <w:t>Built the HTML prototype, first in Claude chat and then in Claude Code, over many feedback rounds</w:t>
             </w:r>
           </w:p>
         </w:tc>
@@ -12864,7 +12929,7 @@
           <w:color w:val="000000"/>
           <w:sz w:val="22"/>
         </w:rPr>
-        <w:t>[Attach screenshots or a PDF of the AI conversation here.]</w:t>
+        <w:t>The AI conversation log is attached as a separate PDF.</w:t>
       </w:r>
     </w:p>
     <w:sectPr>

</xml_diff>

<commit_message>
AI log and PRD: drop case-understanding and writing rows
Co-Authored-By: Claude Opus 5.5 <noreply@anthropic.com>
Claude-Session: https://claude.ai/code/session_01MyaJcnNN6cea99ff9yeVti
</commit_message>
<xml_diff>
--- a/prd/EDTS APM 2027 - Nadia Rahma Prasanti - Universitas Indonesia.docx
+++ b/prd/EDTS APM 2027 - Nadia Rahma Prasanti - Universitas Indonesia.docx
@@ -12408,7 +12408,7 @@
                 <w:color w:val="000000"/>
                 <w:sz w:val="22"/>
               </w:rPr>
-              <w:t>Understanding the case</w:t>
+              <w:t>Pain points, features, and flow</w:t>
             </w:r>
           </w:p>
         </w:tc>
@@ -12429,7 +12429,7 @@
                 <w:color w:val="000000"/>
                 <w:sz w:val="22"/>
               </w:rPr>
-              <w:t>Explained the brief, clarified the scope (a franchise recruitment portal, not an ERP), and suggested the F&amp;B sector with supporting data</w:t>
+              <w:t>Proposed an initial pain point list, MVP feature list (MoSCoW), and funnel stages; reviewed my flow and pointed out edge cases</w:t>
             </w:r>
           </w:p>
         </w:tc>
@@ -12450,7 +12450,7 @@
                 <w:color w:val="000000"/>
                 <w:sz w:val="22"/>
               </w:rPr>
-              <w:t>Chose the sector, the franchisor point of view, and the scope</w:t>
+              <w:t>Finalized the pain points and defined the business process (stages, PIC, deadlines, and approval rules), designed the end-to-end flow, added features such as Target vs Achievement, sales performance, notifications, and roles, then decided which suggestions to accept</w:t>
             </w:r>
           </w:p>
         </w:tc>
@@ -12473,7 +12473,7 @@
                 <w:color w:val="000000"/>
                 <w:sz w:val="22"/>
               </w:rPr>
-              <w:t>Pain points, features, and flow</w:t>
+              <w:t>Prototype</w:t>
             </w:r>
           </w:p>
         </w:tc>
@@ -12494,7 +12494,7 @@
                 <w:color w:val="000000"/>
                 <w:sz w:val="22"/>
               </w:rPr>
-              <w:t>Proposed an initial pain point list, MVP feature list (MoSCoW), and funnel stages; reviewed my flow and pointed out edge cases</w:t>
+              <w:t>Built the HTML prototype, first in Claude chat and then in Claude Code, over many feedback rounds</w:t>
             </w:r>
           </w:p>
         </w:tc>
@@ -12515,7 +12515,7 @@
                 <w:color w:val="000000"/>
                 <w:sz w:val="22"/>
               </w:rPr>
-              <w:t>Finalized the pain points and defined the business process (stages, PIC, deadlines, and approval rules), designed the end-to-end flow, added features such as Target vs Achievement, sales performance, notifications, and roles, then decided which suggestions to accept</w:t>
+              <w:t>Reviewed each version and decided layout, wording, and terminology</w:t>
             </w:r>
           </w:p>
         </w:tc>
@@ -12538,7 +12538,7 @@
                 <w:color w:val="000000"/>
                 <w:sz w:val="22"/>
               </w:rPr>
-              <w:t>Prototype</w:t>
+              <w:t>Testing</w:t>
             </w:r>
           </w:p>
         </w:tc>
@@ -12559,7 +12559,7 @@
                 <w:color w:val="000000"/>
                 <w:sz w:val="22"/>
               </w:rPr>
-              <w:t>Built the HTML prototype, first in Claude chat and then in Claude Code, over many feedback rounds</w:t>
+              <w:t>Ran automated browser tests on every role and screen size</w:t>
             </w:r>
           </w:p>
         </w:tc>
@@ -12580,7 +12580,7 @@
                 <w:color w:val="000000"/>
                 <w:sz w:val="22"/>
               </w:rPr>
-              <w:t>Reviewed each version and decided layout, wording, and terminology</w:t>
+              <w:t>Defined what "correct" means and checked results</w:t>
             </w:r>
           </w:p>
         </w:tc>
@@ -12603,7 +12603,7 @@
                 <w:color w:val="000000"/>
                 <w:sz w:val="22"/>
               </w:rPr>
-              <w:t>Testing</w:t>
+              <w:t>Research</w:t>
             </w:r>
           </w:p>
         </w:tc>
@@ -12624,7 +12624,7 @@
                 <w:color w:val="000000"/>
                 <w:sz w:val="22"/>
               </w:rPr>
-              <w:t>Ran automated browser tests on every role and screen size</w:t>
+              <w:t>Searched industry and regulation data</w:t>
             </w:r>
           </w:p>
         </w:tc>
@@ -12645,137 +12645,7 @@
                 <w:color w:val="000000"/>
                 <w:sz w:val="22"/>
               </w:rPr>
-              <w:t>Defined what "correct" means and checked results</w:t>
-            </w:r>
-          </w:p>
-        </w:tc>
-      </w:tr>
-      <w:tr>
-        <w:tc>
-          <w:tcPr>
-            <w:tcW w:type="dxa" w:w="3249"/>
-          </w:tcPr>
-          <w:p>
-            <w:pPr>
-              <w:spacing w:after="0"/>
-              <w:jc w:val="left"/>
-            </w:pPr>
-            <w:r/>
-            <w:r>
-              <w:rPr>
-                <w:rFonts w:ascii="Arial" w:hAnsi="Arial" w:cs="Arial" w:eastAsia="Arial"/>
-                <w:b w:val="0"/>
-                <w:color w:val="000000"/>
-                <w:sz w:val="22"/>
-              </w:rPr>
-              <w:t>Research</w:t>
-            </w:r>
-          </w:p>
-        </w:tc>
-        <w:tc>
-          <w:tcPr>
-            <w:tcW w:type="dxa" w:w="3249"/>
-          </w:tcPr>
-          <w:p>
-            <w:pPr>
-              <w:spacing w:after="0"/>
-              <w:jc w:val="left"/>
-            </w:pPr>
-            <w:r/>
-            <w:r>
-              <w:rPr>
-                <w:rFonts w:ascii="Arial" w:hAnsi="Arial" w:cs="Arial" w:eastAsia="Arial"/>
-                <w:b w:val="0"/>
-                <w:color w:val="000000"/>
-                <w:sz w:val="22"/>
-              </w:rPr>
-              <w:t>Searched industry and regulation data</w:t>
-            </w:r>
-          </w:p>
-        </w:tc>
-        <w:tc>
-          <w:tcPr>
-            <w:tcW w:type="dxa" w:w="3249"/>
-          </w:tcPr>
-          <w:p>
-            <w:pPr>
-              <w:spacing w:after="0"/>
-              <w:jc w:val="left"/>
-            </w:pPr>
-            <w:r/>
-            <w:r>
-              <w:rPr>
-                <w:rFonts w:ascii="Arial" w:hAnsi="Arial" w:cs="Arial" w:eastAsia="Arial"/>
-                <w:b w:val="0"/>
-                <w:color w:val="000000"/>
-                <w:sz w:val="22"/>
-              </w:rPr>
               <w:t>Verified sources, corrected an outdated statistic and replaced PP No. 42/2007 with PP No. 35/2024</w:t>
-            </w:r>
-          </w:p>
-        </w:tc>
-      </w:tr>
-      <w:tr>
-        <w:tc>
-          <w:tcPr>
-            <w:tcW w:type="dxa" w:w="3249"/>
-          </w:tcPr>
-          <w:p>
-            <w:pPr>
-              <w:spacing w:after="0"/>
-              <w:jc w:val="left"/>
-            </w:pPr>
-            <w:r/>
-            <w:r>
-              <w:rPr>
-                <w:rFonts w:ascii="Arial" w:hAnsi="Arial" w:cs="Arial" w:eastAsia="Arial"/>
-                <w:b w:val="0"/>
-                <w:color w:val="000000"/>
-                <w:sz w:val="22"/>
-              </w:rPr>
-              <w:t>Writing</w:t>
-            </w:r>
-          </w:p>
-        </w:tc>
-        <w:tc>
-          <w:tcPr>
-            <w:tcW w:type="dxa" w:w="3249"/>
-          </w:tcPr>
-          <w:p>
-            <w:pPr>
-              <w:spacing w:after="0"/>
-              <w:jc w:val="left"/>
-            </w:pPr>
-            <w:r/>
-            <w:r>
-              <w:rPr>
-                <w:rFonts w:ascii="Arial" w:hAnsi="Arial" w:cs="Arial" w:eastAsia="Arial"/>
-                <w:b w:val="0"/>
-                <w:color w:val="000000"/>
-                <w:sz w:val="22"/>
-              </w:rPr>
-              <w:t>Drafted this document from the prototype</w:t>
-            </w:r>
-          </w:p>
-        </w:tc>
-        <w:tc>
-          <w:tcPr>
-            <w:tcW w:type="dxa" w:w="3249"/>
-          </w:tcPr>
-          <w:p>
-            <w:pPr>
-              <w:spacing w:after="0"/>
-              <w:jc w:val="left"/>
-            </w:pPr>
-            <w:r/>
-            <w:r>
-              <w:rPr>
-                <w:rFonts w:ascii="Arial" w:hAnsi="Arial" w:cs="Arial" w:eastAsia="Arial"/>
-                <w:b w:val="0"/>
-                <w:color w:val="000000"/>
-                <w:sz w:val="22"/>
-              </w:rPr>
-              <w:t>Restructured and edited it</w:t>
             </w:r>
           </w:p>
         </w:tc>

</xml_diff>

<commit_message>
AI log and PRD: replace research with development and deployment
Co-Authored-By: Claude Opus 5.5 <noreply@anthropic.com>
Claude-Session: https://claude.ai/code/session_01MyaJcnNN6cea99ff9yeVti
</commit_message>
<xml_diff>
--- a/prd/EDTS APM 2027 - Nadia Rahma Prasanti - Universitas Indonesia.docx
+++ b/prd/EDTS APM 2027 - Nadia Rahma Prasanti - Universitas Indonesia.docx
@@ -12603,7 +12603,7 @@
                 <w:color w:val="000000"/>
                 <w:sz w:val="22"/>
               </w:rPr>
-              <w:t>Research</w:t>
+              <w:t>Development and deployment</w:t>
             </w:r>
           </w:p>
         </w:tc>
@@ -12624,7 +12624,7 @@
                 <w:color w:val="000000"/>
                 <w:sz w:val="22"/>
               </w:rPr>
-              <w:t>Searched industry and regulation data</w:t>
+              <w:t>Set up the GitHub repository, pushed every revision, and guided the Vercel deployment so the live prototype updates automatically on each push</w:t>
             </w:r>
           </w:p>
         </w:tc>
@@ -12645,7 +12645,7 @@
                 <w:color w:val="000000"/>
                 <w:sz w:val="22"/>
               </w:rPr>
-              <w:t>Verified sources, corrected an outdated statistic and replaced PP No. 42/2007 with PP No. 35/2024</w:t>
+              <w:t>Created the Vercel project, connected it to GitHub, and checked each deployed version</w:t>
             </w:r>
           </w:p>
         </w:tc>

</xml_diff>

<commit_message>
Track Privy agreement signing per application; add FAQ to partner portal
Co-Authored-By: Claude Opus 5.5 <noreply@anthropic.com>
Claude-Session: https://claude.ai/code/session_01MyaJcnNN6cea99ff9yeVti
</commit_message>
<xml_diff>
--- a/prd/EDTS APM 2027 - Nadia Rahma Prasanti - Universitas Indonesia.docx
+++ b/prd/EDTS APM 2027 - Nadia Rahma Prasanti - Universitas Indonesia.docx
@@ -655,7 +655,7 @@
           <w:color w:val="000000"/>
           <w:sz w:val="22"/>
         </w:rPr>
-        <w:t>Out of scope: everything after both parties approve (agreement signing, outlet opening, royalty). Signing through Privy is shown only as the next step.</w:t>
+        <w:t>Out of scope: outlet opening and royalty. After approval, the franchise agreement is signed through Privy, and its signing status is tracked on each application.</w:t>
       </w:r>
     </w:p>
     <w:p>
@@ -7626,7 +7626,93 @@
                 <w:color w:val="000000"/>
                 <w:sz w:val="22"/>
               </w:rPr>
-              <w:t>Approve: 2 of 2, revenue counted, Privy next step shown. Candidate sees the result in the tracker.</w:t>
+              <w:t>Approve: 2 of 2, revenue counted, agreement sent through Privy. Candidate sees the result in the tracker.</w:t>
+            </w:r>
+          </w:p>
+        </w:tc>
+      </w:tr>
+      <w:tr>
+        <w:tc>
+          <w:tcPr>
+            <w:tcW w:type="dxa" w:w="1304"/>
+          </w:tcPr>
+          <w:p>
+            <w:pPr>
+              <w:spacing w:after="0"/>
+              <w:jc w:val="left"/>
+            </w:pPr>
+            <w:r/>
+            <w:r>
+              <w:rPr>
+                <w:rFonts w:ascii="Arial" w:hAnsi="Arial" w:cs="Arial" w:eastAsia="Arial"/>
+                <w:b w:val="0"/>
+                <w:color w:val="000000"/>
+                <w:sz w:val="22"/>
+              </w:rPr>
+              <w:t>FR-F-002</w:t>
+            </w:r>
+          </w:p>
+        </w:tc>
+        <w:tc>
+          <w:tcPr>
+            <w:tcW w:type="dxa" w:w="2494"/>
+          </w:tcPr>
+          <w:p>
+            <w:pPr>
+              <w:spacing w:after="0"/>
+              <w:jc w:val="left"/>
+            </w:pPr>
+            <w:r/>
+            <w:r>
+              <w:rPr>
+                <w:rFonts w:ascii="Arial" w:hAnsi="Arial" w:cs="Arial" w:eastAsia="Arial"/>
+                <w:b w:val="0"/>
+                <w:color w:val="000000"/>
+                <w:sz w:val="22"/>
+              </w:rPr>
+              <w:t>As a Manager, I want to see whether each agreement is signed so that I know which closed deals are complete.</w:t>
+            </w:r>
+          </w:p>
+        </w:tc>
+        <w:tc>
+          <w:tcPr>
+            <w:tcW w:type="dxa" w:w="2835"/>
+          </w:tcPr>
+          <w:p>
+            <w:pPr>
+              <w:spacing w:after="0"/>
+              <w:jc w:val="left"/>
+            </w:pPr>
+            <w:r/>
+            <w:r>
+              <w:rPr>
+                <w:rFonts w:ascii="Arial" w:hAnsi="Arial" w:cs="Arial" w:eastAsia="Arial"/>
+                <w:b w:val="0"/>
+                <w:color w:val="000000"/>
+                <w:sz w:val="22"/>
+              </w:rPr>
+              <w:t>Signing status per party (candidate and Kopi Koma) updated from Privy. The Manager signs for Kopi Koma from the application detail.</w:t>
+            </w:r>
+          </w:p>
+        </w:tc>
+        <w:tc>
+          <w:tcPr>
+            <w:tcW w:type="dxa" w:w="2778"/>
+          </w:tcPr>
+          <w:p>
+            <w:pPr>
+              <w:spacing w:after="0"/>
+              <w:jc w:val="left"/>
+            </w:pPr>
+            <w:r/>
+            <w:r>
+              <w:rPr>
+                <w:rFonts w:ascii="Arial" w:hAnsi="Arial" w:cs="Arial" w:eastAsia="Arial"/>
+                <w:b w:val="0"/>
+                <w:color w:val="000000"/>
+                <w:sz w:val="22"/>
+              </w:rPr>
+              <w:t>Completed table shows "Not signed", "Waiting for candidate or Kopi Koma", or "Signed". Each signature is logged, and sales is notified when both have signed.</w:t>
             </w:r>
           </w:p>
         </w:tc>
@@ -10049,7 +10135,7 @@
                 <w:color w:val="000000"/>
                 <w:sz w:val="22"/>
               </w:rPr>
-              <w:t>FR-P2-001</w:t>
+              <w:t>FR-P1-002</w:t>
             </w:r>
           </w:p>
         </w:tc>
@@ -10070,7 +10156,7 @@
                 <w:color w:val="000000"/>
                 <w:sz w:val="22"/>
               </w:rPr>
-              <w:t>As a candidate, I want to check my status so that I do not need to ask.</w:t>
+              <w:t>As a candidate, I want answers to common questions so that I can decide before registering.</w:t>
             </w:r>
           </w:p>
         </w:tc>
@@ -10091,7 +10177,7 @@
                 <w:color w:val="000000"/>
                 <w:sz w:val="22"/>
               </w:rPr>
-              <w:t>Lookup by application number plus email or phone. 7-step tracker with the sales' contact.</w:t>
+              <w:t>FAQ on the registration page: packages, costs, royalty, timeline, location, documents, payment, data privacy, and signing.</w:t>
             </w:r>
           </w:p>
         </w:tc>
@@ -10112,7 +10198,7 @@
                 <w:color w:val="000000"/>
                 <w:sz w:val="22"/>
               </w:rPr>
-              <w:t>Wrong combination shows an error without revealing data.</w:t>
+              <w:t>Questions expand on click. A "Lihat FAQ" link at the top jumps to the section.</w:t>
             </w:r>
           </w:p>
         </w:tc>
@@ -10135,6 +10221,92 @@
                 <w:color w:val="000000"/>
                 <w:sz w:val="22"/>
               </w:rPr>
+              <w:t>FR-P2-001</w:t>
+            </w:r>
+          </w:p>
+        </w:tc>
+        <w:tc>
+          <w:tcPr>
+            <w:tcW w:type="dxa" w:w="2494"/>
+          </w:tcPr>
+          <w:p>
+            <w:pPr>
+              <w:spacing w:after="0"/>
+              <w:jc w:val="left"/>
+            </w:pPr>
+            <w:r/>
+            <w:r>
+              <w:rPr>
+                <w:rFonts w:ascii="Arial" w:hAnsi="Arial" w:cs="Arial" w:eastAsia="Arial"/>
+                <w:b w:val="0"/>
+                <w:color w:val="000000"/>
+                <w:sz w:val="22"/>
+              </w:rPr>
+              <w:t>As a candidate, I want to check my status so that I do not need to ask.</w:t>
+            </w:r>
+          </w:p>
+        </w:tc>
+        <w:tc>
+          <w:tcPr>
+            <w:tcW w:type="dxa" w:w="2835"/>
+          </w:tcPr>
+          <w:p>
+            <w:pPr>
+              <w:spacing w:after="0"/>
+              <w:jc w:val="left"/>
+            </w:pPr>
+            <w:r/>
+            <w:r>
+              <w:rPr>
+                <w:rFonts w:ascii="Arial" w:hAnsi="Arial" w:cs="Arial" w:eastAsia="Arial"/>
+                <w:b w:val="0"/>
+                <w:color w:val="000000"/>
+                <w:sz w:val="22"/>
+              </w:rPr>
+              <w:t>Lookup by application number plus email or phone. 7-step tracker with the sales' contact.</w:t>
+            </w:r>
+          </w:p>
+        </w:tc>
+        <w:tc>
+          <w:tcPr>
+            <w:tcW w:type="dxa" w:w="2778"/>
+          </w:tcPr>
+          <w:p>
+            <w:pPr>
+              <w:spacing w:after="0"/>
+              <w:jc w:val="left"/>
+            </w:pPr>
+            <w:r/>
+            <w:r>
+              <w:rPr>
+                <w:rFonts w:ascii="Arial" w:hAnsi="Arial" w:cs="Arial" w:eastAsia="Arial"/>
+                <w:b w:val="0"/>
+                <w:color w:val="000000"/>
+                <w:sz w:val="22"/>
+              </w:rPr>
+              <w:t>Wrong combination shows an error without revealing data.</w:t>
+            </w:r>
+          </w:p>
+        </w:tc>
+      </w:tr>
+      <w:tr>
+        <w:tc>
+          <w:tcPr>
+            <w:tcW w:type="dxa" w:w="1304"/>
+          </w:tcPr>
+          <w:p>
+            <w:pPr>
+              <w:spacing w:after="0"/>
+              <w:jc w:val="left"/>
+            </w:pPr>
+            <w:r/>
+            <w:r>
+              <w:rPr>
+                <w:rFonts w:ascii="Arial" w:hAnsi="Arial" w:cs="Arial" w:eastAsia="Arial"/>
+                <w:b w:val="0"/>
+                <w:color w:val="000000"/>
+                <w:sz w:val="22"/>
+              </w:rPr>
               <w:t>FR-P3-001</w:t>
             </w:r>
           </w:p>
@@ -10198,7 +10370,7 @@
                 <w:color w:val="000000"/>
                 <w:sz w:val="22"/>
               </w:rPr>
-              <w:t>Agree logs approval 1 of 2. After final approval, the Privy next step is shown.</w:t>
+              <w:t>Agree logs approval 1 of 2. After final approval, the candidate can sign the agreement through Privy from the tracker.</w:t>
             </w:r>
           </w:p>
         </w:tc>
@@ -12098,7 +12270,7 @@
                 <w:color w:val="000000"/>
                 <w:sz w:val="22"/>
               </w:rPr>
-              <w:t>Privy e-signature, WhatsApp notifications, real map data, KYC document verification</w:t>
+              <w:t>Live Privy API integration, WhatsApp notifications, real map data, KYC document verification</w:t>
             </w:r>
           </w:p>
         </w:tc>
@@ -12280,7 +12452,7 @@
           <w:color w:val="000000"/>
           <w:sz w:val="22"/>
         </w:rPr>
-        <w:t>Emails are simulated as dashboard notifications. Privy is not integrated.</w:t>
+        <w:t>Emails are simulated as dashboard notifications. Privy signing is simulated: the sign buttons stand in for the Privy signing page and status update.</w:t>
       </w:r>
     </w:p>
     <w:p>

</xml_diff>

<commit_message>
Restrict Privy status and document to Super Admin, Manager, and assigned sales
Co-Authored-By: Claude Opus 5.5 <noreply@anthropic.com>
Claude-Session: https://claude.ai/code/session_01MyaJcnNN6cea99ff9yeVti
</commit_message>
<xml_diff>
--- a/prd/EDTS APM 2027 - Nadia Rahma Prasanti - Universitas Indonesia.docx
+++ b/prd/EDTS APM 2027 - Nadia Rahma Prasanti - Universitas Indonesia.docx
@@ -9627,6 +9627,134 @@
                 <w:sz w:val="22"/>
               </w:rPr>
               <w:t>Yes</w:t>
+            </w:r>
+          </w:p>
+        </w:tc>
+        <w:tc>
+          <w:tcPr>
+            <w:tcW w:type="dxa" w:w="1624"/>
+          </w:tcPr>
+          <w:p>
+            <w:pPr>
+              <w:spacing w:after="0"/>
+              <w:jc w:val="left"/>
+            </w:pPr>
+            <w:r/>
+            <w:r>
+              <w:rPr>
+                <w:rFonts w:ascii="Arial" w:hAnsi="Arial" w:cs="Arial" w:eastAsia="Arial"/>
+                <w:b w:val="0"/>
+                <w:color w:val="000000"/>
+                <w:sz w:val="22"/>
+              </w:rPr>
+              <w:t>Own</w:t>
+            </w:r>
+          </w:p>
+        </w:tc>
+      </w:tr>
+      <w:tr>
+        <w:tc>
+          <w:tcPr>
+            <w:tcW w:type="dxa" w:w="1624"/>
+          </w:tcPr>
+          <w:p>
+            <w:pPr>
+              <w:spacing w:after="0"/>
+              <w:jc w:val="left"/>
+            </w:pPr>
+            <w:r/>
+            <w:r>
+              <w:rPr>
+                <w:rFonts w:ascii="Arial" w:hAnsi="Arial" w:cs="Arial" w:eastAsia="Arial"/>
+                <w:b w:val="0"/>
+                <w:color w:val="000000"/>
+                <w:sz w:val="22"/>
+              </w:rPr>
+              <w:t>View signed agreement (Privy)</w:t>
+            </w:r>
+          </w:p>
+        </w:tc>
+        <w:tc>
+          <w:tcPr>
+            <w:tcW w:type="dxa" w:w="1624"/>
+          </w:tcPr>
+          <w:p>
+            <w:pPr>
+              <w:spacing w:after="0"/>
+              <w:jc w:val="left"/>
+            </w:pPr>
+            <w:r/>
+            <w:r>
+              <w:rPr>
+                <w:rFonts w:ascii="Arial" w:hAnsi="Arial" w:cs="Arial" w:eastAsia="Arial"/>
+                <w:b w:val="0"/>
+                <w:color w:val="000000"/>
+                <w:sz w:val="22"/>
+              </w:rPr>
+              <w:t>Yes</w:t>
+            </w:r>
+          </w:p>
+        </w:tc>
+        <w:tc>
+          <w:tcPr>
+            <w:tcW w:type="dxa" w:w="1624"/>
+          </w:tcPr>
+          <w:p>
+            <w:pPr>
+              <w:spacing w:after="0"/>
+              <w:jc w:val="left"/>
+            </w:pPr>
+            <w:r/>
+            <w:r>
+              <w:rPr>
+                <w:rFonts w:ascii="Arial" w:hAnsi="Arial" w:cs="Arial" w:eastAsia="Arial"/>
+                <w:b w:val="0"/>
+                <w:color w:val="000000"/>
+                <w:sz w:val="22"/>
+              </w:rPr>
+              <w:t>Yes</w:t>
+            </w:r>
+          </w:p>
+        </w:tc>
+        <w:tc>
+          <w:tcPr>
+            <w:tcW w:type="dxa" w:w="1624"/>
+          </w:tcPr>
+          <w:p>
+            <w:pPr>
+              <w:spacing w:after="0"/>
+              <w:jc w:val="left"/>
+            </w:pPr>
+            <w:r/>
+            <w:r>
+              <w:rPr>
+                <w:rFonts w:ascii="Arial" w:hAnsi="Arial" w:cs="Arial" w:eastAsia="Arial"/>
+                <w:b w:val="0"/>
+                <w:color w:val="000000"/>
+                <w:sz w:val="22"/>
+              </w:rPr>
+              <w:t>Own</w:t>
+            </w:r>
+          </w:p>
+        </w:tc>
+        <w:tc>
+          <w:tcPr>
+            <w:tcW w:type="dxa" w:w="1624"/>
+          </w:tcPr>
+          <w:p>
+            <w:pPr>
+              <w:spacing w:after="0"/>
+              <w:jc w:val="left"/>
+            </w:pPr>
+            <w:r/>
+            <w:r>
+              <w:rPr>
+                <w:rFonts w:ascii="Arial" w:hAnsi="Arial" w:cs="Arial" w:eastAsia="Arial"/>
+                <w:b w:val="0"/>
+                <w:color w:val="000000"/>
+                <w:sz w:val="22"/>
+              </w:rPr>
+              <w:t>No</w:t>
             </w:r>
           </w:p>
         </w:tc>

</xml_diff>

<commit_message>
PRD: note why reviewers cannot view signed agreements
Co-Authored-By: Claude Opus 5.5 <noreply@anthropic.com>
Claude-Session: https://claude.ai/code/session_01MyaJcnNN6cea99ff9yeVti
</commit_message>
<xml_diff>
--- a/prd/EDTS APM 2027 - Nadia Rahma Prasanti - Universitas Indonesia.docx
+++ b/prd/EDTS APM 2027 - Nadia Rahma Prasanti - Universitas Indonesia.docx
@@ -10041,6 +10041,20 @@
       <w:pPr>
         <w:spacing w:after="0"/>
       </w:pPr>
+    </w:p>
+    <w:p>
+      <w:pPr>
+        <w:jc w:val="both"/>
+      </w:pPr>
+      <w:r>
+        <w:rPr>
+          <w:rFonts w:ascii="Arial" w:hAnsi="Arial" w:cs="Arial" w:eastAsia="Arial"/>
+          <w:b w:val="0"/>
+          <w:color w:val="000000"/>
+          <w:sz w:val="22"/>
+        </w:rPr>
+        <w:t>Reviewers cannot view the signed agreement: their work ends at the eligibility assessment, and the agreement contains personal and commercial data they do not need.</w:t>
+      </w:r>
     </w:p>
     <w:p>
       <w:pPr>

</xml_diff>

<commit_message>
Use of AI: credit pain points, features, flow, and special cases to author
Co-Authored-By: Claude Opus 5.5 <noreply@anthropic.com>
Claude-Session: https://claude.ai/code/session_01MyaJcnNN6cea99ff9yeVti
</commit_message>
<xml_diff>
--- a/prd/EDTS APM 2027 - Nadia Rahma Prasanti - Universitas Indonesia.docx
+++ b/prd/EDTS APM 2027 - Nadia Rahma Prasanti - Universitas Indonesia.docx
@@ -12743,7 +12743,7 @@
                 <w:color w:val="000000"/>
                 <w:sz w:val="22"/>
               </w:rPr>
-              <w:t>Proposed an initial pain point list, MVP feature list (MoSCoW), and funnel stages; reviewed my flow and pointed out edge cases</w:t>
+              <w:t>Tidied up my pain points, feature list, and funnel into a clear structure</w:t>
             </w:r>
           </w:p>
         </w:tc>
@@ -12764,7 +12764,7 @@
                 <w:color w:val="000000"/>
                 <w:sz w:val="22"/>
               </w:rPr>
-              <w:t>Finalized the pain points and defined the business process (stages, PIC, deadlines, and approval rules), designed the end-to-end flow, added features such as Target vs Achievement, sales performance, notifications, and roles, then decided which suggestions to accept</w:t>
+              <w:t>Defined the pain points, features, and funnel, designed the business process (stages, PIC, deadlines, and approval rules), and pointed out the special cases the flow must handle (for example, duplicate leads, leads outside any sales region, and location changes during negotiation)</w:t>
             </w:r>
           </w:p>
         </w:tc>

</xml_diff>

<commit_message>
PRD: add how-to-try guide for the core flow
Co-Authored-By: Claude Opus 5.5 <noreply@anthropic.com>
Claude-Session: https://claude.ai/code/session_01MyaJcnNN6cea99ff9yeVti
</commit_message>
<xml_diff>
--- a/prd/EDTS APM 2027 - Nadia Rahma Prasanti - Universitas Indonesia.docx
+++ b/prd/EDTS APM 2027 - Nadia Rahma Prasanti - Universitas Indonesia.docx
@@ -44,6 +44,22 @@
           <w:sz w:val="22"/>
         </w:rPr>
         <w:t>Executive Summary</w:t>
+      </w:r>
+    </w:p>
+    <w:p>
+      <w:pPr>
+        <w:pStyle w:val="ListBullet"/>
+        <w:spacing w:after="0"/>
+        <w:jc w:val="left"/>
+      </w:pPr>
+      <w:r>
+        <w:rPr>
+          <w:rFonts w:ascii="Arial" w:hAnsi="Arial" w:cs="Arial" w:eastAsia="Arial"/>
+          <w:b w:val="0"/>
+          <w:color w:val="000000"/>
+          <w:sz w:val="22"/>
+        </w:rPr>
+        <w:t>How to Try the Prototype</w:t>
       </w:r>
     </w:p>
     <w:p>
@@ -725,6 +741,138 @@
           <w:sz w:val="22"/>
         </w:rPr>
         <w:t xml:space="preserve"> demo123 (all staff accounts are listed on the login page)</w:t>
+      </w:r>
+    </w:p>
+    <w:p>
+      <w:pPr>
+        <w:pStyle w:val="Heading1"/>
+      </w:pPr>
+      <w:r>
+        <w:rPr>
+          <w:rFonts w:ascii="Arial" w:hAnsi="Arial" w:cs="Arial" w:eastAsia="Arial"/>
+          <w:b/>
+          <w:color w:val="000000"/>
+          <w:sz w:val="28"/>
+        </w:rPr>
+        <w:t>How to Try the Prototype</w:t>
+      </w:r>
+    </w:p>
+    <w:p>
+      <w:pPr>
+        <w:jc w:val="both"/>
+      </w:pPr>
+      <w:r>
+        <w:rPr>
+          <w:rFonts w:ascii="Arial" w:hAnsi="Arial" w:cs="Arial" w:eastAsia="Arial"/>
+          <w:b w:val="0"/>
+          <w:color w:val="000000"/>
+          <w:sz w:val="22"/>
+        </w:rPr>
+        <w:t>A 5-minute path through the core flow. Open both links in the same browser so the two apps share data.</w:t>
+      </w:r>
+    </w:p>
+    <w:p>
+      <w:pPr>
+        <w:pStyle w:val="ListNumber"/>
+        <w:jc w:val="left"/>
+      </w:pPr>
+      <w:r>
+        <w:rPr>
+          <w:rFonts w:ascii="Arial" w:hAnsi="Arial" w:cs="Arial" w:eastAsia="Arial"/>
+          <w:b w:val="0"/>
+          <w:color w:val="000000"/>
+          <w:sz w:val="22"/>
+        </w:rPr>
+        <w:t>Open the Partner Portal (/mitra), click "Isi data contoh", and submit. The lead is assigned automatically to Rendi (Tangerang region).</w:t>
+      </w:r>
+    </w:p>
+    <w:p>
+      <w:pPr>
+        <w:pStyle w:val="ListNumber"/>
+        <w:jc w:val="left"/>
+      </w:pPr>
+      <w:r>
+        <w:rPr>
+          <w:rFonts w:ascii="Arial" w:hAnsi="Arial" w:cs="Arial" w:eastAsia="Arial"/>
+          <w:b w:val="0"/>
+          <w:color w:val="000000"/>
+          <w:sz w:val="22"/>
+        </w:rPr>
+        <w:t>Open the dashboard and log in as Rendi (Sales) from the demo account list. Process the business presentation and the location survey.</w:t>
+      </w:r>
+    </w:p>
+    <w:p>
+      <w:pPr>
+        <w:pStyle w:val="ListNumber"/>
+        <w:jc w:val="left"/>
+      </w:pPr>
+      <w:r>
+        <w:rPr>
+          <w:rFonts w:ascii="Arial" w:hAnsi="Arial" w:cs="Arial" w:eastAsia="Arial"/>
+          <w:b w:val="0"/>
+          <w:color w:val="000000"/>
+          <w:sz w:val="22"/>
+        </w:rPr>
+        <w:t>Log in as Bima (Reviewer) and complete the eligibility assessment.</w:t>
+      </w:r>
+    </w:p>
+    <w:p>
+      <w:pPr>
+        <w:pStyle w:val="ListNumber"/>
+        <w:jc w:val="left"/>
+      </w:pPr>
+      <w:r>
+        <w:rPr>
+          <w:rFonts w:ascii="Arial" w:hAnsi="Arial" w:cs="Arial" w:eastAsia="Arial"/>
+          <w:b w:val="0"/>
+          <w:color w:val="000000"/>
+          <w:sz w:val="22"/>
+        </w:rPr>
+        <w:t>Log in as Rendi again and send the quotation.</w:t>
+      </w:r>
+    </w:p>
+    <w:p>
+      <w:pPr>
+        <w:pStyle w:val="ListNumber"/>
+        <w:jc w:val="left"/>
+      </w:pPr>
+      <w:r>
+        <w:rPr>
+          <w:rFonts w:ascii="Arial" w:hAnsi="Arial" w:cs="Arial" w:eastAsia="Arial"/>
+          <w:b w:val="0"/>
+          <w:color w:val="000000"/>
+          <w:sz w:val="22"/>
+        </w:rPr>
+        <w:t>Back in the Partner Portal, check the status with the application number and email, then agree to the quotation.</w:t>
+      </w:r>
+    </w:p>
+    <w:p>
+      <w:pPr>
+        <w:pStyle w:val="ListNumber"/>
+        <w:jc w:val="left"/>
+      </w:pPr>
+      <w:r>
+        <w:rPr>
+          <w:rFonts w:ascii="Arial" w:hAnsi="Arial" w:cs="Arial" w:eastAsia="Arial"/>
+          <w:b w:val="0"/>
+          <w:color w:val="000000"/>
+          <w:sz w:val="22"/>
+        </w:rPr>
+        <w:t>Log in as Laras (Manager), give final approval, and sign the agreement. Open Pipeline, then Completed, to view the signed document.</w:t>
+      </w:r>
+    </w:p>
+    <w:p>
+      <w:pPr>
+        <w:jc w:val="both"/>
+      </w:pPr>
+      <w:r>
+        <w:rPr>
+          <w:rFonts w:ascii="Arial" w:hAnsi="Arial" w:cs="Arial" w:eastAsia="Arial"/>
+          <w:b w:val="0"/>
+          <w:color w:val="000000"/>
+          <w:sz w:val="22"/>
+        </w:rPr>
+        <w:t>Extra value (Should have): as Laras, open Target and Performa Sales.</w:t>
       </w:r>
     </w:p>
     <w:p>

</xml_diff>

<commit_message>
PRD: all text Arial 11, headings bold
Co-Authored-By: Claude Opus 5.5 <noreply@anthropic.com>
Claude-Session: https://claude.ai/code/session_01MyaJcnNN6cea99ff9yeVti
</commit_message>
<xml_diff>
--- a/prd/EDTS APM 2027 - Nadia Rahma Prasanti - Universitas Indonesia.docx
+++ b/prd/EDTS APM 2027 - Nadia Rahma Prasanti - Universitas Indonesia.docx
@@ -9,9 +9,9 @@
       <w:r>
         <w:rPr>
           <w:rFonts w:ascii="Arial" w:hAnsi="Arial" w:cs="Arial" w:eastAsia="Arial"/>
-          <w:b w:val="0"/>
+          <w:b/>
           <w:color w:val="000000"/>
-          <w:sz w:val="32"/>
+          <w:sz w:val="22"/>
         </w:rPr>
         <w:t>Kopi Koma Partner Portal: Product Requirements Document</w:t>
       </w:r>
@@ -25,7 +25,7 @@
           <w:rFonts w:ascii="Arial" w:hAnsi="Arial" w:cs="Arial" w:eastAsia="Arial"/>
           <w:b/>
           <w:color w:val="000000"/>
-          <w:sz w:val="28"/>
+          <w:sz w:val="22"/>
         </w:rPr>
         <w:t>Table of Contents</w:t>
       </w:r>
@@ -556,7 +556,7 @@
           <w:rFonts w:ascii="Arial" w:hAnsi="Arial" w:cs="Arial" w:eastAsia="Arial"/>
           <w:b/>
           <w:color w:val="000000"/>
-          <w:sz w:val="28"/>
+          <w:sz w:val="22"/>
         </w:rPr>
         <w:t>Executive Summary</w:t>
       </w:r>
@@ -752,7 +752,7 @@
           <w:rFonts w:ascii="Arial" w:hAnsi="Arial" w:cs="Arial" w:eastAsia="Arial"/>
           <w:b/>
           <w:color w:val="000000"/>
-          <w:sz w:val="28"/>
+          <w:sz w:val="22"/>
         </w:rPr>
         <w:t>How to Try the Prototype</w:t>
       </w:r>
@@ -884,7 +884,7 @@
           <w:rFonts w:ascii="Arial" w:hAnsi="Arial" w:cs="Arial" w:eastAsia="Arial"/>
           <w:b/>
           <w:color w:val="000000"/>
-          <w:sz w:val="28"/>
+          <w:sz w:val="22"/>
         </w:rPr>
         <w:t>Assumptions</w:t>
       </w:r>
@@ -898,7 +898,7 @@
           <w:rFonts w:ascii="Arial" w:hAnsi="Arial" w:cs="Arial" w:eastAsia="Arial"/>
           <w:b/>
           <w:color w:val="000000"/>
-          <w:sz w:val="24"/>
+          <w:sz w:val="22"/>
         </w:rPr>
         <w:t>Client</w:t>
       </w:r>
@@ -1235,7 +1235,7 @@
           <w:rFonts w:ascii="Arial" w:hAnsi="Arial" w:cs="Arial" w:eastAsia="Arial"/>
           <w:b/>
           <w:color w:val="000000"/>
-          <w:sz w:val="24"/>
+          <w:sz w:val="22"/>
         </w:rPr>
         <w:t>Pain points</w:t>
       </w:r>
@@ -1789,7 +1789,7 @@
           <w:rFonts w:ascii="Arial" w:hAnsi="Arial" w:cs="Arial" w:eastAsia="Arial"/>
           <w:b/>
           <w:color w:val="000000"/>
-          <w:sz w:val="28"/>
+          <w:sz w:val="22"/>
         </w:rPr>
         <w:t>Human vs System</w:t>
       </w:r>
@@ -2944,7 +2944,7 @@
           <w:rFonts w:ascii="Arial" w:hAnsi="Arial" w:cs="Arial" w:eastAsia="Arial"/>
           <w:b/>
           <w:color w:val="000000"/>
-          <w:sz w:val="28"/>
+          <w:sz w:val="22"/>
         </w:rPr>
         <w:t>Business Impact</w:t>
       </w:r>
@@ -3275,7 +3275,7 @@
           <w:rFonts w:ascii="Arial" w:hAnsi="Arial" w:cs="Arial" w:eastAsia="Arial"/>
           <w:b/>
           <w:color w:val="000000"/>
-          <w:sz w:val="28"/>
+          <w:sz w:val="22"/>
         </w:rPr>
         <w:t>Success Metrics</w:t>
       </w:r>
@@ -3829,7 +3829,7 @@
           <w:rFonts w:ascii="Arial" w:hAnsi="Arial" w:cs="Arial" w:eastAsia="Arial"/>
           <w:b/>
           <w:color w:val="000000"/>
-          <w:sz w:val="28"/>
+          <w:sz w:val="22"/>
         </w:rPr>
         <w:t>Diagram</w:t>
       </w:r>
@@ -3843,7 +3843,7 @@
           <w:rFonts w:ascii="Arial" w:hAnsi="Arial" w:cs="Arial" w:eastAsia="Arial"/>
           <w:b/>
           <w:color w:val="000000"/>
-          <w:sz w:val="24"/>
+          <w:sz w:val="22"/>
         </w:rPr>
         <w:t>Flowchart</w:t>
       </w:r>
@@ -3896,7 +3896,7 @@
           <w:rFonts w:ascii="Arial" w:hAnsi="Arial" w:cs="Arial" w:eastAsia="Arial"/>
           <w:b/>
           <w:color w:val="000000"/>
-          <w:sz w:val="24"/>
+          <w:sz w:val="22"/>
         </w:rPr>
         <w:t>Stages</w:t>
       </w:r>
@@ -4620,7 +4620,7 @@
           <w:rFonts w:ascii="Arial" w:hAnsi="Arial" w:cs="Arial" w:eastAsia="Arial"/>
           <w:b/>
           <w:color w:val="000000"/>
-          <w:sz w:val="28"/>
+          <w:sz w:val="22"/>
         </w:rPr>
         <w:t>Solution</w:t>
       </w:r>
@@ -4634,7 +4634,7 @@
           <w:rFonts w:ascii="Arial" w:hAnsi="Arial" w:cs="Arial" w:eastAsia="Arial"/>
           <w:b/>
           <w:color w:val="000000"/>
-          <w:sz w:val="24"/>
+          <w:sz w:val="22"/>
         </w:rPr>
         <w:t>Solution Overview</w:t>
       </w:r>
@@ -6096,7 +6096,7 @@
           <w:rFonts w:ascii="Arial" w:hAnsi="Arial" w:cs="Arial" w:eastAsia="Arial"/>
           <w:b/>
           <w:color w:val="000000"/>
-          <w:sz w:val="24"/>
+          <w:sz w:val="22"/>
         </w:rPr>
         <w:t>Functional Requirements</w:t>
       </w:r>
@@ -10680,7 +10680,7 @@
           <w:rFonts w:ascii="Arial" w:hAnsi="Arial" w:cs="Arial" w:eastAsia="Arial"/>
           <w:b/>
           <w:color w:val="000000"/>
-          <w:sz w:val="24"/>
+          <w:sz w:val="22"/>
         </w:rPr>
         <w:t>Input, Process, Output</w:t>
       </w:r>
@@ -11404,7 +11404,7 @@
           <w:rFonts w:ascii="Arial" w:hAnsi="Arial" w:cs="Arial" w:eastAsia="Arial"/>
           <w:b/>
           <w:color w:val="000000"/>
-          <w:sz w:val="24"/>
+          <w:sz w:val="22"/>
         </w:rPr>
         <w:t>Mock Ups</w:t>
       </w:r>
@@ -11967,7 +11967,7 @@
           <w:rFonts w:ascii="Arial" w:hAnsi="Arial" w:cs="Arial" w:eastAsia="Arial"/>
           <w:b/>
           <w:color w:val="000000"/>
-          <w:sz w:val="28"/>
+          <w:sz w:val="22"/>
         </w:rPr>
         <w:t>Nonfunctional Requirements</w:t>
       </w:r>
@@ -12307,7 +12307,7 @@
           <w:rFonts w:ascii="Arial" w:hAnsi="Arial" w:cs="Arial" w:eastAsia="Arial"/>
           <w:b/>
           <w:color w:val="000000"/>
-          <w:sz w:val="28"/>
+          <w:sz w:val="22"/>
         </w:rPr>
         <w:t>Scope and Roadmap</w:t>
       </w:r>
@@ -12680,7 +12680,7 @@
           <w:rFonts w:ascii="Arial" w:hAnsi="Arial" w:cs="Arial" w:eastAsia="Arial"/>
           <w:b/>
           <w:color w:val="000000"/>
-          <w:sz w:val="28"/>
+          <w:sz w:val="22"/>
         </w:rPr>
         <w:t>Prototype Limitations</w:t>
       </w:r>
@@ -12754,7 +12754,7 @@
           <w:rFonts w:ascii="Arial" w:hAnsi="Arial" w:cs="Arial" w:eastAsia="Arial"/>
           <w:b/>
           <w:color w:val="000000"/>
-          <w:sz w:val="28"/>
+          <w:sz w:val="22"/>
         </w:rPr>
         <w:t>Use of AI</w:t>
       </w:r>
@@ -13141,7 +13141,7 @@
           <w:rFonts w:ascii="Arial" w:hAnsi="Arial" w:cs="Arial" w:eastAsia="Arial"/>
           <w:b/>
           <w:color w:val="000000"/>
-          <w:sz w:val="28"/>
+          <w:sz w:val="22"/>
         </w:rPr>
         <w:t>References</w:t>
       </w:r>
@@ -13245,7 +13245,7 @@
           <w:rFonts w:ascii="Arial" w:hAnsi="Arial" w:cs="Arial" w:eastAsia="Arial"/>
           <w:b/>
           <w:color w:val="000000"/>
-          <w:sz w:val="28"/>
+          <w:sz w:val="22"/>
         </w:rPr>
         <w:t>Appendix: AI Conversation Screenshots</w:t>
       </w:r>
@@ -13729,7 +13729,7 @@
       <w:b/>
       <w:bCs/>
       <w:color w:val="000000"/>
-      <w:sz w:val="28"/>
+      <w:sz w:val="22"/>
       <w:szCs w:val="28"/>
     </w:rPr>
   </w:style>
@@ -13753,7 +13753,7 @@
       <w:b/>
       <w:bCs/>
       <w:color w:val="000000"/>
-      <w:sz w:val="24"/>
+      <w:sz w:val="22"/>
       <w:szCs w:val="26"/>
     </w:rPr>
   </w:style>
@@ -14020,7 +14020,7 @@
       <w:color w:val="000000"/>
       <w:spacing w:val="5"/>
       <w:kern w:val="28"/>
-      <w:sz w:val="32"/>
+      <w:sz w:val="22"/>
       <w:szCs w:val="52"/>
     </w:rPr>
   </w:style>

</xml_diff>

<commit_message>
PRD: captions Arial 11
Co-Authored-By: Claude Opus 5.5 <noreply@anthropic.com>
Claude-Session: https://claude.ai/code/session_01MyaJcnNN6cea99ff9yeVti
</commit_message>
<xml_diff>
--- a/prd/EDTS APM 2027 - Nadia Rahma Prasanti - Universitas Indonesia.docx
+++ b/prd/EDTS APM 2027 - Nadia Rahma Prasanti - Universitas Indonesia.docx
@@ -11572,7 +11572,7 @@
                 <w:rFonts w:ascii="Arial" w:hAnsi="Arial" w:cs="Arial" w:eastAsia="Arial"/>
                 <w:i/>
                 <w:color w:val="000000"/>
-                <w:sz w:val="20"/>
+                <w:sz w:val="22"/>
               </w:rPr>
               <w:t>Pipeline (Manager)</w:t>
             </w:r>
@@ -11591,7 +11591,7 @@
                 <w:rFonts w:ascii="Arial" w:hAnsi="Arial" w:cs="Arial" w:eastAsia="Arial"/>
                 <w:i/>
                 <w:color w:val="000000"/>
-                <w:sz w:val="20"/>
+                <w:sz w:val="22"/>
               </w:rPr>
               <w:t>Application detail: quotation</w:t>
             </w:r>
@@ -11717,7 +11717,7 @@
                 <w:rFonts w:ascii="Arial" w:hAnsi="Arial" w:cs="Arial" w:eastAsia="Arial"/>
                 <w:i/>
                 <w:color w:val="000000"/>
-                <w:sz w:val="20"/>
+                <w:sz w:val="22"/>
               </w:rPr>
               <w:t>Approval status</w:t>
             </w:r>
@@ -11736,7 +11736,7 @@
                 <w:rFonts w:ascii="Arial" w:hAnsi="Arial" w:cs="Arial" w:eastAsia="Arial"/>
                 <w:i/>
                 <w:color w:val="000000"/>
-                <w:sz w:val="20"/>
+                <w:sz w:val="22"/>
               </w:rPr>
               <w:t>Target vs Achievement</w:t>
             </w:r>
@@ -11907,7 +11907,7 @@
                 <w:rFonts w:ascii="Arial" w:hAnsi="Arial" w:cs="Arial" w:eastAsia="Arial"/>
                 <w:i/>
                 <w:color w:val="000000"/>
-                <w:sz w:val="20"/>
+                <w:sz w:val="22"/>
               </w:rPr>
               <w:t>Portal: registration</w:t>
             </w:r>
@@ -11926,7 +11926,7 @@
                 <w:rFonts w:ascii="Arial" w:hAnsi="Arial" w:cs="Arial" w:eastAsia="Arial"/>
                 <w:i/>
                 <w:color w:val="000000"/>
-                <w:sz w:val="20"/>
+                <w:sz w:val="22"/>
               </w:rPr>
               <w:t>Portal: tracker</w:t>
             </w:r>
@@ -11945,7 +11945,7 @@
                 <w:rFonts w:ascii="Arial" w:hAnsi="Arial" w:cs="Arial" w:eastAsia="Arial"/>
                 <w:i/>
                 <w:color w:val="000000"/>
-                <w:sz w:val="20"/>
+                <w:sz w:val="22"/>
               </w:rPr>
               <w:t>Portal: quotation response</w:t>
             </w:r>

</xml_diff>

<commit_message>
PRD: fixed reference numbering and clickable links
Co-Authored-By: Claude Opus 5.5 <noreply@anthropic.com>
Claude-Session: https://claude.ai/code/session_01MyaJcnNN6cea99ff9yeVti
</commit_message>
<xml_diff>
--- a/prd/EDTS APM 2027 - Nadia Rahma Prasanti - Universitas Indonesia.docx
+++ b/prd/EDTS APM 2027 - Nadia Rahma Prasanti - Universitas Indonesia.docx
@@ -694,8 +694,19 @@
           <w:color w:val="000000"/>
           <w:sz w:val="22"/>
         </w:rPr>
-        <w:t xml:space="preserve"> https://kopikomapartnerportal.vercel.app</w:t>
+        <w:t xml:space="preserve"> </w:t>
       </w:r>
+      <w:hyperlink r:id="rId10">
+        <w:r>
+          <w:rPr>
+            <w:rFonts w:ascii="Arial" w:hAnsi="Arial" w:cs="Arial" w:eastAsia="Arial"/>
+            <w:color w:val="1155CC"/>
+            <w:sz w:val="22"/>
+            <w:u w:val="single"/>
+          </w:rPr>
+          <w:t xml:space="preserve">https://kopikomapartnerportal.vercel.app</w:t>
+        </w:r>
+      </w:hyperlink>
     </w:p>
     <w:p>
       <w:pPr>
@@ -717,8 +728,19 @@
           <w:color w:val="000000"/>
           <w:sz w:val="22"/>
         </w:rPr>
-        <w:t xml:space="preserve"> https://kopikomapartnerportal.vercel.app/mitra</w:t>
+        <w:t xml:space="preserve"> </w:t>
       </w:r>
+      <w:hyperlink r:id="rId11">
+        <w:r>
+          <w:rPr>
+            <w:rFonts w:ascii="Arial" w:hAnsi="Arial" w:cs="Arial" w:eastAsia="Arial"/>
+            <w:color w:val="1155CC"/>
+            <w:sz w:val="22"/>
+            <w:u w:val="single"/>
+          </w:rPr>
+          <w:t xml:space="preserve">https://kopikomapartnerportal.vercel.app/mitra</w:t>
+        </w:r>
+      </w:hyperlink>
     </w:p>
     <w:p>
       <w:pPr>
@@ -773,7 +795,8 @@
     </w:p>
     <w:p>
       <w:pPr>
-        <w:pStyle w:val="ListNumber"/>
+        <w:spacing w:after="60"/>
+        <w:ind w:left="454" w:hanging="454"/>
         <w:jc w:val="left"/>
       </w:pPr>
       <w:r>
@@ -783,12 +806,13 @@
           <w:color w:val="000000"/>
           <w:sz w:val="22"/>
         </w:rPr>
-        <w:t>Open the Partner Portal (/mitra), click "Isi data contoh", and submit. The lead is assigned automatically to Rendi (Tangerang region).</w:t>
+        <w:t>1. Open the Partner Portal (/mitra), click "Isi data contoh", and submit. The lead is assigned automatically to Rendi (Tangerang region).</w:t>
       </w:r>
     </w:p>
     <w:p>
       <w:pPr>
-        <w:pStyle w:val="ListNumber"/>
+        <w:spacing w:after="60"/>
+        <w:ind w:left="454" w:hanging="454"/>
         <w:jc w:val="left"/>
       </w:pPr>
       <w:r>
@@ -798,12 +822,13 @@
           <w:color w:val="000000"/>
           <w:sz w:val="22"/>
         </w:rPr>
-        <w:t>Open the dashboard and log in as Rendi (Sales) from the demo account list. Process the business presentation and the location survey.</w:t>
+        <w:t>2. Open the dashboard and log in as Rendi (Sales) from the demo account list. Process the business presentation and the location survey.</w:t>
       </w:r>
     </w:p>
     <w:p>
       <w:pPr>
-        <w:pStyle w:val="ListNumber"/>
+        <w:spacing w:after="60"/>
+        <w:ind w:left="454" w:hanging="454"/>
         <w:jc w:val="left"/>
       </w:pPr>
       <w:r>
@@ -813,12 +838,13 @@
           <w:color w:val="000000"/>
           <w:sz w:val="22"/>
         </w:rPr>
-        <w:t>Log in as Bima (Reviewer) and complete the eligibility assessment.</w:t>
+        <w:t>3. Log in as Bima (Reviewer) and complete the eligibility assessment.</w:t>
       </w:r>
     </w:p>
     <w:p>
       <w:pPr>
-        <w:pStyle w:val="ListNumber"/>
+        <w:spacing w:after="60"/>
+        <w:ind w:left="454" w:hanging="454"/>
         <w:jc w:val="left"/>
       </w:pPr>
       <w:r>
@@ -828,12 +854,13 @@
           <w:color w:val="000000"/>
           <w:sz w:val="22"/>
         </w:rPr>
-        <w:t>Log in as Rendi again and send the quotation.</w:t>
+        <w:t>4. Log in as Rendi again and send the quotation.</w:t>
       </w:r>
     </w:p>
     <w:p>
       <w:pPr>
-        <w:pStyle w:val="ListNumber"/>
+        <w:spacing w:after="60"/>
+        <w:ind w:left="454" w:hanging="454"/>
         <w:jc w:val="left"/>
       </w:pPr>
       <w:r>
@@ -843,12 +870,13 @@
           <w:color w:val="000000"/>
           <w:sz w:val="22"/>
         </w:rPr>
-        <w:t>Back in the Partner Portal, check the status with the application number and email, then agree to the quotation.</w:t>
+        <w:t>5. Back in the Partner Portal, check the status with the application number and email, then agree to the quotation.</w:t>
       </w:r>
     </w:p>
     <w:p>
       <w:pPr>
-        <w:pStyle w:val="ListNumber"/>
+        <w:spacing w:after="60"/>
+        <w:ind w:left="454" w:hanging="454"/>
         <w:jc w:val="left"/>
       </w:pPr>
       <w:r>
@@ -858,7 +886,7 @@
           <w:color w:val="000000"/>
           <w:sz w:val="22"/>
         </w:rPr>
-        <w:t>Log in as Laras (Manager), give final approval, and sign the agreement. Open Pipeline, then Completed, to view the signed document.</w:t>
+        <w:t>6. Log in as Laras (Manager), give final approval, and sign the agreement. Open Pipeline, then Completed, to view the signed document.</w:t>
       </w:r>
     </w:p>
     <w:p>
@@ -3868,7 +3896,7 @@
                     <pic:cNvPicPr/>
                   </pic:nvPicPr>
                   <pic:blipFill>
-                    <a:blip r:embed="rId10"/>
+                    <a:blip r:embed="rId12"/>
                     <a:stretch>
                       <a:fillRect/>
                     </a:stretch>
@@ -11438,7 +11466,27 @@
           <w:color w:val="000000"/>
           <w:sz w:val="22"/>
         </w:rPr>
-        <w:t xml:space="preserve"> https://kopikomapartnerportal.vercel.app (password demo123) and </w:t>
+        <w:t xml:space="preserve"> </w:t>
+      </w:r>
+      <w:hyperlink r:id="rId10">
+        <w:r>
+          <w:rPr>
+            <w:rFonts w:ascii="Arial" w:hAnsi="Arial" w:cs="Arial" w:eastAsia="Arial"/>
+            <w:color w:val="1155CC"/>
+            <w:sz w:val="22"/>
+            <w:u w:val="single"/>
+          </w:rPr>
+          <w:t xml:space="preserve">https://kopikomapartnerportal.vercel.app</w:t>
+        </w:r>
+      </w:hyperlink>
+      <w:r>
+        <w:rPr>
+          <w:rFonts w:ascii="Arial" w:hAnsi="Arial" w:cs="Arial" w:eastAsia="Arial"/>
+          <w:b w:val="0"/>
+          <w:color w:val="000000"/>
+          <w:sz w:val="22"/>
+        </w:rPr>
+        <w:t xml:space="preserve"> (password demo123) and </w:t>
       </w:r>
       <w:r>
         <w:rPr>
@@ -11456,8 +11504,19 @@
           <w:color w:val="000000"/>
           <w:sz w:val="22"/>
         </w:rPr>
-        <w:t xml:space="preserve"> https://kopikomapartnerportal.vercel.app/mitra</w:t>
+        <w:t xml:space="preserve"> </w:t>
       </w:r>
+      <w:hyperlink r:id="rId11">
+        <w:r>
+          <w:rPr>
+            <w:rFonts w:ascii="Arial" w:hAnsi="Arial" w:cs="Arial" w:eastAsia="Arial"/>
+            <w:color w:val="1155CC"/>
+            <w:sz w:val="22"/>
+            <w:u w:val="single"/>
+          </w:rPr>
+          <w:t xml:space="preserve">https://kopikomapartnerportal.vercel.app/mitra</w:t>
+        </w:r>
+      </w:hyperlink>
     </w:p>
     <w:tbl>
       <w:tblPr>
@@ -11490,151 +11549,6 @@
                       <pic:pic>
                         <pic:nvPicPr>
                           <pic:cNvPr id="0" name="02_pipeline.png"/>
-                          <pic:cNvPicPr/>
-                        </pic:nvPicPr>
-                        <pic:blipFill>
-                          <a:blip r:embed="rId11"/>
-                          <a:stretch>
-                            <a:fillRect/>
-                          </a:stretch>
-                        </pic:blipFill>
-                        <pic:spPr>
-                          <a:xfrm>
-                            <a:off x="0" y="0"/>
-                            <a:ext cx="2807999" cy="1685622"/>
-                          </a:xfrm>
-                          <a:prstGeom prst="rect"/>
-                        </pic:spPr>
-                      </pic:pic>
-                    </a:graphicData>
-                  </a:graphic>
-                </wp:inline>
-              </w:drawing>
-            </w:r>
-          </w:p>
-        </w:tc>
-        <w:tc>
-          <w:tcPr>
-            <w:tcW w:type="dxa" w:w="4873"/>
-          </w:tcPr>
-          <w:p>
-            <w:pPr>
-              <w:jc w:val="center"/>
-            </w:pPr>
-            <w:r>
-              <w:drawing>
-                <wp:inline xmlns:a="http://schemas.openxmlformats.org/drawingml/2006/main" xmlns:pic="http://schemas.openxmlformats.org/drawingml/2006/picture">
-                  <wp:extent cx="2807999" cy="1685622"/>
-                  <wp:docPr id="3" name="Picture 3"/>
-                  <wp:cNvGraphicFramePr>
-                    <a:graphicFrameLocks noChangeAspect="1"/>
-                  </wp:cNvGraphicFramePr>
-                  <a:graphic>
-                    <a:graphicData uri="http://schemas.openxmlformats.org/drawingml/2006/picture">
-                      <pic:pic>
-                        <pic:nvPicPr>
-                          <pic:cNvPr id="0" name="03_detail.png"/>
-                          <pic:cNvPicPr/>
-                        </pic:nvPicPr>
-                        <pic:blipFill>
-                          <a:blip r:embed="rId12"/>
-                          <a:stretch>
-                            <a:fillRect/>
-                          </a:stretch>
-                        </pic:blipFill>
-                        <pic:spPr>
-                          <a:xfrm>
-                            <a:off x="0" y="0"/>
-                            <a:ext cx="2807999" cy="1685622"/>
-                          </a:xfrm>
-                          <a:prstGeom prst="rect"/>
-                        </pic:spPr>
-                      </pic:pic>
-                    </a:graphicData>
-                  </a:graphic>
-                </wp:inline>
-              </w:drawing>
-            </w:r>
-          </w:p>
-        </w:tc>
-      </w:tr>
-      <w:tr>
-        <w:tc>
-          <w:tcPr>
-            <w:tcW w:type="dxa" w:w="4873"/>
-          </w:tcPr>
-          <w:p>
-            <w:pPr>
-              <w:jc w:val="center"/>
-            </w:pPr>
-            <w:r>
-              <w:rPr>
-                <w:rFonts w:ascii="Arial" w:hAnsi="Arial" w:cs="Arial" w:eastAsia="Arial"/>
-                <w:i/>
-                <w:color w:val="000000"/>
-                <w:sz w:val="22"/>
-              </w:rPr>
-              <w:t>Pipeline (Manager)</w:t>
-            </w:r>
-          </w:p>
-        </w:tc>
-        <w:tc>
-          <w:tcPr>
-            <w:tcW w:type="dxa" w:w="4873"/>
-          </w:tcPr>
-          <w:p>
-            <w:pPr>
-              <w:jc w:val="center"/>
-            </w:pPr>
-            <w:r>
-              <w:rPr>
-                <w:rFonts w:ascii="Arial" w:hAnsi="Arial" w:cs="Arial" w:eastAsia="Arial"/>
-                <w:i/>
-                <w:color w:val="000000"/>
-                <w:sz w:val="22"/>
-              </w:rPr>
-              <w:t>Application detail: quotation</w:t>
-            </w:r>
-          </w:p>
-        </w:tc>
-      </w:tr>
-    </w:tbl>
-    <w:p>
-      <w:pPr>
-        <w:spacing w:after="0"/>
-      </w:pPr>
-    </w:p>
-    <w:tbl>
-      <w:tblPr>
-        <w:tblW w:type="auto" w:w="0"/>
-        <w:tblLook w:firstColumn="1" w:firstRow="1" w:lastColumn="0" w:lastRow="0" w:noHBand="0" w:noVBand="1" w:val="04A0"/>
-      </w:tblPr>
-      <w:tblGrid>
-        <w:gridCol w:w="4873"/>
-        <w:gridCol w:w="4873"/>
-      </w:tblGrid>
-      <w:tr>
-        <w:tc>
-          <w:tcPr>
-            <w:tcW w:type="dxa" w:w="4873"/>
-          </w:tcPr>
-          <w:p>
-            <w:pPr>
-              <w:jc w:val="center"/>
-            </w:pPr>
-            <w:r>
-              <w:drawing>
-                <wp:inline xmlns:a="http://schemas.openxmlformats.org/drawingml/2006/main" xmlns:pic="http://schemas.openxmlformats.org/drawingml/2006/picture">
-                  <wp:extent cx="2807999" cy="1685622"/>
-                  <wp:docPr id="4" name="Picture 4"/>
-                  <wp:cNvGraphicFramePr>
-                    <a:graphicFrameLocks noChangeAspect="1"/>
-                  </wp:cNvGraphicFramePr>
-                  <a:graphic>
-                    <a:graphicData uri="http://schemas.openxmlformats.org/drawingml/2006/picture">
-                      <pic:pic>
-                        <pic:nvPicPr>
-                          <pic:cNvPr id="0" name="04_status.png"/>
                           <pic:cNvPicPr/>
                         </pic:nvPicPr>
                         <pic:blipFill>
@@ -11670,7 +11584,7 @@
               <w:drawing>
                 <wp:inline xmlns:a="http://schemas.openxmlformats.org/drawingml/2006/main" xmlns:pic="http://schemas.openxmlformats.org/drawingml/2006/picture">
                   <wp:extent cx="2807999" cy="1685622"/>
-                  <wp:docPr id="5" name="Picture 5"/>
+                  <wp:docPr id="3" name="Picture 3"/>
                   <wp:cNvGraphicFramePr>
                     <a:graphicFrameLocks noChangeAspect="1"/>
                   </wp:cNvGraphicFramePr>
@@ -11678,7 +11592,7 @@
                     <a:graphicData uri="http://schemas.openxmlformats.org/drawingml/2006/picture">
                       <pic:pic>
                         <pic:nvPicPr>
-                          <pic:cNvPr id="0" name="05_target.png"/>
+                          <pic:cNvPr id="0" name="03_detail.png"/>
                           <pic:cNvPicPr/>
                         </pic:nvPicPr>
                         <pic:blipFill>
@@ -11719,6 +11633,151 @@
                 <w:color w:val="000000"/>
                 <w:sz w:val="22"/>
               </w:rPr>
+              <w:t>Pipeline (Manager)</w:t>
+            </w:r>
+          </w:p>
+        </w:tc>
+        <w:tc>
+          <w:tcPr>
+            <w:tcW w:type="dxa" w:w="4873"/>
+          </w:tcPr>
+          <w:p>
+            <w:pPr>
+              <w:jc w:val="center"/>
+            </w:pPr>
+            <w:r>
+              <w:rPr>
+                <w:rFonts w:ascii="Arial" w:hAnsi="Arial" w:cs="Arial" w:eastAsia="Arial"/>
+                <w:i/>
+                <w:color w:val="000000"/>
+                <w:sz w:val="22"/>
+              </w:rPr>
+              <w:t>Application detail: quotation</w:t>
+            </w:r>
+          </w:p>
+        </w:tc>
+      </w:tr>
+    </w:tbl>
+    <w:p>
+      <w:pPr>
+        <w:spacing w:after="0"/>
+      </w:pPr>
+    </w:p>
+    <w:tbl>
+      <w:tblPr>
+        <w:tblW w:type="auto" w:w="0"/>
+        <w:tblLook w:firstColumn="1" w:firstRow="1" w:lastColumn="0" w:lastRow="0" w:noHBand="0" w:noVBand="1" w:val="04A0"/>
+      </w:tblPr>
+      <w:tblGrid>
+        <w:gridCol w:w="4873"/>
+        <w:gridCol w:w="4873"/>
+      </w:tblGrid>
+      <w:tr>
+        <w:tc>
+          <w:tcPr>
+            <w:tcW w:type="dxa" w:w="4873"/>
+          </w:tcPr>
+          <w:p>
+            <w:pPr>
+              <w:jc w:val="center"/>
+            </w:pPr>
+            <w:r>
+              <w:drawing>
+                <wp:inline xmlns:a="http://schemas.openxmlformats.org/drawingml/2006/main" xmlns:pic="http://schemas.openxmlformats.org/drawingml/2006/picture">
+                  <wp:extent cx="2807999" cy="1685622"/>
+                  <wp:docPr id="4" name="Picture 4"/>
+                  <wp:cNvGraphicFramePr>
+                    <a:graphicFrameLocks noChangeAspect="1"/>
+                  </wp:cNvGraphicFramePr>
+                  <a:graphic>
+                    <a:graphicData uri="http://schemas.openxmlformats.org/drawingml/2006/picture">
+                      <pic:pic>
+                        <pic:nvPicPr>
+                          <pic:cNvPr id="0" name="04_status.png"/>
+                          <pic:cNvPicPr/>
+                        </pic:nvPicPr>
+                        <pic:blipFill>
+                          <a:blip r:embed="rId15"/>
+                          <a:stretch>
+                            <a:fillRect/>
+                          </a:stretch>
+                        </pic:blipFill>
+                        <pic:spPr>
+                          <a:xfrm>
+                            <a:off x="0" y="0"/>
+                            <a:ext cx="2807999" cy="1685622"/>
+                          </a:xfrm>
+                          <a:prstGeom prst="rect"/>
+                        </pic:spPr>
+                      </pic:pic>
+                    </a:graphicData>
+                  </a:graphic>
+                </wp:inline>
+              </w:drawing>
+            </w:r>
+          </w:p>
+        </w:tc>
+        <w:tc>
+          <w:tcPr>
+            <w:tcW w:type="dxa" w:w="4873"/>
+          </w:tcPr>
+          <w:p>
+            <w:pPr>
+              <w:jc w:val="center"/>
+            </w:pPr>
+            <w:r>
+              <w:drawing>
+                <wp:inline xmlns:a="http://schemas.openxmlformats.org/drawingml/2006/main" xmlns:pic="http://schemas.openxmlformats.org/drawingml/2006/picture">
+                  <wp:extent cx="2807999" cy="1685622"/>
+                  <wp:docPr id="5" name="Picture 5"/>
+                  <wp:cNvGraphicFramePr>
+                    <a:graphicFrameLocks noChangeAspect="1"/>
+                  </wp:cNvGraphicFramePr>
+                  <a:graphic>
+                    <a:graphicData uri="http://schemas.openxmlformats.org/drawingml/2006/picture">
+                      <pic:pic>
+                        <pic:nvPicPr>
+                          <pic:cNvPr id="0" name="05_target.png"/>
+                          <pic:cNvPicPr/>
+                        </pic:nvPicPr>
+                        <pic:blipFill>
+                          <a:blip r:embed="rId16"/>
+                          <a:stretch>
+                            <a:fillRect/>
+                          </a:stretch>
+                        </pic:blipFill>
+                        <pic:spPr>
+                          <a:xfrm>
+                            <a:off x="0" y="0"/>
+                            <a:ext cx="2807999" cy="1685622"/>
+                          </a:xfrm>
+                          <a:prstGeom prst="rect"/>
+                        </pic:spPr>
+                      </pic:pic>
+                    </a:graphicData>
+                  </a:graphic>
+                </wp:inline>
+              </w:drawing>
+            </w:r>
+          </w:p>
+        </w:tc>
+      </w:tr>
+      <w:tr>
+        <w:tc>
+          <w:tcPr>
+            <w:tcW w:type="dxa" w:w="4873"/>
+          </w:tcPr>
+          <w:p>
+            <w:pPr>
+              <w:jc w:val="center"/>
+            </w:pPr>
+            <w:r>
+              <w:rPr>
+                <w:rFonts w:ascii="Arial" w:hAnsi="Arial" w:cs="Arial" w:eastAsia="Arial"/>
+                <w:i/>
+                <w:color w:val="000000"/>
+                <w:sz w:val="22"/>
+              </w:rPr>
               <w:t>Approval status</w:t>
             </w:r>
           </w:p>
@@ -11784,7 +11843,7 @@
                           <pic:cNvPicPr/>
                         </pic:nvPicPr>
                         <pic:blipFill>
-                          <a:blip r:embed="rId15"/>
+                          <a:blip r:embed="rId17"/>
                           <a:stretch>
                             <a:fillRect/>
                           </a:stretch>
@@ -11828,7 +11887,7 @@
                           <pic:cNvPicPr/>
                         </pic:nvPicPr>
                         <pic:blipFill>
-                          <a:blip r:embed="rId16"/>
+                          <a:blip r:embed="rId18"/>
                           <a:stretch>
                             <a:fillRect/>
                           </a:stretch>
@@ -11872,7 +11931,7 @@
                           <pic:cNvPicPr/>
                         </pic:nvPicPr>
                         <pic:blipFill>
-                          <a:blip r:embed="rId17"/>
+                          <a:blip r:embed="rId19"/>
                           <a:stretch>
                             <a:fillRect/>
                           </a:stretch>
@@ -13148,7 +13207,8 @@
     </w:p>
     <w:p>
       <w:pPr>
-        <w:pStyle w:val="ListNumber"/>
+        <w:spacing w:after="60"/>
+        <w:ind w:left="454" w:hanging="454"/>
         <w:jc w:val="left"/>
       </w:pPr>
       <w:r>
@@ -13158,12 +13218,24 @@
           <w:color w:val="000000"/>
           <w:sz w:val="22"/>
         </w:rPr>
-        <w:t>ANTARA News, "Kemendag sebut sektor kuliner masih mendominasi bisnis waralaba". https://www.antaranews.com/berita/4774885/kemendag-sebut-sektor-kuliner-masih-mendominasi-bisnis-waralaba</w:t>
+        <w:t xml:space="preserve">[1] ANTARA News, "Kemendag sebut sektor kuliner masih mendominasi bisnis waralaba". </w:t>
       </w:r>
+      <w:hyperlink r:id="rId20">
+        <w:r>
+          <w:rPr>
+            <w:rFonts w:ascii="Arial" w:hAnsi="Arial" w:cs="Arial" w:eastAsia="Arial"/>
+            <w:color w:val="1155CC"/>
+            <w:sz w:val="22"/>
+            <w:u w:val="single"/>
+          </w:rPr>
+          <w:t xml:space="preserve">https://www.antaranews.com/berita/4774885/kemendag-sebut-sektor-kuliner-masih-mendominasi-bisnis-waralaba</w:t>
+        </w:r>
+      </w:hyperlink>
     </w:p>
     <w:p>
       <w:pPr>
-        <w:pStyle w:val="ListNumber"/>
+        <w:spacing w:after="60"/>
+        <w:ind w:left="454" w:hanging="454"/>
         <w:jc w:val="left"/>
       </w:pPr>
       <w:r>
@@ -13173,12 +13245,24 @@
           <w:color w:val="000000"/>
           <w:sz w:val="22"/>
         </w:rPr>
-        <w:t>Tempo, "Mendag: Waralaba Serap 97 Ribu Tenaga Kerja dengan Omzet Rp 143 Triliun". https://www.tempo.co/ekonomi/mendag-waralaba-serap-97-ribu-tenaga-kerja-dengan-omzet-rp-143-triliun-1218788</w:t>
+        <w:t xml:space="preserve">[2] Tempo, "Mendag: Waralaba Serap 97 Ribu Tenaga Kerja dengan Omzet Rp 143 Triliun". </w:t>
       </w:r>
+      <w:hyperlink r:id="rId21">
+        <w:r>
+          <w:rPr>
+            <w:rFonts w:ascii="Arial" w:hAnsi="Arial" w:cs="Arial" w:eastAsia="Arial"/>
+            <w:color w:val="1155CC"/>
+            <w:sz w:val="22"/>
+            <w:u w:val="single"/>
+          </w:rPr>
+          <w:t xml:space="preserve">https://www.tempo.co/ekonomi/mendag-waralaba-serap-97-ribu-tenaga-kerja-dengan-omzet-rp-143-triliun-1218788</w:t>
+        </w:r>
+      </w:hyperlink>
     </w:p>
     <w:p>
       <w:pPr>
-        <w:pStyle w:val="ListNumber"/>
+        <w:spacing w:after="60"/>
+        <w:ind w:left="454" w:hanging="454"/>
         <w:jc w:val="left"/>
       </w:pPr>
       <w:r>
@@ -13188,12 +13272,24 @@
           <w:color w:val="000000"/>
           <w:sz w:val="22"/>
         </w:rPr>
-        <w:t>Marketeers, "Toffin: Nilai Pasar Kedai Kopi di Indonesia Capai Rp 4,8 Triliun". https://www.marketeers.com/toffin-nilai-pasar-kedai-kopi-di-indonesia-capai-rp-4-8-triliun/</w:t>
+        <w:t xml:space="preserve">[3] Marketeers, "Toffin: Nilai Pasar Kedai Kopi di Indonesia Capai Rp 4,8 Triliun". </w:t>
       </w:r>
+      <w:hyperlink r:id="rId22">
+        <w:r>
+          <w:rPr>
+            <w:rFonts w:ascii="Arial" w:hAnsi="Arial" w:cs="Arial" w:eastAsia="Arial"/>
+            <w:color w:val="1155CC"/>
+            <w:sz w:val="22"/>
+            <w:u w:val="single"/>
+          </w:rPr>
+          <w:t xml:space="preserve">https://www.marketeers.com/toffin-nilai-pasar-kedai-kopi-di-indonesia-capai-rp-4-8-triliun/</w:t>
+        </w:r>
+      </w:hyperlink>
     </w:p>
     <w:p>
       <w:pPr>
-        <w:pStyle w:val="ListNumber"/>
+        <w:spacing w:after="60"/>
+        <w:ind w:left="454" w:hanging="454"/>
         <w:jc w:val="left"/>
       </w:pPr>
       <w:r>
@@ -13203,12 +13299,24 @@
           <w:color w:val="000000"/>
           <w:sz w:val="22"/>
         </w:rPr>
-        <w:t>Warta Ekonomi, "Bisnis Kedai Kopi di Indonesia Cerah, Jumlahnya Melesat 3X Lipat". https://wartaekonomi.co.id/read262062/bisnis-kedai-kopi-di-indonesia-cerah-jumlahnya-melesat-3x-lipat</w:t>
+        <w:t xml:space="preserve">[4] Warta Ekonomi, "Bisnis Kedai Kopi di Indonesia Cerah, Jumlahnya Melesat 3X Lipat". </w:t>
       </w:r>
+      <w:hyperlink r:id="rId23">
+        <w:r>
+          <w:rPr>
+            <w:rFonts w:ascii="Arial" w:hAnsi="Arial" w:cs="Arial" w:eastAsia="Arial"/>
+            <w:color w:val="1155CC"/>
+            <w:sz w:val="22"/>
+            <w:u w:val="single"/>
+          </w:rPr>
+          <w:t xml:space="preserve">https://wartaekonomi.co.id/read262062/bisnis-kedai-kopi-di-indonesia-cerah-jumlahnya-melesat-3x-lipat</w:t>
+        </w:r>
+      </w:hyperlink>
     </w:p>
     <w:p>
       <w:pPr>
-        <w:pStyle w:val="ListNumber"/>
+        <w:spacing w:after="60"/>
+        <w:ind w:left="454" w:hanging="454"/>
         <w:jc w:val="left"/>
       </w:pPr>
       <w:r>
@@ -13218,12 +13326,24 @@
           <w:color w:val="000000"/>
           <w:sz w:val="22"/>
         </w:rPr>
-        <w:t>JDIH BPK, PP No. 35 Tahun 2024 tentang Waralaba. https://peraturan.bpk.go.id/Details/297489/pp-no-35-tahun-2024</w:t>
+        <w:t xml:space="preserve">[5] JDIH BPK, PP No. 35 Tahun 2024 tentang Waralaba. </w:t>
       </w:r>
+      <w:hyperlink r:id="rId24">
+        <w:r>
+          <w:rPr>
+            <w:rFonts w:ascii="Arial" w:hAnsi="Arial" w:cs="Arial" w:eastAsia="Arial"/>
+            <w:color w:val="1155CC"/>
+            <w:sz w:val="22"/>
+            <w:u w:val="single"/>
+          </w:rPr>
+          <w:t xml:space="preserve">https://peraturan.bpk.go.id/Details/297489/pp-no-35-tahun-2024</w:t>
+        </w:r>
+      </w:hyperlink>
     </w:p>
     <w:p>
       <w:pPr>
-        <w:pStyle w:val="ListNumber"/>
+        <w:spacing w:after="60"/>
+        <w:ind w:left="454" w:hanging="454"/>
         <w:jc w:val="left"/>
       </w:pPr>
       <w:r>
@@ -13233,8 +13353,19 @@
           <w:color w:val="000000"/>
           <w:sz w:val="22"/>
         </w:rPr>
-        <w:t>JDIH BPK, UU No. 27 Tahun 2022 tentang Pelindungan Data Pribadi. https://peraturan.bpk.go.id/Details/229798/uu-no-27-tahun-2022</w:t>
+        <w:t xml:space="preserve">[6] JDIH BPK, UU No. 27 Tahun 2022 tentang Pelindungan Data Pribadi. </w:t>
       </w:r>
+      <w:hyperlink r:id="rId25">
+        <w:r>
+          <w:rPr>
+            <w:rFonts w:ascii="Arial" w:hAnsi="Arial" w:cs="Arial" w:eastAsia="Arial"/>
+            <w:color w:val="1155CC"/>
+            <w:sz w:val="22"/>
+            <w:u w:val="single"/>
+          </w:rPr>
+          <w:t xml:space="preserve">https://peraturan.bpk.go.id/Details/229798/uu-no-27-tahun-2022</w:t>
+        </w:r>
+      </w:hyperlink>
     </w:p>
     <w:p>
       <w:pPr>

</xml_diff>

<commit_message>
Use of AI: show PRD-first order
Co-Authored-By: Claude Opus 5.5 <noreply@anthropic.com>
Claude-Session: https://claude.ai/code/session_01MyaJcnNN6cea99ff9yeVti
</commit_message>
<xml_diff>
--- a/prd/EDTS APM 2027 - Nadia Rahma Prasanti - Universitas Indonesia.docx
+++ b/prd/EDTS APM 2027 - Nadia Rahma Prasanti - Universitas Indonesia.docx
@@ -12829,7 +12829,7 @@
           <w:color w:val="000000"/>
           <w:sz w:val="22"/>
         </w:rPr>
-        <w:t>I used Claude (Anthropic) throughout the project. The product decisions were mine, and I checked its output before using it.</w:t>
+        <w:t>I used Claude (Anthropic) throughout the project, in this order: I wrote the PRD first, built the prototype from it, and kept the PRD updated as decisions changed. The product decisions were mine, and I checked the AI's output before using it.</w:t>
       </w:r>
     </w:p>
     <w:tbl>
@@ -12972,6 +12972,71 @@
                 <w:sz w:val="22"/>
               </w:rPr>
               <w:t>Defined the pain points, features, and funnel, designed the business process (stages, PIC, deadlines, and approval rules), and pointed out the special cases the flow must handle (for example, duplicate leads, leads outside any sales region, and location changes during negotiation)</w:t>
+            </w:r>
+          </w:p>
+        </w:tc>
+      </w:tr>
+      <w:tr>
+        <w:tc>
+          <w:tcPr>
+            <w:tcW w:type="dxa" w:w="3249"/>
+          </w:tcPr>
+          <w:p>
+            <w:pPr>
+              <w:spacing w:after="0"/>
+              <w:jc w:val="left"/>
+            </w:pPr>
+            <w:r/>
+            <w:r>
+              <w:rPr>
+                <w:rFonts w:ascii="Arial" w:hAnsi="Arial" w:cs="Arial" w:eastAsia="Arial"/>
+                <w:b w:val="0"/>
+                <w:color w:val="000000"/>
+                <w:sz w:val="22"/>
+              </w:rPr>
+              <w:t>PRD (first draft)</w:t>
+            </w:r>
+          </w:p>
+        </w:tc>
+        <w:tc>
+          <w:tcPr>
+            <w:tcW w:type="dxa" w:w="3249"/>
+          </w:tcPr>
+          <w:p>
+            <w:pPr>
+              <w:spacing w:after="0"/>
+              <w:jc w:val="left"/>
+            </w:pPr>
+            <w:r/>
+            <w:r>
+              <w:rPr>
+                <w:rFonts w:ascii="Arial" w:hAnsi="Arial" w:cs="Arial" w:eastAsia="Arial"/>
+                <w:b w:val="0"/>
+                <w:color w:val="000000"/>
+                <w:sz w:val="22"/>
+              </w:rPr>
+              <w:t>Formatted my pain points, features, and flow into a first PRD draft (text) before any prototype was built</w:t>
+            </w:r>
+          </w:p>
+        </w:tc>
+        <w:tc>
+          <w:tcPr>
+            <w:tcW w:type="dxa" w:w="3249"/>
+          </w:tcPr>
+          <w:p>
+            <w:pPr>
+              <w:spacing w:after="0"/>
+              <w:jc w:val="left"/>
+            </w:pPr>
+            <w:r/>
+            <w:r>
+              <w:rPr>
+                <w:rFonts w:ascii="Arial" w:hAnsi="Arial" w:cs="Arial" w:eastAsia="Arial"/>
+                <w:b w:val="0"/>
+                <w:color w:val="000000"/>
+                <w:sz w:val="22"/>
+              </w:rPr>
+              <w:t>Reviewed and edited the draft and used it as the spec for the prototype; updated the PRD whenever a decision changed while prototyping</w:t>
             </w:r>
           </w:p>
         </w:tc>

</xml_diff>

<commit_message>
Use of AI: prototype built from the PRD
Co-Authored-By: Claude Opus 5.5 <noreply@anthropic.com>
Claude-Session: https://claude.ai/code/session_01MyaJcnNN6cea99ff9yeVti
</commit_message>
<xml_diff>
--- a/prd/EDTS APM 2027 - Nadia Rahma Prasanti - Universitas Indonesia.docx
+++ b/prd/EDTS APM 2027 - Nadia Rahma Prasanti - Universitas Indonesia.docx
@@ -13015,7 +13015,7 @@
                 <w:color w:val="000000"/>
                 <w:sz w:val="22"/>
               </w:rPr>
-              <w:t>Formatted my pain points, features, and flow into a first PRD draft (text) before any prototype was built</w:t>
+              <w:t>Formatted my pain points, features, and flow into a first PRD draft (text)</w:t>
             </w:r>
           </w:p>
         </w:tc>
@@ -13080,7 +13080,7 @@
                 <w:color w:val="000000"/>
                 <w:sz w:val="22"/>
               </w:rPr>
-              <w:t>Built the HTML prototype, first in Claude chat and then in Claude Code, over many feedback rounds</w:t>
+              <w:t>Built the HTML prototype based on the PRD, first in Claude chat and then in Claude Code, over many feedback rounds</w:t>
             </w:r>
           </w:p>
         </w:tc>

</xml_diff>

<commit_message>
AI log: group by topic, product decisions section, no timestamps
Co-Authored-By: Claude Opus 5.5 <noreply@anthropic.com>
Claude-Session: https://claude.ai/code/session_01MyaJcnNN6cea99ff9yeVti
</commit_message>
<xml_diff>
--- a/prd/EDTS APM 2027 - Nadia Rahma Prasanti - Universitas Indonesia.docx
+++ b/prd/EDTS APM 2027 - Nadia Rahma Prasanti - Universitas Indonesia.docx
@@ -13102,6 +13102,71 @@
                 <w:sz w:val="22"/>
               </w:rPr>
               <w:t>Reviewed each version and decided layout, wording, and terminology</w:t>
+            </w:r>
+          </w:p>
+        </w:tc>
+      </w:tr>
+      <w:tr>
+        <w:tc>
+          <w:tcPr>
+            <w:tcW w:type="dxa" w:w="3249"/>
+          </w:tcPr>
+          <w:p>
+            <w:pPr>
+              <w:spacing w:after="0"/>
+              <w:jc w:val="left"/>
+            </w:pPr>
+            <w:r/>
+            <w:r>
+              <w:rPr>
+                <w:rFonts w:ascii="Arial" w:hAnsi="Arial" w:cs="Arial" w:eastAsia="Arial"/>
+                <w:b w:val="0"/>
+                <w:color w:val="000000"/>
+                <w:sz w:val="22"/>
+              </w:rPr>
+              <w:t>Product decisions</w:t>
+            </w:r>
+          </w:p>
+        </w:tc>
+        <w:tc>
+          <w:tcPr>
+            <w:tcW w:type="dxa" w:w="3249"/>
+          </w:tcPr>
+          <w:p>
+            <w:pPr>
+              <w:spacing w:after="0"/>
+              <w:jc w:val="left"/>
+            </w:pPr>
+            <w:r/>
+            <w:r>
+              <w:rPr>
+                <w:rFonts w:ascii="Arial" w:hAnsi="Arial" w:cs="Arial" w:eastAsia="Arial"/>
+                <w:b w:val="0"/>
+                <w:color w:val="000000"/>
+                <w:sz w:val="22"/>
+              </w:rPr>
+              <w:t>Discussed the trade-offs of each change I proposed, then updated the PRD and the prototype to match</w:t>
+            </w:r>
+          </w:p>
+        </w:tc>
+        <w:tc>
+          <w:tcPr>
+            <w:tcW w:type="dxa" w:w="3249"/>
+          </w:tcPr>
+          <w:p>
+            <w:pPr>
+              <w:spacing w:after="0"/>
+              <w:jc w:val="left"/>
+            </w:pPr>
+            <w:r/>
+            <w:r>
+              <w:rPr>
+                <w:rFonts w:ascii="Arial" w:hAnsi="Arial" w:cs="Arial" w:eastAsia="Arial"/>
+                <w:b w:val="0"/>
+                <w:color w:val="000000"/>
+                <w:sz w:val="22"/>
+              </w:rPr>
+              <w:t>Decided each change: separate apps for the franchisor and the candidate, roles and access, the 8-stage flow with automatic lead assignment, location-change rules, per-sales targets, and e-signature tracking</w:t>
             </w:r>
           </w:p>
         </w:tc>

</xml_diff>

<commit_message>
PRD: label stretch target and conversion as assumptions
Co-Authored-By: Claude Opus 5.5 <noreply@anthropic.com>
Claude-Session: https://claude.ai/code/session_01MyaJcnNN6cea99ff9yeVti
</commit_message>
<xml_diff>
--- a/prd/EDTS APM 2027 - Nadia Rahma Prasanti - Universitas Indonesia.docx
+++ b/prd/EDTS APM 2027 - Nadia Rahma Prasanti - Universitas Indonesia.docx
@@ -1185,7 +1185,7 @@
                 <w:color w:val="000000"/>
                 <w:sz w:val="22"/>
               </w:rPr>
-              <w:t>120 new outlets per year (72 Gerobak, 48 Cafe), a stretch target</w:t>
+              <w:t>120 new outlets per year (72 Gerobak, 48 Cafe), a stretch target. This is deliberately aggressive (from about 80 to 200 outlets in a year) and should be calibrated with the client's historical opening rate.</w:t>
             </w:r>
           </w:p>
         </w:tc>
@@ -3642,7 +3642,7 @@
                 <w:color w:val="000000"/>
                 <w:sz w:val="22"/>
               </w:rPr>
-              <w:t>Default funnel rates</w:t>
+              <w:t>Assumption (default funnel rates), calibrate with real data in the pilot</w:t>
             </w:r>
           </w:p>
         </w:tc>

</xml_diff>